<commit_message>
Matdas: aturan latihan mandiri "Sama dengan sesi kelompok"; panduan diperbarui
Latihan mandiri boleh memakai lapisan aturan sesi (aturan dasar, profil langkah tahapan,
profil siswa) dihitung dari posisi mandiri. Bawaan tetap Pengaturan Umum.

Co-Authored-By: Claude Opus 5.5 <noreply@anthropic.com>
</commit_message>
<xml_diff>
--- a/Panduan_Membaca_Data_Matdas.docx
+++ b/Panduan_Membaca_Data_Matdas.docx
@@ -143,7 +143,15 @@
           <w:sz w:val="20"/>
           <w:szCs w:val="20"/>
         </w:rPr>
-        <w:t>Versi: 13 Oktober 2026, diperbarui malam hari: satu pilihan per kelompok, aturan dasar dan profil per langkah tahapan (sesuai tampilan aplikasi per tanggal tersebut)</w:t>
+        <w:t>Versi: 13 Oktober 2026, diperbarui malam hari: satu pilihan per kelompok, aturan dasar dan profil per langkah tahapan, latihan mandiri sama dengan sesi (sesuai tampilan aplikasi per tan</w:t>
+      </w:r>
+      <w:r>
+        <w:rPr>
+          <w:color w:val="5B6B7D"/>
+          <w:sz w:val="20"/>
+          <w:szCs w:val="20"/>
+        </w:rPr>
+        <w:t>ggal tersebut)</w:t>
       </w:r>
     </w:p>
     <w:p>
@@ -170,7 +178,7 @@
     <w:sdt>
       <w:sdtPr>
         <w:alias w:val="Daftar Isi"/>
-        <w:id w:val="-1821265569"/>
+        <w:id w:val="911511987"/>
       </w:sdtPr>
       <w:sdtEndPr/>
       <w:sdtContent>
@@ -188,15 +196,12 @@
             <w:fldChar w:fldCharType="begin"/>
           </w:r>
           <w:r>
-            <w:instrText>TOC \h</w:instrText>
-          </w:r>
-          <w:r>
-            <w:instrText xml:space="preserve"> \o "1-2"</w:instrText>
+            <w:instrText>TOC \h \o "1-2"</w:instrText>
           </w:r>
           <w:r>
             <w:fldChar w:fldCharType="separate"/>
           </w:r>
-          <w:hyperlink w:anchor="_Toc242819343" w:history="1">
+          <w:hyperlink w:anchor="_Toc242821909" w:history="1">
             <w:r>
               <w:rPr>
                 <w:rStyle w:val="Hyperlink"/>
@@ -220,7 +225,7 @@
               <w:rPr>
                 <w:noProof/>
               </w:rPr>
-              <w:instrText xml:space="preserve"> PAGEREF _Toc242819343 \h </w:instrText>
+              <w:instrText xml:space="preserve"> PAGEREF _Toc242821909 \h </w:instrText>
             </w:r>
             <w:r>
               <w:rPr>
@@ -257,7 +262,7 @@
               <w:noProof/>
             </w:rPr>
           </w:pPr>
-          <w:hyperlink w:anchor="_Toc242819344" w:history="1">
+          <w:hyperlink w:anchor="_Toc242821910" w:history="1">
             <w:r>
               <w:rPr>
                 <w:rStyle w:val="Hyperlink"/>
@@ -281,7 +286,7 @@
               <w:rPr>
                 <w:noProof/>
               </w:rPr>
-              <w:instrText xml:space="preserve"> PAGEREF _Toc242819344 \h </w:instrText>
+              <w:instrText xml:space="preserve"> PAGEREF _Toc242821910 \h </w:instrText>
             </w:r>
             <w:r>
               <w:rPr>
@@ -318,7 +323,7 @@
               <w:noProof/>
             </w:rPr>
           </w:pPr>
-          <w:hyperlink w:anchor="_Toc242819345" w:history="1">
+          <w:hyperlink w:anchor="_Toc242821911" w:history="1">
             <w:r>
               <w:rPr>
                 <w:rStyle w:val="Hyperlink"/>
@@ -342,7 +347,7 @@
               <w:rPr>
                 <w:noProof/>
               </w:rPr>
-              <w:instrText xml:space="preserve"> PAGEREF _Toc242819345 \h </w:instrText>
+              <w:instrText xml:space="preserve"> PAGEREF _Toc242821911 \h </w:instrText>
             </w:r>
             <w:r>
               <w:rPr>
@@ -379,7 +384,7 @@
               <w:noProof/>
             </w:rPr>
           </w:pPr>
-          <w:hyperlink w:anchor="_Toc242819346" w:history="1">
+          <w:hyperlink w:anchor="_Toc242821912" w:history="1">
             <w:r>
               <w:rPr>
                 <w:rStyle w:val="Hyperlink"/>
@@ -403,7 +408,7 @@
               <w:rPr>
                 <w:noProof/>
               </w:rPr>
-              <w:instrText xml:space="preserve"> PAGEREF _Toc242819346 \h </w:instrText>
+              <w:instrText xml:space="preserve"> PAGEREF _Toc242821912 \h </w:instrText>
             </w:r>
             <w:r>
               <w:rPr>
@@ -440,7 +445,7 @@
               <w:noProof/>
             </w:rPr>
           </w:pPr>
-          <w:hyperlink w:anchor="_Toc242819347" w:history="1">
+          <w:hyperlink w:anchor="_Toc242821913" w:history="1">
             <w:r>
               <w:rPr>
                 <w:rStyle w:val="Hyperlink"/>
@@ -464,7 +469,7 @@
               <w:rPr>
                 <w:noProof/>
               </w:rPr>
-              <w:instrText xml:space="preserve"> PAGEREF _Toc242819347 \h </w:instrText>
+              <w:instrText xml:space="preserve"> PAGEREF _Toc242821913 \h </w:instrText>
             </w:r>
             <w:r>
               <w:rPr>
@@ -501,7 +506,7 @@
               <w:noProof/>
             </w:rPr>
           </w:pPr>
-          <w:hyperlink w:anchor="_Toc242819348" w:history="1">
+          <w:hyperlink w:anchor="_Toc242821914" w:history="1">
             <w:r>
               <w:rPr>
                 <w:rStyle w:val="Hyperlink"/>
@@ -525,7 +530,7 @@
               <w:rPr>
                 <w:noProof/>
               </w:rPr>
-              <w:instrText xml:space="preserve"> PAGEREF _Toc242819348 \h </w:instrText>
+              <w:instrText xml:space="preserve"> PAGEREF _Toc242821914 \h </w:instrText>
             </w:r>
             <w:r>
               <w:rPr>
@@ -562,7 +567,7 @@
               <w:noProof/>
             </w:rPr>
           </w:pPr>
-          <w:hyperlink w:anchor="_Toc242819349" w:history="1">
+          <w:hyperlink w:anchor="_Toc242821915" w:history="1">
             <w:r>
               <w:rPr>
                 <w:rStyle w:val="Hyperlink"/>
@@ -586,7 +591,7 @@
               <w:rPr>
                 <w:noProof/>
               </w:rPr>
-              <w:instrText xml:space="preserve"> PAGEREF _Toc242819349 \h </w:instrText>
+              <w:instrText xml:space="preserve"> PAGEREF _Toc242821915 \h </w:instrText>
             </w:r>
             <w:r>
               <w:rPr>
@@ -623,7 +628,7 @@
               <w:noProof/>
             </w:rPr>
           </w:pPr>
-          <w:hyperlink w:anchor="_Toc242819350" w:history="1">
+          <w:hyperlink w:anchor="_Toc242821916" w:history="1">
             <w:r>
               <w:rPr>
                 <w:rStyle w:val="Hyperlink"/>
@@ -647,7 +652,7 @@
               <w:rPr>
                 <w:noProof/>
               </w:rPr>
-              <w:instrText xml:space="preserve"> PAGEREF _Toc242819350 \h </w:instrText>
+              <w:instrText xml:space="preserve"> PAGEREF _Toc242821916 \h </w:instrText>
             </w:r>
             <w:r>
               <w:rPr>
@@ -684,7 +689,7 @@
               <w:noProof/>
             </w:rPr>
           </w:pPr>
-          <w:hyperlink w:anchor="_Toc242819351" w:history="1">
+          <w:hyperlink w:anchor="_Toc242821917" w:history="1">
             <w:r>
               <w:rPr>
                 <w:rStyle w:val="Hyperlink"/>
@@ -708,7 +713,7 @@
               <w:rPr>
                 <w:noProof/>
               </w:rPr>
-              <w:instrText xml:space="preserve"> PAGEREF _Toc242819351 \h </w:instrText>
+              <w:instrText xml:space="preserve"> PAGEREF _Toc242821917 \h </w:instrText>
             </w:r>
             <w:r>
               <w:rPr>
@@ -745,7 +750,7 @@
               <w:noProof/>
             </w:rPr>
           </w:pPr>
-          <w:hyperlink w:anchor="_Toc242819352" w:history="1">
+          <w:hyperlink w:anchor="_Toc242821918" w:history="1">
             <w:r>
               <w:rPr>
                 <w:rStyle w:val="Hyperlink"/>
@@ -769,7 +774,7 @@
               <w:rPr>
                 <w:noProof/>
               </w:rPr>
-              <w:instrText xml:space="preserve"> PAGEREF _Toc242819352 \h </w:instrText>
+              <w:instrText xml:space="preserve"> PAGEREF _Toc242821918 \h </w:instrText>
             </w:r>
             <w:r>
               <w:rPr>
@@ -806,7 +811,7 @@
               <w:noProof/>
             </w:rPr>
           </w:pPr>
-          <w:hyperlink w:anchor="_Toc242819353" w:history="1">
+          <w:hyperlink w:anchor="_Toc242821919" w:history="1">
             <w:r>
               <w:rPr>
                 <w:rStyle w:val="Hyperlink"/>
@@ -830,7 +835,7 @@
               <w:rPr>
                 <w:noProof/>
               </w:rPr>
-              <w:instrText xml:space="preserve"> PAGEREF _Toc242819353 \h </w:instrText>
+              <w:instrText xml:space="preserve"> PAGEREF _Toc242821919 \h </w:instrText>
             </w:r>
             <w:r>
               <w:rPr>
@@ -867,7 +872,7 @@
               <w:noProof/>
             </w:rPr>
           </w:pPr>
-          <w:hyperlink w:anchor="_Toc242819354" w:history="1">
+          <w:hyperlink w:anchor="_Toc242821920" w:history="1">
             <w:r>
               <w:rPr>
                 <w:rStyle w:val="Hyperlink"/>
@@ -891,7 +896,7 @@
               <w:rPr>
                 <w:noProof/>
               </w:rPr>
-              <w:instrText xml:space="preserve"> PAGEREF _Toc242819354 \h </w:instrText>
+              <w:instrText xml:space="preserve"> PAGEREF _Toc242821920 \h </w:instrText>
             </w:r>
             <w:r>
               <w:rPr>
@@ -928,7 +933,7 @@
               <w:noProof/>
             </w:rPr>
           </w:pPr>
-          <w:hyperlink w:anchor="_Toc242819355" w:history="1">
+          <w:hyperlink w:anchor="_Toc242821921" w:history="1">
             <w:r>
               <w:rPr>
                 <w:rStyle w:val="Hyperlink"/>
@@ -952,7 +957,7 @@
               <w:rPr>
                 <w:noProof/>
               </w:rPr>
-              <w:instrText xml:space="preserve"> PAGEREF _Toc242819355 \h </w:instrText>
+              <w:instrText xml:space="preserve"> PAGEREF _Toc242821921 \h </w:instrText>
             </w:r>
             <w:r>
               <w:rPr>
@@ -989,7 +994,7 @@
               <w:noProof/>
             </w:rPr>
           </w:pPr>
-          <w:hyperlink w:anchor="_Toc242819356" w:history="1">
+          <w:hyperlink w:anchor="_Toc242821922" w:history="1">
             <w:r>
               <w:rPr>
                 <w:rStyle w:val="Hyperlink"/>
@@ -1013,7 +1018,7 @@
               <w:rPr>
                 <w:noProof/>
               </w:rPr>
-              <w:instrText xml:space="preserve"> PAGEREF _Toc242819356 \h </w:instrText>
+              <w:instrText xml:space="preserve"> PAGEREF _Toc242821922 \h </w:instrText>
             </w:r>
             <w:r>
               <w:rPr>
@@ -1050,7 +1055,7 @@
               <w:noProof/>
             </w:rPr>
           </w:pPr>
-          <w:hyperlink w:anchor="_Toc242819357" w:history="1">
+          <w:hyperlink w:anchor="_Toc242821923" w:history="1">
             <w:r>
               <w:rPr>
                 <w:rStyle w:val="Hyperlink"/>
@@ -1074,7 +1079,7 @@
               <w:rPr>
                 <w:noProof/>
               </w:rPr>
-              <w:instrText xml:space="preserve"> PAGEREF _Toc242819357 \h </w:instrText>
+              <w:instrText xml:space="preserve"> PAGEREF _Toc242821923 \h </w:instrText>
             </w:r>
             <w:r>
               <w:rPr>
@@ -1111,7 +1116,7 @@
               <w:noProof/>
             </w:rPr>
           </w:pPr>
-          <w:hyperlink w:anchor="_Toc242819358" w:history="1">
+          <w:hyperlink w:anchor="_Toc242821924" w:history="1">
             <w:r>
               <w:rPr>
                 <w:rStyle w:val="Hyperlink"/>
@@ -1135,7 +1140,7 @@
               <w:rPr>
                 <w:noProof/>
               </w:rPr>
-              <w:instrText xml:space="preserve"> PAGEREF _Toc242819358 \h </w:instrText>
+              <w:instrText xml:space="preserve"> PAGEREF _Toc242821924 \h </w:instrText>
             </w:r>
             <w:r>
               <w:rPr>
@@ -1172,7 +1177,7 @@
               <w:noProof/>
             </w:rPr>
           </w:pPr>
-          <w:hyperlink w:anchor="_Toc242819359" w:history="1">
+          <w:hyperlink w:anchor="_Toc242821925" w:history="1">
             <w:r>
               <w:rPr>
                 <w:rStyle w:val="Hyperlink"/>
@@ -1196,7 +1201,7 @@
               <w:rPr>
                 <w:noProof/>
               </w:rPr>
-              <w:instrText xml:space="preserve"> PAGEREF _Toc242819359 \h </w:instrText>
+              <w:instrText xml:space="preserve"> PAGEREF _Toc242821925 \h </w:instrText>
             </w:r>
             <w:r>
               <w:rPr>
@@ -1233,7 +1238,7 @@
               <w:noProof/>
             </w:rPr>
           </w:pPr>
-          <w:hyperlink w:anchor="_Toc242819360" w:history="1">
+          <w:hyperlink w:anchor="_Toc242821926" w:history="1">
             <w:r>
               <w:rPr>
                 <w:rStyle w:val="Hyperlink"/>
@@ -1257,7 +1262,7 @@
               <w:rPr>
                 <w:noProof/>
               </w:rPr>
-              <w:instrText xml:space="preserve"> PAGEREF _Toc242819360 \h </w:instrText>
+              <w:instrText xml:space="preserve"> PAGEREF _Toc242821926 \h </w:instrText>
             </w:r>
             <w:r>
               <w:rPr>
@@ -1294,7 +1299,7 @@
               <w:noProof/>
             </w:rPr>
           </w:pPr>
-          <w:hyperlink w:anchor="_Toc242819361" w:history="1">
+          <w:hyperlink w:anchor="_Toc242821927" w:history="1">
             <w:r>
               <w:rPr>
                 <w:rStyle w:val="Hyperlink"/>
@@ -1318,7 +1323,7 @@
               <w:rPr>
                 <w:noProof/>
               </w:rPr>
-              <w:instrText xml:space="preserve"> PAGEREF _Toc242819361 \h </w:instrText>
+              <w:instrText xml:space="preserve"> PAGEREF _Toc242821927 \h </w:instrText>
             </w:r>
             <w:r>
               <w:rPr>
@@ -1355,7 +1360,7 @@
               <w:noProof/>
             </w:rPr>
           </w:pPr>
-          <w:hyperlink w:anchor="_Toc242819362" w:history="1">
+          <w:hyperlink w:anchor="_Toc242821928" w:history="1">
             <w:r>
               <w:rPr>
                 <w:rStyle w:val="Hyperlink"/>
@@ -1379,7 +1384,7 @@
               <w:rPr>
                 <w:noProof/>
               </w:rPr>
-              <w:instrText xml:space="preserve"> PAGEREF _Toc242819362 \h </w:instrText>
+              <w:instrText xml:space="preserve"> PAGEREF _Toc242821928 \h </w:instrText>
             </w:r>
             <w:r>
               <w:rPr>
@@ -1416,7 +1421,7 @@
               <w:noProof/>
             </w:rPr>
           </w:pPr>
-          <w:hyperlink w:anchor="_Toc242819363" w:history="1">
+          <w:hyperlink w:anchor="_Toc242821929" w:history="1">
             <w:r>
               <w:rPr>
                 <w:rStyle w:val="Hyperlink"/>
@@ -1440,7 +1445,7 @@
               <w:rPr>
                 <w:noProof/>
               </w:rPr>
-              <w:instrText xml:space="preserve"> PAGEREF _Toc242819363 \h </w:instrText>
+              <w:instrText xml:space="preserve"> PAGEREF _Toc242821929 \h </w:instrText>
             </w:r>
             <w:r>
               <w:rPr>
@@ -1477,7 +1482,7 @@
               <w:noProof/>
             </w:rPr>
           </w:pPr>
-          <w:hyperlink w:anchor="_Toc242819364" w:history="1">
+          <w:hyperlink w:anchor="_Toc242821930" w:history="1">
             <w:r>
               <w:rPr>
                 <w:rStyle w:val="Hyperlink"/>
@@ -1501,7 +1506,7 @@
               <w:rPr>
                 <w:noProof/>
               </w:rPr>
-              <w:instrText xml:space="preserve"> PAGEREF _Toc242819364 \h </w:instrText>
+              <w:instrText xml:space="preserve"> PAGEREF _Toc242821930 \h </w:instrText>
             </w:r>
             <w:r>
               <w:rPr>
@@ -1538,7 +1543,7 @@
               <w:noProof/>
             </w:rPr>
           </w:pPr>
-          <w:hyperlink w:anchor="_Toc242819365" w:history="1">
+          <w:hyperlink w:anchor="_Toc242821931" w:history="1">
             <w:r>
               <w:rPr>
                 <w:rStyle w:val="Hyperlink"/>
@@ -1562,7 +1567,7 @@
               <w:rPr>
                 <w:noProof/>
               </w:rPr>
-              <w:instrText xml:space="preserve"> PAGEREF _Toc242819365 \h </w:instrText>
+              <w:instrText xml:space="preserve"> PAGEREF _Toc242821931 \h </w:instrText>
             </w:r>
             <w:r>
               <w:rPr>
@@ -1599,7 +1604,7 @@
               <w:noProof/>
             </w:rPr>
           </w:pPr>
-          <w:hyperlink w:anchor="_Toc242819366" w:history="1">
+          <w:hyperlink w:anchor="_Toc242821932" w:history="1">
             <w:r>
               <w:rPr>
                 <w:rStyle w:val="Hyperlink"/>
@@ -1623,7 +1628,7 @@
               <w:rPr>
                 <w:noProof/>
               </w:rPr>
-              <w:instrText xml:space="preserve"> PAGEREF _Toc242819366 \h </w:instrText>
+              <w:instrText xml:space="preserve"> PAGEREF _Toc242821932 \h </w:instrText>
             </w:r>
             <w:r>
               <w:rPr>
@@ -1660,7 +1665,7 @@
               <w:noProof/>
             </w:rPr>
           </w:pPr>
-          <w:hyperlink w:anchor="_Toc242819367" w:history="1">
+          <w:hyperlink w:anchor="_Toc242821933" w:history="1">
             <w:r>
               <w:rPr>
                 <w:rStyle w:val="Hyperlink"/>
@@ -1684,7 +1689,7 @@
               <w:rPr>
                 <w:noProof/>
               </w:rPr>
-              <w:instrText xml:space="preserve"> PAGEREF _Toc242819367 \h </w:instrText>
+              <w:instrText xml:space="preserve"> PAGEREF _Toc242821933 \h </w:instrText>
             </w:r>
             <w:r>
               <w:rPr>
@@ -1721,7 +1726,7 @@
               <w:noProof/>
             </w:rPr>
           </w:pPr>
-          <w:hyperlink w:anchor="_Toc242819368" w:history="1">
+          <w:hyperlink w:anchor="_Toc242821934" w:history="1">
             <w:r>
               <w:rPr>
                 <w:rStyle w:val="Hyperlink"/>
@@ -1745,7 +1750,7 @@
               <w:rPr>
                 <w:noProof/>
               </w:rPr>
-              <w:instrText xml:space="preserve"> PAGEREF _Toc242819368 \h </w:instrText>
+              <w:instrText xml:space="preserve"> PAGEREF _Toc242821934 \h </w:instrText>
             </w:r>
             <w:r>
               <w:rPr>
@@ -1782,7 +1787,7 @@
               <w:noProof/>
             </w:rPr>
           </w:pPr>
-          <w:hyperlink w:anchor="_Toc242819369" w:history="1">
+          <w:hyperlink w:anchor="_Toc242821935" w:history="1">
             <w:r>
               <w:rPr>
                 <w:rStyle w:val="Hyperlink"/>
@@ -1806,7 +1811,7 @@
               <w:rPr>
                 <w:noProof/>
               </w:rPr>
-              <w:instrText xml:space="preserve"> PAGEREF _Toc242819369 \h </w:instrText>
+              <w:instrText xml:space="preserve"> PAGEREF _Toc242821935 \h </w:instrText>
             </w:r>
             <w:r>
               <w:rPr>
@@ -1843,7 +1848,7 @@
               <w:noProof/>
             </w:rPr>
           </w:pPr>
-          <w:hyperlink w:anchor="_Toc242819370" w:history="1">
+          <w:hyperlink w:anchor="_Toc242821936" w:history="1">
             <w:r>
               <w:rPr>
                 <w:rStyle w:val="Hyperlink"/>
@@ -1867,7 +1872,7 @@
               <w:rPr>
                 <w:noProof/>
               </w:rPr>
-              <w:instrText xml:space="preserve"> PAGEREF _Toc242819370 \h </w:instrText>
+              <w:instrText xml:space="preserve"> PAGEREF _Toc242821936 \h </w:instrText>
             </w:r>
             <w:r>
               <w:rPr>
@@ -1904,7 +1909,7 @@
               <w:noProof/>
             </w:rPr>
           </w:pPr>
-          <w:hyperlink w:anchor="_Toc242819371" w:history="1">
+          <w:hyperlink w:anchor="_Toc242821937" w:history="1">
             <w:r>
               <w:rPr>
                 <w:rStyle w:val="Hyperlink"/>
@@ -1928,7 +1933,7 @@
               <w:rPr>
                 <w:noProof/>
               </w:rPr>
-              <w:instrText xml:space="preserve"> PAGEREF _Toc242819371 \h </w:instrText>
+              <w:instrText xml:space="preserve"> PAGEREF _Toc242821937 \h </w:instrText>
             </w:r>
             <w:r>
               <w:rPr>
@@ -1965,7 +1970,7 @@
               <w:noProof/>
             </w:rPr>
           </w:pPr>
-          <w:hyperlink w:anchor="_Toc242819372" w:history="1">
+          <w:hyperlink w:anchor="_Toc242821938" w:history="1">
             <w:r>
               <w:rPr>
                 <w:rStyle w:val="Hyperlink"/>
@@ -1989,7 +1994,7 @@
               <w:rPr>
                 <w:noProof/>
               </w:rPr>
-              <w:instrText xml:space="preserve"> PAGEREF _Toc242819372 \h </w:instrText>
+              <w:instrText xml:space="preserve"> PAGEREF _Toc242821938 \h </w:instrText>
             </w:r>
             <w:r>
               <w:rPr>
@@ -2026,7 +2031,7 @@
               <w:noProof/>
             </w:rPr>
           </w:pPr>
-          <w:hyperlink w:anchor="_Toc242819373" w:history="1">
+          <w:hyperlink w:anchor="_Toc242821939" w:history="1">
             <w:r>
               <w:rPr>
                 <w:rStyle w:val="Hyperlink"/>
@@ -2050,7 +2055,7 @@
               <w:rPr>
                 <w:noProof/>
               </w:rPr>
-              <w:instrText xml:space="preserve"> PAGEREF _Toc242819373 \h </w:instrText>
+              <w:instrText xml:space="preserve"> PAGEREF _Toc242821939 \h </w:instrText>
             </w:r>
             <w:r>
               <w:rPr>
@@ -2087,7 +2092,7 @@
               <w:noProof/>
             </w:rPr>
           </w:pPr>
-          <w:hyperlink w:anchor="_Toc242819374" w:history="1">
+          <w:hyperlink w:anchor="_Toc242821940" w:history="1">
             <w:r>
               <w:rPr>
                 <w:rStyle w:val="Hyperlink"/>
@@ -2111,7 +2116,7 @@
               <w:rPr>
                 <w:noProof/>
               </w:rPr>
-              <w:instrText xml:space="preserve"> PAGEREF _Toc242819374 \h </w:instrText>
+              <w:instrText xml:space="preserve"> PAGEREF _Toc242821940 \h </w:instrText>
             </w:r>
             <w:r>
               <w:rPr>
@@ -2148,7 +2153,7 @@
               <w:noProof/>
             </w:rPr>
           </w:pPr>
-          <w:hyperlink w:anchor="_Toc242819375" w:history="1">
+          <w:hyperlink w:anchor="_Toc242821941" w:history="1">
             <w:r>
               <w:rPr>
                 <w:rStyle w:val="Hyperlink"/>
@@ -2172,7 +2177,7 @@
               <w:rPr>
                 <w:noProof/>
               </w:rPr>
-              <w:instrText xml:space="preserve"> PAGEREF _Toc242819375 \h </w:instrText>
+              <w:instrText xml:space="preserve"> PAGEREF _Toc242821941 \h </w:instrText>
             </w:r>
             <w:r>
               <w:rPr>
@@ -2209,7 +2214,7 @@
               <w:noProof/>
             </w:rPr>
           </w:pPr>
-          <w:hyperlink w:anchor="_Toc242819376" w:history="1">
+          <w:hyperlink w:anchor="_Toc242821942" w:history="1">
             <w:r>
               <w:rPr>
                 <w:rStyle w:val="Hyperlink"/>
@@ -2233,7 +2238,7 @@
               <w:rPr>
                 <w:noProof/>
               </w:rPr>
-              <w:instrText xml:space="preserve"> PAGEREF _Toc242819376 \h </w:instrText>
+              <w:instrText xml:space="preserve"> PAGEREF _Toc242821942 \h </w:instrText>
             </w:r>
             <w:r>
               <w:rPr>
@@ -2270,7 +2275,7 @@
               <w:noProof/>
             </w:rPr>
           </w:pPr>
-          <w:hyperlink w:anchor="_Toc242819377" w:history="1">
+          <w:hyperlink w:anchor="_Toc242821943" w:history="1">
             <w:r>
               <w:rPr>
                 <w:rStyle w:val="Hyperlink"/>
@@ -2294,7 +2299,7 @@
               <w:rPr>
                 <w:noProof/>
               </w:rPr>
-              <w:instrText xml:space="preserve"> PAGEREF _Toc242819377 \h </w:instrText>
+              <w:instrText xml:space="preserve"> PAGEREF _Toc242821943 \h </w:instrText>
             </w:r>
             <w:r>
               <w:rPr>
@@ -2333,7 +2338,7 @@
         <w:pStyle w:val="Heading1"/>
         <w:pageBreakBefore/>
       </w:pPr>
-      <w:bookmarkStart w:id="0" w:name="_Toc242819343"/>
+      <w:bookmarkStart w:id="0" w:name="_Toc242821909"/>
       <w:r>
         <w:lastRenderedPageBreak/>
         <w:t>1. Sebelum Mul</w:t>
@@ -2355,7 +2360,7 @@
       <w:pPr>
         <w:pStyle w:val="Heading2"/>
       </w:pPr>
-      <w:bookmarkStart w:id="1" w:name="_Toc242819344"/>
+      <w:bookmarkStart w:id="1" w:name="_Toc242821910"/>
       <w:r>
         <w:t>1.1 Susunan materi: Modul, Tingkat, dan Level</w:t>
       </w:r>
@@ -2893,7 +2898,7 @@
       <w:pPr>
         <w:pStyle w:val="Heading2"/>
       </w:pPr>
-      <w:bookmarkStart w:id="2" w:name="_Toc242819345"/>
+      <w:bookmarkStart w:id="2" w:name="_Toc242821911"/>
       <w:r>
         <w:t>1.2 Istilah kemajuan</w:t>
       </w:r>
@@ -3548,7 +3553,7 @@
       <w:pPr>
         <w:pStyle w:val="Heading2"/>
       </w:pPr>
-      <w:bookmarkStart w:id="3" w:name="_Toc242819346"/>
+      <w:bookmarkStart w:id="3" w:name="_Toc242821912"/>
       <w:r>
         <w:t>1.3 Sesi kelompok dan latihan mandiri</w:t>
       </w:r>
@@ -4260,7 +4265,7 @@
       <w:pPr>
         <w:pStyle w:val="Heading2"/>
       </w:pPr>
-      <w:bookmarkStart w:id="4" w:name="_Toc242819347"/>
+      <w:bookmarkStart w:id="4" w:name="_Toc242821913"/>
       <w:r>
         <w:t>1.4 Pertemuan terakhir</w:t>
       </w:r>
@@ -4360,7 +4365,7 @@
       <w:pPr>
         <w:pStyle w:val="Heading2"/>
       </w:pPr>
-      <w:bookmarkStart w:id="5" w:name="_Toc242819348"/>
+      <w:bookmarkStart w:id="5" w:name="_Toc242821914"/>
       <w:r>
         <w:t>1.5 Arti warna label</w:t>
       </w:r>
@@ -5066,7 +5071,7 @@
       <w:pPr>
         <w:pStyle w:val="Heading2"/>
       </w:pPr>
-      <w:bookmarkStart w:id="6" w:name="_Toc242819349"/>
+      <w:bookmarkStart w:id="6" w:name="_Toc242821915"/>
       <w:r>
         <w:t>1.6 Profil aturan dan tahapan khusus</w:t>
       </w:r>
@@ -5561,17 +5566,7 @@
         <w:t>urutan umum</w:t>
       </w:r>
       <w:r>
-        <w:t xml:space="preserve"> dengan Pengaturan Umum / sebuah profil. Memasang tahapan melepas profil kelompok; memasang profil melepas tahapan (siswa melanjutkan urutan umum dari posisinya). Kolom </w:t>
-      </w:r>
-      <w:r>
-        <w:rPr>
-          <w:i/>
-          <w:iCs/>
-        </w:rPr>
-        <w:t>Yang berlaku</w:t>
-      </w:r>
-      <w:r>
-        <w:t xml:space="preserve"> merangkum aturan tiap langkah.</w:t>
+        <w:t xml:space="preserve"> dengan Pengaturan Umum / sebuah profil. Memasang yang satu melepas yang lain; siswa tidak diulang dari awal.</w:t>
       </w:r>
     </w:p>
     <w:p>
@@ -5579,10 +5574,7 @@
         <w:spacing w:after="120" w:line="276" w:lineRule="auto"/>
       </w:pPr>
       <w:r>
-        <w:t>Saat si</w:t>
-      </w:r>
-      <w:r>
-        <w:t xml:space="preserve">swa naik ke langkah berikutnya, profil langkah baru </w:t>
+        <w:t xml:space="preserve">Saat siswa naik ke langkah berikutnya, profil langkah baru </w:t>
       </w:r>
       <w:r>
         <w:rPr>
@@ -5592,10 +5584,10 @@
         <w:t>langsung berlaku</w:t>
       </w:r>
       <w:r>
-        <w:t xml:space="preserve"> di soal berikutnya; guru tidak perlu memindahkan siswa. Profil sesudah tahapan berhenti berlaku bila guru memasang tahapan lain, memindahkan posisi siswa, atau mengubah ujung tahapan menj</w:t>
+        <w:t xml:space="preserve"> di soal berikutnya; guru tidak per</w:t>
       </w:r>
       <w:r>
-        <w:t xml:space="preserve">adi </w:t>
+        <w:t xml:space="preserve">lu memindahkan siswa. Profil sesudah tahapan berhenti berlaku bila guru memasang tahapan lain, memindahkan posisi siswa, atau mengubah ujung tahapan menjadi </w:t>
       </w:r>
       <w:r>
         <w:rPr>
@@ -5606,6 +5598,44 @@
       </w:r>
       <w:r>
         <w:t>.</w:t>
+      </w:r>
+    </w:p>
+    <w:p>
+      <w:pPr>
+        <w:spacing w:after="120" w:line="276" w:lineRule="auto"/>
+      </w:pPr>
+      <w:r>
+        <w:rPr>
+          <w:b/>
+          <w:bCs/>
+        </w:rPr>
+        <w:t>Latihan mandiri</w:t>
+      </w:r>
+      <w:r>
+        <w:t xml:space="preserve"> (di luar sesi) memakai kolom </w:t>
+      </w:r>
+      <w:r>
+        <w:rPr>
+          <w:i/>
+          <w:iCs/>
+        </w:rPr>
+        <w:t>Aturan latihan mandiri</w:t>
+      </w:r>
+      <w:r>
+        <w:t>: Pengaturan Umum (baw</w:t>
+      </w:r>
+      <w:r>
+        <w:t xml:space="preserve">aan), sebuah profil, atau </w:t>
+      </w:r>
+      <w:r>
+        <w:rPr>
+          <w:b/>
+          <w:bCs/>
+        </w:rPr>
+        <w:t>Sama dengan sesi kelompok</w:t>
+      </w:r>
+      <w:r>
+        <w:t>, yaitu aturan dasar, profil langkah, dan profil siswa, menurut posisi latihan mandiri siswa.</w:t>
       </w:r>
     </w:p>
     <w:p>
@@ -5650,7 +5680,14 @@
           <w:b/>
           <w:bCs/>
         </w:rPr>
-        <w:t>Profil tahapan</w:t>
+        <w:t>Pr</w:t>
+      </w:r>
+      <w:r>
+        <w:rPr>
+          <w:b/>
+          <w:bCs/>
+        </w:rPr>
+        <w:t>ofil tahapan</w:t>
       </w:r>
       <w:r>
         <w:t xml:space="preserve">: profil langkah tempat siswa berada, atau profil sesudah tahapan bila tahapan berujung </w:t>
@@ -5680,14 +5717,7 @@
           <w:b/>
           <w:bCs/>
         </w:rPr>
-        <w:t>Atura</w:t>
-      </w:r>
-      <w:r>
-        <w:rPr>
-          <w:b/>
-          <w:bCs/>
-        </w:rPr>
-        <w:t>n dasar</w:t>
+        <w:t>Aturan dasar</w:t>
       </w:r>
       <w:r>
         <w:t>: profil kelompok (kelompok dengan urutan umum) atau aturan dasar tahapan (kelompok dengan tahapan khusus).</w:t>
@@ -5707,7 +5737,14 @@
           <w:b/>
           <w:bCs/>
         </w:rPr>
-        <w:t>Pengaturan Umum</w:t>
+        <w:t>Pengaturan</w:t>
+      </w:r>
+      <w:r>
+        <w:rPr>
+          <w:b/>
+          <w:bCs/>
+        </w:rPr>
+        <w:t xml:space="preserve"> Umum</w:t>
       </w:r>
       <w:r>
         <w:t>: dari admin.</w:t>
@@ -5718,10 +5755,7 @@
         <w:spacing w:after="120" w:line="276" w:lineRule="auto"/>
       </w:pPr>
       <w:r>
-        <w:t>Isian yang tidak diatur di lapisan atas mengikuti lapisan di bawahnya, satu per satu. Contoh: profil langkah yan</w:t>
-      </w:r>
-      <w:r>
-        <w:t>g hanya mengubah jumlah soal tetap memakai lama sesi dari aturan dasar.</w:t>
+        <w:t>Isian yang tidak diatur di lapisan atas mengikuti lapisan di bawahnya, satu per satu. Contoh: profil langkah yang hanya mengubah jumlah soal tetap memakai lama sesi dari aturan dasar.</w:t>
       </w:r>
     </w:p>
     <w:tbl>
@@ -5794,7 +5828,14 @@
                 <w:sz w:val="19"/>
                 <w:szCs w:val="19"/>
               </w:rPr>
-              <w:t xml:space="preserve"> = jumlah salah terbanyak yang masih dimaafkan dalam satu level. Hitungan salah menumpuk sepanjang level; bila </w:t>
+              <w:t xml:space="preserve"> = jumlah salah te</w:t>
+            </w:r>
+            <w:r>
+              <w:rPr>
+                <w:sz w:val="19"/>
+                <w:szCs w:val="19"/>
+              </w:rPr>
+              <w:t xml:space="preserve">rbanyak yang masih dimaafkan dalam satu level. Hitungan salah menumpuk sepanjang level; bila </w:t>
             </w:r>
             <w:r>
               <w:rPr>
@@ -5838,14 +5879,7 @@
                 <w:sz w:val="19"/>
                 <w:szCs w:val="19"/>
               </w:rPr>
-              <w:t>Pada profil 50 soal, batas salah yang sama dengan latihan 10 soal (mis. 3) san</w:t>
-            </w:r>
-            <w:r>
-              <w:rPr>
-                <w:sz w:val="19"/>
-                <w:szCs w:val="19"/>
-              </w:rPr>
-              <w:t>gat berat: salah ke-4 di nomor mana pun mengulang dari awal. Sesuaikan dengan tujuan: ketat untuk saringan penguasaan, longgar (mis. 10–15) atau 0 untuk latihan pembiasaan.</w:t>
+              <w:t>Pada profil 50 soal, batas 3 sangat berat (salah ke-4 di nomor mana pun mengulang dari awal); pakai 10–15 atau 0 untuk latihan pembiasaan.</w:t>
             </w:r>
           </w:p>
         </w:tc>
@@ -5861,7 +5895,7 @@
         <w:pStyle w:val="Heading1"/>
         <w:pageBreakBefore/>
       </w:pPr>
-      <w:bookmarkStart w:id="7" w:name="_Toc242819350"/>
+      <w:bookmarkStart w:id="7" w:name="_Toc242821916"/>
       <w:r>
         <w:lastRenderedPageBreak/>
         <w:t>2. Tab Sesi Kegiatan</w:t>
@@ -5883,7 +5917,10 @@
         <w:t>ruang kendali saat pelajaran berlangsung</w:t>
       </w:r>
       <w:r>
-        <w:t>. Gunanya: membuka sesi latihan, membagikan kode akses, melihat siapa yang sedang berlatih atau terkunci, dan mengatur siswa tertentu. Data diperbarui otomatis setiap 30 detik selama tab terbuka.</w:t>
+        <w:t>. Gunanya: membuka sesi latihan, membag</w:t>
+      </w:r>
+      <w:r>
+        <w:t>ikan kode akses, melihat siapa yang sedang berlatih atau terkunci, dan mengatur siswa tertentu. Data diperbarui otomatis setiap 30 detik selama tab terbuka.</w:t>
       </w:r>
     </w:p>
     <w:p>
@@ -5924,14 +5961,7 @@
           <w:b/>
           <w:bCs/>
         </w:rPr>
-        <w:t>Ses</w:t>
-      </w:r>
-      <w:r>
-        <w:rPr>
-          <w:b/>
-          <w:bCs/>
-        </w:rPr>
-        <w:t>i latihan</w:t>
+        <w:t>Sesi latihan</w:t>
       </w:r>
     </w:p>
     <w:p>
@@ -5951,7 +5981,14 @@
           <w:b/>
           <w:bCs/>
         </w:rPr>
-        <w:t>Aturan dan tahapan yang berlaku</w:t>
+        <w:t>Aturan dan tahapan yang</w:t>
+      </w:r>
+      <w:r>
+        <w:rPr>
+          <w:b/>
+          <w:bCs/>
+        </w:rPr>
+        <w:t xml:space="preserve"> berlaku</w:t>
       </w:r>
     </w:p>
     <w:p>
@@ -6015,7 +6052,7 @@
       <w:pPr>
         <w:pStyle w:val="Heading2"/>
       </w:pPr>
-      <w:bookmarkStart w:id="8" w:name="_Toc242819351"/>
+      <w:bookmarkStart w:id="8" w:name="_Toc242821917"/>
       <w:r>
         <w:t>2.1 Bilah saringan</w:t>
       </w:r>
@@ -6515,7 +6552,7 @@
       <w:pPr>
         <w:pStyle w:val="Heading2"/>
       </w:pPr>
-      <w:bookmarkStart w:id="9" w:name="_Toc242819352"/>
+      <w:bookmarkStart w:id="9" w:name="_Toc242821918"/>
       <w:r>
         <w:t>2.2 Kartu Sesi latihan</w:t>
       </w:r>
@@ -6965,7 +7002,7 @@
                 <w:sz w:val="19"/>
                 <w:szCs w:val="19"/>
               </w:rPr>
-              <w:t>Lama sesi (30–120 menit). Tanda "(profil)" = lama bawaan dari aturan kelompok/Pengaturan Umum.</w:t>
+              <w:t>Lama sesi (30–120 menit). Tanda "(profil)" = lama bawaan dari aturan dasar kelompok (profil kelompok atau aturan dasar tahapan) atau Pengaturan Umum.</w:t>
             </w:r>
           </w:p>
         </w:tc>
@@ -7069,16 +7106,7 @@
                 <w:szCs w:val="19"/>
               </w:rPr>
               <w:lastRenderedPageBreak/>
-              <w:t>Tam</w:t>
-            </w:r>
-            <w:r>
-              <w:rPr>
-                <w:b/>
-                <w:bCs/>
-                <w:sz w:val="19"/>
-                <w:szCs w:val="19"/>
-              </w:rPr>
-              <w:t>pilkan teratas</w:t>
+              <w:t>Tampilkan teratas</w:t>
             </w:r>
           </w:p>
         </w:tc>
@@ -7358,7 +7386,7 @@
       <w:pPr>
         <w:pStyle w:val="Heading2"/>
       </w:pPr>
-      <w:bookmarkStart w:id="10" w:name="_Toc242819353"/>
+      <w:bookmarkStart w:id="10" w:name="_Toc242821919"/>
       <w:r>
         <w:t>2.3 Kotak Aturan dan tahapan yang berlaku</w:t>
       </w:r>
@@ -7734,7 +7762,7 @@
       <w:pPr>
         <w:pStyle w:val="Heading2"/>
       </w:pPr>
-      <w:bookmarkStart w:id="11" w:name="_Toc242819354"/>
+      <w:bookmarkStart w:id="11" w:name="_Toc242821920"/>
       <w:r>
         <w:t>2.4 Enam kotak ringkasan</w:t>
       </w:r>
@@ -8865,7 +8893,7 @@
       <w:pPr>
         <w:pStyle w:val="Heading2"/>
       </w:pPr>
-      <w:bookmarkStart w:id="12" w:name="_Toc242819355"/>
+      <w:bookmarkStart w:id="12" w:name="_Toc242821921"/>
       <w:r>
         <w:t>2.5 Tabel siswa</w:t>
       </w:r>
@@ -9448,7 +9476,7 @@
       <w:pPr>
         <w:pStyle w:val="Heading2"/>
       </w:pPr>
-      <w:bookmarkStart w:id="13" w:name="_Toc242819356"/>
+      <w:bookmarkStart w:id="13" w:name="_Toc242821922"/>
       <w:r>
         <w:t>2.6 Arti kolom Status</w:t>
       </w:r>
@@ -10453,7 +10481,7 @@
       <w:pPr>
         <w:pStyle w:val="Heading2"/>
       </w:pPr>
-      <w:bookmarkStart w:id="14" w:name="_Toc242819357"/>
+      <w:bookmarkStart w:id="14" w:name="_Toc242821923"/>
       <w:r>
         <w:t>2.7 Bilah aksi untuk siswa terpilih</w:t>
       </w:r>
@@ -10541,7 +10569,7 @@
         <w:t>Aturan mandiri</w:t>
       </w:r>
       <w:r>
-        <w:t xml:space="preserve">, dan </w:t>
+        <w:t xml:space="preserve"> (Ikut kelompok, Sama dengan sesi kelompok, atau sebuah profil), dan </w:t>
       </w:r>
       <w:r>
         <w:rPr>
@@ -10581,7 +10609,10 @@
         <w:t>Hapus data latihan</w:t>
       </w:r>
       <w:r>
-        <w:t xml:space="preserve"> — menghapus posisi, riwayat jawaban, dan level tuntas siswa terpilih (mis. setelah uji coba). Tidak bisa dibatalkan.</w:t>
+        <w:t xml:space="preserve"> — menghapus posisi, riwayat jawaban, dan level tuntas siswa ter</w:t>
+      </w:r>
+      <w:r>
+        <w:t>pilih (mis. setelah uji coba). Tidak bisa dibatalkan.</w:t>
       </w:r>
     </w:p>
     <w:p>
@@ -10598,14 +10629,7 @@
           <w:b/>
           <w:bCs/>
         </w:rPr>
-        <w:t>Batal pil</w:t>
-      </w:r>
-      <w:r>
-        <w:rPr>
-          <w:b/>
-          <w:bCs/>
-        </w:rPr>
-        <w:t>ih</w:t>
+        <w:t>Batal pilih</w:t>
       </w:r>
       <w:r>
         <w:t xml:space="preserve"> — mengosongkan centang.</w:t>
@@ -10767,16 +10791,7 @@
                 <w:sz w:val="19"/>
                 <w:szCs w:val="19"/>
               </w:rPr>
-              <w:t>Belum pernah masu</w:t>
-            </w:r>
-            <w:r>
-              <w:rPr>
-                <w:b/>
-                <w:bCs/>
-                <w:sz w:val="19"/>
-                <w:szCs w:val="19"/>
-              </w:rPr>
-              <w:t>k</w:t>
+              <w:t>Belum pernah masuk</w:t>
             </w:r>
             <w:r>
               <w:rPr>
@@ -10914,7 +10929,7 @@
         <w:pStyle w:val="Heading1"/>
         <w:pageBreakBefore/>
       </w:pPr>
-      <w:bookmarkStart w:id="15" w:name="_Toc242819358"/>
+      <w:bookmarkStart w:id="15" w:name="_Toc242821924"/>
       <w:r>
         <w:lastRenderedPageBreak/>
         <w:t>3. Tab Perkembangan Siswa</w:t>
@@ -11014,7 +11029,7 @@
       <w:pPr>
         <w:pStyle w:val="Heading2"/>
       </w:pPr>
-      <w:bookmarkStart w:id="16" w:name="_Toc242819359"/>
+      <w:bookmarkStart w:id="16" w:name="_Toc242821925"/>
       <w:r>
         <w:t>3.1 Sub-tab Per Siswa</w:t>
       </w:r>
@@ -14300,7 +14315,7 @@
       <w:pPr>
         <w:pStyle w:val="Heading2"/>
       </w:pPr>
-      <w:bookmarkStart w:id="17" w:name="_Toc242819360"/>
+      <w:bookmarkStart w:id="17" w:name="_Toc242821926"/>
       <w:r>
         <w:t>3.2 Sub-tab Per Kelompok</w:t>
       </w:r>
@@ -16052,7 +16067,7 @@
       <w:pPr>
         <w:pStyle w:val="Heading2"/>
       </w:pPr>
-      <w:bookmarkStart w:id="18" w:name="_Toc242819361"/>
+      <w:bookmarkStart w:id="18" w:name="_Toc242821927"/>
       <w:r>
         <w:lastRenderedPageBreak/>
         <w:t>3.3 Sub-tab Peringkat</w:t>
@@ -19439,7 +19454,7 @@
         <w:pStyle w:val="Heading1"/>
         <w:pageBreakBefore/>
       </w:pPr>
-      <w:bookmarkStart w:id="19" w:name="_Toc242819362"/>
+      <w:bookmarkStart w:id="19" w:name="_Toc242821928"/>
       <w:r>
         <w:lastRenderedPageBreak/>
         <w:t>4. Tab Analisis Siswa</w:t>
@@ -20718,7 +20733,7 @@
       <w:pPr>
         <w:pStyle w:val="Heading2"/>
       </w:pPr>
-      <w:bookmarkStart w:id="20" w:name="_Toc242819363"/>
+      <w:bookmarkStart w:id="20" w:name="_Toc242821929"/>
       <w:r>
         <w:t>4.1 Kartu identitas</w:t>
       </w:r>
@@ -20749,7 +20764,7 @@
       <w:pPr>
         <w:pStyle w:val="Heading2"/>
       </w:pPr>
-      <w:bookmarkStart w:id="21" w:name="_Toc242819364"/>
+      <w:bookmarkStart w:id="21" w:name="_Toc242821930"/>
       <w:r>
         <w:t>4.2 Lima kotak ringkasan</w:t>
       </w:r>
@@ -21640,7 +21655,7 @@
       <w:pPr>
         <w:pStyle w:val="Heading2"/>
       </w:pPr>
-      <w:bookmarkStart w:id="22" w:name="_Toc242819365"/>
+      <w:bookmarkStart w:id="22" w:name="_Toc242821931"/>
       <w:r>
         <w:t>4.3 Aturan dan tahapan yang berlaku</w:t>
       </w:r>
@@ -21954,7 +21969,7 @@
       <w:pPr>
         <w:pStyle w:val="Heading2"/>
       </w:pPr>
-      <w:bookmarkStart w:id="23" w:name="_Toc242819366"/>
+      <w:bookmarkStart w:id="23" w:name="_Toc242821932"/>
       <w:r>
         <w:t>4.4 Catatan otomatis</w:t>
       </w:r>
@@ -21965,7 +21980,10 @@
         <w:spacing w:after="120" w:line="276" w:lineRule="auto"/>
       </w:pPr>
       <w:r>
-        <w:t>Kesimpulan singkat yang disusun aplikasi dari data siswa. Setiap butir hanya muncul bila syaratnya terpenuhi:</w:t>
+        <w:t>Kesimpulan si</w:t>
+      </w:r>
+      <w:r>
+        <w:t>ngkat yang disusun aplikasi dari data siswa. Setiap butir hanya muncul bila syaratnya terpenuhi:</w:t>
       </w:r>
     </w:p>
     <w:tbl>
@@ -22727,7 +22745,7 @@
       <w:pPr>
         <w:pStyle w:val="Heading2"/>
       </w:pPr>
-      <w:bookmarkStart w:id="24" w:name="_Toc242819367"/>
+      <w:bookmarkStart w:id="24" w:name="_Toc242821933"/>
       <w:r>
         <w:t>4.5 Kartu Latihan mandiri (di luar sesi)</w:t>
       </w:r>
@@ -23189,7 +23207,7 @@
       <w:pPr>
         <w:pStyle w:val="Heading2"/>
       </w:pPr>
-      <w:bookmarkStart w:id="25" w:name="_Toc242819368"/>
+      <w:bookmarkStart w:id="25" w:name="_Toc242821934"/>
       <w:r>
         <w:t>4.6 Riwayat semester (arsip)</w:t>
       </w:r>
@@ -23200,7 +23218,10 @@
         <w:spacing w:after="120" w:line="276" w:lineRule="auto"/>
       </w:pPr>
       <w:r>
-        <w:t xml:space="preserve">Muncul bila rincian semester lalu sudah diarsipkan. Satu baris per semester dan jenis (Sesi kelompok / Latihan mandiri): </w:t>
+        <w:t>Muncul bila rincian semester lalu sudah diarsipkan. Satu baris per semester dan jenis (Sesi kelompok / Latihan mandiri)</w:t>
+      </w:r>
+      <w:r>
+        <w:t xml:space="preserve">: </w:t>
       </w:r>
       <w:r>
         <w:rPr>
@@ -23270,10 +23291,7 @@
         <w:t>Posisi akhir</w:t>
       </w:r>
       <w:r>
-        <w:t xml:space="preserve"> semester itu. Rincian per soal dibuka lew</w:t>
-      </w:r>
-      <w:r>
-        <w:t xml:space="preserve">at </w:t>
+        <w:t xml:space="preserve"> semester itu. Rincian per soal dibuka lewat </w:t>
       </w:r>
       <w:r>
         <w:rPr>
@@ -23290,7 +23308,7 @@
       <w:pPr>
         <w:pStyle w:val="Heading2"/>
       </w:pPr>
-      <w:bookmarkStart w:id="26" w:name="_Toc242819369"/>
+      <w:bookmarkStart w:id="26" w:name="_Toc242821935"/>
       <w:r>
         <w:t>4.7 Grafik Kemajuan level tuntas</w:t>
       </w:r>
@@ -23311,7 +23329,10 @@
         <w:t>kumulatif</w:t>
       </w:r>
       <w:r>
-        <w:t>: setiap titik adalah satu tanggal siswa berlatih dalam 2 bulan terakhir, tingginya = total level dituntaskan sampai tanggal itu.</w:t>
+        <w:t>: setiap titik adalah satu tanggal siswa berlatih</w:t>
+      </w:r>
+      <w:r>
+        <w:t xml:space="preserve"> dalam 2 bulan terakhir, tingginya = total level dituntaskan sampai tanggal itu.</w:t>
       </w:r>
     </w:p>
     <w:tbl>
@@ -23676,7 +23697,7 @@
       <w:pPr>
         <w:pStyle w:val="Heading2"/>
       </w:pPr>
-      <w:bookmarkStart w:id="27" w:name="_Toc242819370"/>
+      <w:bookmarkStart w:id="27" w:name="_Toc242821936"/>
       <w:r>
         <w:t>4.8 Jenis kesalahan</w:t>
       </w:r>
@@ -25543,7 +25564,7 @@
       <w:pPr>
         <w:pStyle w:val="Heading2"/>
       </w:pPr>
-      <w:bookmarkStart w:id="28" w:name="_Toc242819371"/>
+      <w:bookmarkStart w:id="28" w:name="_Toc242821937"/>
       <w:r>
         <w:lastRenderedPageBreak/>
         <w:t>4.9 Per tingkat</w:t>
@@ -25936,7 +25957,7 @@
       <w:pPr>
         <w:pStyle w:val="Heading2"/>
       </w:pPr>
-      <w:bookmarkStart w:id="29" w:name="_Toc242819372"/>
+      <w:bookmarkStart w:id="29" w:name="_Toc242821938"/>
       <w:r>
         <w:t>4.10 Kesalahan terakhir</w:t>
       </w:r>
@@ -26551,7 +26572,7 @@
       <w:pPr>
         <w:pStyle w:val="Heading2"/>
       </w:pPr>
-      <w:bookmarkStart w:id="30" w:name="_Toc242819373"/>
+      <w:bookmarkStart w:id="30" w:name="_Toc242821939"/>
       <w:r>
         <w:t>4.11 Riwayat level tuntas</w:t>
       </w:r>
@@ -27173,7 +27194,7 @@
       <w:pPr>
         <w:pStyle w:val="Heading2"/>
       </w:pPr>
-      <w:bookmarkStart w:id="31" w:name="_Toc242819374"/>
+      <w:bookmarkStart w:id="31" w:name="_Toc242821940"/>
       <w:r>
         <w:lastRenderedPageBreak/>
         <w:t>4.12 Pindahkan posisi dan Hapus data latihan</w:t>
@@ -27360,7 +27381,7 @@
         <w:pStyle w:val="Heading1"/>
         <w:pageBreakBefore/>
       </w:pPr>
-      <w:bookmarkStart w:id="32" w:name="_Toc242819375"/>
+      <w:bookmarkStart w:id="32" w:name="_Toc242821941"/>
       <w:r>
         <w:lastRenderedPageBreak/>
         <w:t>5. Dari Data ke Tindakan</w:t>
@@ -27371,7 +27392,7 @@
       <w:pPr>
         <w:pStyle w:val="Heading2"/>
       </w:pPr>
-      <w:bookmarkStart w:id="33" w:name="_Toc242819376"/>
+      <w:bookmarkStart w:id="33" w:name="_Toc242821942"/>
       <w:r>
         <w:t>5.1 Situasi umum dan tindakan</w:t>
       </w:r>
@@ -28441,7 +28462,14 @@
                 <w:sz w:val="19"/>
                 <w:szCs w:val="19"/>
               </w:rPr>
-              <w:t>Per Kelompok → kolom Pertemuan terakhir</w:t>
+              <w:t xml:space="preserve">Per Kelompok → kolom Pertemuan </w:t>
+            </w:r>
+            <w:r>
+              <w:rPr>
+                <w:sz w:val="19"/>
+                <w:szCs w:val="19"/>
+              </w:rPr>
+              <w:t>terakhir</w:t>
             </w:r>
           </w:p>
         </w:tc>
@@ -28470,14 +28498,7 @@
                 <w:sz w:val="19"/>
                 <w:szCs w:val="19"/>
               </w:rPr>
-              <w:t>Isi jadwal KBM kelompok di Data Ind</w:t>
-            </w:r>
-            <w:r>
-              <w:rPr>
-                <w:sz w:val="19"/>
-                <w:szCs w:val="19"/>
-              </w:rPr>
-              <w:t>uk, lalu minta admin menarik ulang.</w:t>
+              <w:t>Isi jadwal KBM kelompok di Data Induk, lalu minta admin menarik ulang.</w:t>
             </w:r>
           </w:p>
         </w:tc>
@@ -28493,7 +28514,7 @@
         <w:pStyle w:val="Heading2"/>
         <w:pageBreakBefore/>
       </w:pPr>
-      <w:bookmarkStart w:id="34" w:name="_Toc242819377"/>
+      <w:bookmarkStart w:id="34" w:name="_Toc242821943"/>
       <w:r>
         <w:lastRenderedPageBreak/>
         <w:t>5.2 Tanya jawab singkat</w:t>
@@ -28646,7 +28667,14 @@
                 <w:sz w:val="19"/>
                 <w:szCs w:val="19"/>
               </w:rPr>
-              <w:t>Siswa pernah dipindahkan ke depan oleh guru (atau mulai dari tingkat lebih tinggi, mis. MD11). Kemajuan dihitung dari posisi; level dituntaskan sendiri hanya menghitung yang benar-benar dikerjakan.</w:t>
+              <w:t>Siswa pernah dipindahkan ke depan oleh guru (atau mulai dari tingkat lebih tinggi, mis. MD11). Kemajuan dihitung dari posisi; level dituntaskan sendiri hanya menghitung yang benar</w:t>
+            </w:r>
+            <w:r>
+              <w:rPr>
+                <w:sz w:val="19"/>
+                <w:szCs w:val="19"/>
+              </w:rPr>
+              <w:t>-benar dikerjakan.</w:t>
             </w:r>
           </w:p>
         </w:tc>
@@ -28681,14 +28709,7 @@
                 <w:sz w:val="19"/>
                 <w:szCs w:val="19"/>
               </w:rPr>
-              <w:t>Mengapa siswa rajin latihan di rumah tetapi posisinya tid</w:t>
-            </w:r>
-            <w:r>
-              <w:rPr>
-                <w:sz w:val="19"/>
-                <w:szCs w:val="19"/>
-              </w:rPr>
-              <w:t>ak naik?</w:t>
+              <w:t>Mengapa siswa rajin latihan di rumah tetapi posisinya tidak naik?</w:t>
             </w:r>
           </w:p>
         </w:tc>
@@ -29399,442 +29420,10 @@
 <file path=word/numbering.xml><?xml version="1.0" encoding="utf-8"?>
 <w:numbering xmlns:wpc="http://schemas.microsoft.com/office/word/2010/wordprocessingCanvas" xmlns:cx="http://schemas.microsoft.com/office/drawing/2014/chartex" xmlns:cx1="http://schemas.microsoft.com/office/drawing/2015/9/8/chartex" xmlns:cx2="http://schemas.microsoft.com/office/drawing/2015/10/21/chartex" xmlns:cx3="http://schemas.microsoft.com/office/drawing/2016/5/9/chartex" xmlns:cx4="http://schemas.microsoft.com/office/drawing/2016/5/10/chartex" xmlns:cx5="http://schemas.microsoft.com/office/drawing/2016/5/11/chartex" xmlns:cx6="http://schemas.microsoft.com/office/drawing/2016/5/12/chartex" xmlns:cx7="http://schemas.microsoft.com/office/drawing/2016/5/13/chartex" xmlns:cx8="http://schemas.microsoft.com/office/drawing/2016/5/14/chartex" xmlns:mc="http://schemas.openxmlformats.org/markup-compatibility/2006" xmlns:aink="http://schemas.microsoft.com/office/drawing/2016/ink" xmlns:am3d="http://schemas.microsoft.com/office/drawing/2017/model3d" xmlns:o="urn:schemas-microsoft-com:office:office" xmlns:r="http://schemas.openxmlformats.org/officeDocument/2006/relationships" xmlns:m="http://schemas.openxmlformats.org/officeDocument/2006/math" xmlns:v="urn:schemas-microsoft-com:vml" xmlns:wp14="http://schemas.microsoft.com/office/word/2010/wordprocessingDrawing" xmlns:wp="http://schemas.openxmlformats.org/drawingml/2006/wordprocessingDrawing" xmlns:w10="urn:schemas-microsoft-com:office:word" xmlns:w="http://schemas.openxmlformats.org/wordprocessingml/2006/main" xmlns:w14="http://schemas.microsoft.com/office/word/2010/wordml" xmlns:w15="http://schemas.microsoft.com/office/word/2012/wordml" xmlns:w16cex="http://schemas.microsoft.com/office/word/2018/wordml/cex" xmlns:w16cid="http://schemas.microsoft.com/office/word/2016/wordml/cid" xmlns:w16="http://schemas.microsoft.com/office/word/2018/wordml" xmlns:w16sdtdh="http://schemas.microsoft.com/office/word/2020/wordml/sdtdatahash" xmlns:w16se="http://schemas.microsoft.com/office/word/2015/wordml/symex" xmlns:wpg="http://schemas.microsoft.com/office/word/2010/wordprocessingGroup" xmlns:wpi="http://schemas.microsoft.com/office/word/2010/wordprocessingInk" xmlns:wne="http://schemas.microsoft.com/office/word/2006/wordml" xmlns:wps="http://schemas.microsoft.com/office/word/2010/wordprocessingShape" mc:Ignorable="w14 w15 w16se w16cid w16 w16cex w16sdtdh wp14">
   <w:abstractNum w:abstractNumId="0" w15:restartNumberingAfterBreak="0">
-    <w:nsid w:val="07236915"/>
+    <w:nsid w:val="0C764F80"/>
     <w:multiLevelType w:val="hybridMultilevel"/>
-    <w:tmpl w:val="27425418"/>
-    <w:lvl w:ilvl="0" w:tplc="70E6B992" w:tentative="1">
-      <w:start w:val="1"/>
-      <w:numFmt w:val="decimal"/>
-      <w:lvlText w:val="%1."/>
-      <w:lvlJc w:val="left"/>
-      <w:pPr>
-        <w:ind w:left="540" w:hanging="300"/>
-      </w:pPr>
-    </w:lvl>
-    <w:lvl w:ilvl="1" w:tplc="A934DD9E">
-      <w:numFmt w:val="decimal"/>
-      <w:lvlText w:val=""/>
-      <w:lvlJc w:val="left"/>
-    </w:lvl>
-    <w:lvl w:ilvl="2" w:tplc="95428342">
-      <w:numFmt w:val="decimal"/>
-      <w:lvlText w:val=""/>
-      <w:lvlJc w:val="left"/>
-    </w:lvl>
-    <w:lvl w:ilvl="3" w:tplc="1A0A5078">
-      <w:numFmt w:val="decimal"/>
-      <w:lvlText w:val=""/>
-      <w:lvlJc w:val="left"/>
-    </w:lvl>
-    <w:lvl w:ilvl="4" w:tplc="5A9472F4">
-      <w:numFmt w:val="decimal"/>
-      <w:lvlText w:val=""/>
-      <w:lvlJc w:val="left"/>
-    </w:lvl>
-    <w:lvl w:ilvl="5" w:tplc="98349CD0">
-      <w:numFmt w:val="decimal"/>
-      <w:lvlText w:val=""/>
-      <w:lvlJc w:val="left"/>
-    </w:lvl>
-    <w:lvl w:ilvl="6" w:tplc="51A82000">
-      <w:numFmt w:val="decimal"/>
-      <w:lvlText w:val=""/>
-      <w:lvlJc w:val="left"/>
-    </w:lvl>
-    <w:lvl w:ilvl="7" w:tplc="2ACAEC18">
-      <w:numFmt w:val="decimal"/>
-      <w:lvlText w:val=""/>
-      <w:lvlJc w:val="left"/>
-    </w:lvl>
-    <w:lvl w:ilvl="8" w:tplc="E30AB9E6">
-      <w:numFmt w:val="decimal"/>
-      <w:lvlText w:val=""/>
-      <w:lvlJc w:val="left"/>
-    </w:lvl>
-  </w:abstractNum>
-  <w:abstractNum w:abstractNumId="1" w15:restartNumberingAfterBreak="0">
-    <w:nsid w:val="07C66BDB"/>
-    <w:multiLevelType w:val="hybridMultilevel"/>
-    <w:tmpl w:val="E8BAC058"/>
-    <w:lvl w:ilvl="0" w:tplc="82DCC474" w:tentative="1">
-      <w:start w:val="1"/>
-      <w:numFmt w:val="decimal"/>
-      <w:lvlText w:val="%1."/>
-      <w:lvlJc w:val="left"/>
-      <w:pPr>
-        <w:ind w:left="540" w:hanging="300"/>
-      </w:pPr>
-    </w:lvl>
-    <w:lvl w:ilvl="1" w:tplc="36A85502">
-      <w:numFmt w:val="decimal"/>
-      <w:lvlText w:val=""/>
-      <w:lvlJc w:val="left"/>
-    </w:lvl>
-    <w:lvl w:ilvl="2" w:tplc="BF68867C">
-      <w:numFmt w:val="decimal"/>
-      <w:lvlText w:val=""/>
-      <w:lvlJc w:val="left"/>
-    </w:lvl>
-    <w:lvl w:ilvl="3" w:tplc="EE245F78">
-      <w:numFmt w:val="decimal"/>
-      <w:lvlText w:val=""/>
-      <w:lvlJc w:val="left"/>
-    </w:lvl>
-    <w:lvl w:ilvl="4" w:tplc="F3BC128C">
-      <w:numFmt w:val="decimal"/>
-      <w:lvlText w:val=""/>
-      <w:lvlJc w:val="left"/>
-    </w:lvl>
-    <w:lvl w:ilvl="5" w:tplc="EFFC361A">
-      <w:numFmt w:val="decimal"/>
-      <w:lvlText w:val=""/>
-      <w:lvlJc w:val="left"/>
-    </w:lvl>
-    <w:lvl w:ilvl="6" w:tplc="FF62E36C">
-      <w:numFmt w:val="decimal"/>
-      <w:lvlText w:val=""/>
-      <w:lvlJc w:val="left"/>
-    </w:lvl>
-    <w:lvl w:ilvl="7" w:tplc="47BA3260">
-      <w:numFmt w:val="decimal"/>
-      <w:lvlText w:val=""/>
-      <w:lvlJc w:val="left"/>
-    </w:lvl>
-    <w:lvl w:ilvl="8" w:tplc="D5A822C4">
-      <w:numFmt w:val="decimal"/>
-      <w:lvlText w:val=""/>
-      <w:lvlJc w:val="left"/>
-    </w:lvl>
-  </w:abstractNum>
-  <w:abstractNum w:abstractNumId="2" w15:restartNumberingAfterBreak="0">
-    <w:nsid w:val="085C692E"/>
-    <w:multiLevelType w:val="hybridMultilevel"/>
-    <w:tmpl w:val="929017F0"/>
-    <w:lvl w:ilvl="0" w:tplc="B9486D80">
-      <w:start w:val="1"/>
-      <w:numFmt w:val="decimal"/>
-      <w:lvlText w:val="%1."/>
-      <w:lvlJc w:val="left"/>
-      <w:pPr>
-        <w:ind w:left="540" w:hanging="300"/>
-      </w:pPr>
-    </w:lvl>
-    <w:lvl w:ilvl="1" w:tplc="5DF4C9AA">
-      <w:numFmt w:val="decimal"/>
-      <w:lvlText w:val=""/>
-      <w:lvlJc w:val="left"/>
-    </w:lvl>
-    <w:lvl w:ilvl="2" w:tplc="00647646">
-      <w:numFmt w:val="decimal"/>
-      <w:lvlText w:val=""/>
-      <w:lvlJc w:val="left"/>
-    </w:lvl>
-    <w:lvl w:ilvl="3" w:tplc="F468C3E6">
-      <w:numFmt w:val="decimal"/>
-      <w:lvlText w:val=""/>
-      <w:lvlJc w:val="left"/>
-    </w:lvl>
-    <w:lvl w:ilvl="4" w:tplc="F472755C">
-      <w:numFmt w:val="decimal"/>
-      <w:lvlText w:val=""/>
-      <w:lvlJc w:val="left"/>
-    </w:lvl>
-    <w:lvl w:ilvl="5" w:tplc="C0924DBA">
-      <w:numFmt w:val="decimal"/>
-      <w:lvlText w:val=""/>
-      <w:lvlJc w:val="left"/>
-    </w:lvl>
-    <w:lvl w:ilvl="6" w:tplc="6D748F0A">
-      <w:numFmt w:val="decimal"/>
-      <w:lvlText w:val=""/>
-      <w:lvlJc w:val="left"/>
-    </w:lvl>
-    <w:lvl w:ilvl="7" w:tplc="1A184B68">
-      <w:numFmt w:val="decimal"/>
-      <w:lvlText w:val=""/>
-      <w:lvlJc w:val="left"/>
-    </w:lvl>
-    <w:lvl w:ilvl="8" w:tplc="3F40F07E">
-      <w:numFmt w:val="decimal"/>
-      <w:lvlText w:val=""/>
-      <w:lvlJc w:val="left"/>
-    </w:lvl>
-  </w:abstractNum>
-  <w:abstractNum w:abstractNumId="3" w15:restartNumberingAfterBreak="0">
-    <w:nsid w:val="093F69A9"/>
-    <w:multiLevelType w:val="hybridMultilevel"/>
-    <w:tmpl w:val="950801BE"/>
-    <w:lvl w:ilvl="0" w:tplc="42C617D0" w:tentative="1">
-      <w:start w:val="1"/>
-      <w:numFmt w:val="decimal"/>
-      <w:lvlText w:val="%1."/>
-      <w:lvlJc w:val="left"/>
-      <w:pPr>
-        <w:ind w:left="540" w:hanging="300"/>
-      </w:pPr>
-    </w:lvl>
-    <w:lvl w:ilvl="1" w:tplc="E74CDB96">
-      <w:numFmt w:val="decimal"/>
-      <w:lvlText w:val=""/>
-      <w:lvlJc w:val="left"/>
-    </w:lvl>
-    <w:lvl w:ilvl="2" w:tplc="B9883534">
-      <w:numFmt w:val="decimal"/>
-      <w:lvlText w:val=""/>
-      <w:lvlJc w:val="left"/>
-    </w:lvl>
-    <w:lvl w:ilvl="3" w:tplc="9BFA5DC2">
-      <w:numFmt w:val="decimal"/>
-      <w:lvlText w:val=""/>
-      <w:lvlJc w:val="left"/>
-    </w:lvl>
-    <w:lvl w:ilvl="4" w:tplc="4CDE6E2E">
-      <w:numFmt w:val="decimal"/>
-      <w:lvlText w:val=""/>
-      <w:lvlJc w:val="left"/>
-    </w:lvl>
-    <w:lvl w:ilvl="5" w:tplc="6C4C3118">
-      <w:numFmt w:val="decimal"/>
-      <w:lvlText w:val=""/>
-      <w:lvlJc w:val="left"/>
-    </w:lvl>
-    <w:lvl w:ilvl="6" w:tplc="EA988F0C">
-      <w:numFmt w:val="decimal"/>
-      <w:lvlText w:val=""/>
-      <w:lvlJc w:val="left"/>
-    </w:lvl>
-    <w:lvl w:ilvl="7" w:tplc="325C6B4A">
-      <w:numFmt w:val="decimal"/>
-      <w:lvlText w:val=""/>
-      <w:lvlJc w:val="left"/>
-    </w:lvl>
-    <w:lvl w:ilvl="8" w:tplc="8BDE3EF8">
-      <w:numFmt w:val="decimal"/>
-      <w:lvlText w:val=""/>
-      <w:lvlJc w:val="left"/>
-    </w:lvl>
-  </w:abstractNum>
-  <w:abstractNum w:abstractNumId="4" w15:restartNumberingAfterBreak="0">
-    <w:nsid w:val="09EE16B3"/>
-    <w:multiLevelType w:val="hybridMultilevel"/>
-    <w:tmpl w:val="02E6A4B6"/>
-    <w:lvl w:ilvl="0" w:tplc="6BD085A0">
-      <w:start w:val="1"/>
-      <w:numFmt w:val="decimal"/>
-      <w:lvlText w:val="%1."/>
-      <w:lvlJc w:val="left"/>
-      <w:pPr>
-        <w:ind w:left="540" w:hanging="300"/>
-      </w:pPr>
-    </w:lvl>
-    <w:lvl w:ilvl="1" w:tplc="DA625A90">
-      <w:numFmt w:val="decimal"/>
-      <w:lvlText w:val=""/>
-      <w:lvlJc w:val="left"/>
-    </w:lvl>
-    <w:lvl w:ilvl="2" w:tplc="B9CC7346">
-      <w:numFmt w:val="decimal"/>
-      <w:lvlText w:val=""/>
-      <w:lvlJc w:val="left"/>
-    </w:lvl>
-    <w:lvl w:ilvl="3" w:tplc="DF289638">
-      <w:numFmt w:val="decimal"/>
-      <w:lvlText w:val=""/>
-      <w:lvlJc w:val="left"/>
-    </w:lvl>
-    <w:lvl w:ilvl="4" w:tplc="5EAA3846">
-      <w:numFmt w:val="decimal"/>
-      <w:lvlText w:val=""/>
-      <w:lvlJc w:val="left"/>
-    </w:lvl>
-    <w:lvl w:ilvl="5" w:tplc="63FC348A">
-      <w:numFmt w:val="decimal"/>
-      <w:lvlText w:val=""/>
-      <w:lvlJc w:val="left"/>
-    </w:lvl>
-    <w:lvl w:ilvl="6" w:tplc="1DE6430C">
-      <w:numFmt w:val="decimal"/>
-      <w:lvlText w:val=""/>
-      <w:lvlJc w:val="left"/>
-    </w:lvl>
-    <w:lvl w:ilvl="7" w:tplc="7020EF0C">
-      <w:numFmt w:val="decimal"/>
-      <w:lvlText w:val=""/>
-      <w:lvlJc w:val="left"/>
-    </w:lvl>
-    <w:lvl w:ilvl="8" w:tplc="3EA23F26">
-      <w:numFmt w:val="decimal"/>
-      <w:lvlText w:val=""/>
-      <w:lvlJc w:val="left"/>
-    </w:lvl>
-  </w:abstractNum>
-  <w:abstractNum w:abstractNumId="5" w15:restartNumberingAfterBreak="0">
-    <w:nsid w:val="14954970"/>
-    <w:multiLevelType w:val="hybridMultilevel"/>
-    <w:tmpl w:val="02967700"/>
-    <w:lvl w:ilvl="0" w:tplc="CF3CEC5A" w:tentative="1">
-      <w:start w:val="1"/>
-      <w:numFmt w:val="decimal"/>
-      <w:lvlText w:val="%1."/>
-      <w:lvlJc w:val="left"/>
-      <w:pPr>
-        <w:ind w:left="540" w:hanging="300"/>
-      </w:pPr>
-    </w:lvl>
-    <w:lvl w:ilvl="1" w:tplc="D944B014">
-      <w:numFmt w:val="decimal"/>
-      <w:lvlText w:val=""/>
-      <w:lvlJc w:val="left"/>
-    </w:lvl>
-    <w:lvl w:ilvl="2" w:tplc="990C0C44">
-      <w:numFmt w:val="decimal"/>
-      <w:lvlText w:val=""/>
-      <w:lvlJc w:val="left"/>
-    </w:lvl>
-    <w:lvl w:ilvl="3" w:tplc="D00ABF42">
-      <w:numFmt w:val="decimal"/>
-      <w:lvlText w:val=""/>
-      <w:lvlJc w:val="left"/>
-    </w:lvl>
-    <w:lvl w:ilvl="4" w:tplc="B9EAB692">
-      <w:numFmt w:val="decimal"/>
-      <w:lvlText w:val=""/>
-      <w:lvlJc w:val="left"/>
-    </w:lvl>
-    <w:lvl w:ilvl="5" w:tplc="A612AF6C">
-      <w:numFmt w:val="decimal"/>
-      <w:lvlText w:val=""/>
-      <w:lvlJc w:val="left"/>
-    </w:lvl>
-    <w:lvl w:ilvl="6" w:tplc="3C1C86CA">
-      <w:numFmt w:val="decimal"/>
-      <w:lvlText w:val=""/>
-      <w:lvlJc w:val="left"/>
-    </w:lvl>
-    <w:lvl w:ilvl="7" w:tplc="62CEFA90">
-      <w:numFmt w:val="decimal"/>
-      <w:lvlText w:val=""/>
-      <w:lvlJc w:val="left"/>
-    </w:lvl>
-    <w:lvl w:ilvl="8" w:tplc="EBBAED08">
-      <w:numFmt w:val="decimal"/>
-      <w:lvlText w:val=""/>
-      <w:lvlJc w:val="left"/>
-    </w:lvl>
-  </w:abstractNum>
-  <w:abstractNum w:abstractNumId="6" w15:restartNumberingAfterBreak="0">
-    <w:nsid w:val="163470FA"/>
-    <w:multiLevelType w:val="hybridMultilevel"/>
-    <w:tmpl w:val="E4202FBC"/>
-    <w:lvl w:ilvl="0" w:tplc="9A880328" w:tentative="1">
-      <w:start w:val="1"/>
-      <w:numFmt w:val="decimal"/>
-      <w:lvlText w:val="%1."/>
-      <w:lvlJc w:val="left"/>
-      <w:pPr>
-        <w:ind w:left="540" w:hanging="300"/>
-      </w:pPr>
-    </w:lvl>
-    <w:lvl w:ilvl="1" w:tplc="82E882BC">
-      <w:numFmt w:val="decimal"/>
-      <w:lvlText w:val=""/>
-      <w:lvlJc w:val="left"/>
-    </w:lvl>
-    <w:lvl w:ilvl="2" w:tplc="D0D2A5AC">
-      <w:numFmt w:val="decimal"/>
-      <w:lvlText w:val=""/>
-      <w:lvlJc w:val="left"/>
-    </w:lvl>
-    <w:lvl w:ilvl="3" w:tplc="260AB844">
-      <w:numFmt w:val="decimal"/>
-      <w:lvlText w:val=""/>
-      <w:lvlJc w:val="left"/>
-    </w:lvl>
-    <w:lvl w:ilvl="4" w:tplc="8C96DAE2">
-      <w:numFmt w:val="decimal"/>
-      <w:lvlText w:val=""/>
-      <w:lvlJc w:val="left"/>
-    </w:lvl>
-    <w:lvl w:ilvl="5" w:tplc="A39625F8">
-      <w:numFmt w:val="decimal"/>
-      <w:lvlText w:val=""/>
-      <w:lvlJc w:val="left"/>
-    </w:lvl>
-    <w:lvl w:ilvl="6" w:tplc="F8904C54">
-      <w:numFmt w:val="decimal"/>
-      <w:lvlText w:val=""/>
-      <w:lvlJc w:val="left"/>
-    </w:lvl>
-    <w:lvl w:ilvl="7" w:tplc="93F23318">
-      <w:numFmt w:val="decimal"/>
-      <w:lvlText w:val=""/>
-      <w:lvlJc w:val="left"/>
-    </w:lvl>
-    <w:lvl w:ilvl="8" w:tplc="876828A0">
-      <w:numFmt w:val="decimal"/>
-      <w:lvlText w:val=""/>
-      <w:lvlJc w:val="left"/>
-    </w:lvl>
-  </w:abstractNum>
-  <w:abstractNum w:abstractNumId="7" w15:restartNumberingAfterBreak="0">
-    <w:nsid w:val="22E27104"/>
-    <w:multiLevelType w:val="hybridMultilevel"/>
-    <w:tmpl w:val="F9FE511E"/>
-    <w:lvl w:ilvl="0" w:tplc="7EDEA9FC" w:tentative="1">
-      <w:start w:val="1"/>
-      <w:numFmt w:val="decimal"/>
-      <w:lvlText w:val="%1."/>
-      <w:lvlJc w:val="left"/>
-      <w:pPr>
-        <w:ind w:left="540" w:hanging="300"/>
-      </w:pPr>
-    </w:lvl>
-    <w:lvl w:ilvl="1" w:tplc="9F06362E">
-      <w:numFmt w:val="decimal"/>
-      <w:lvlText w:val=""/>
-      <w:lvlJc w:val="left"/>
-    </w:lvl>
-    <w:lvl w:ilvl="2" w:tplc="EF04F0FE">
-      <w:numFmt w:val="decimal"/>
-      <w:lvlText w:val=""/>
-      <w:lvlJc w:val="left"/>
-    </w:lvl>
-    <w:lvl w:ilvl="3" w:tplc="079439F8">
-      <w:numFmt w:val="decimal"/>
-      <w:lvlText w:val=""/>
-      <w:lvlJc w:val="left"/>
-    </w:lvl>
-    <w:lvl w:ilvl="4" w:tplc="67A46F62">
-      <w:numFmt w:val="decimal"/>
-      <w:lvlText w:val=""/>
-      <w:lvlJc w:val="left"/>
-    </w:lvl>
-    <w:lvl w:ilvl="5" w:tplc="5E32F83A">
-      <w:numFmt w:val="decimal"/>
-      <w:lvlText w:val=""/>
-      <w:lvlJc w:val="left"/>
-    </w:lvl>
-    <w:lvl w:ilvl="6" w:tplc="60029BC8">
-      <w:numFmt w:val="decimal"/>
-      <w:lvlText w:val=""/>
-      <w:lvlJc w:val="left"/>
-    </w:lvl>
-    <w:lvl w:ilvl="7" w:tplc="B6EE3D88">
-      <w:numFmt w:val="decimal"/>
-      <w:lvlText w:val=""/>
-      <w:lvlJc w:val="left"/>
-    </w:lvl>
-    <w:lvl w:ilvl="8" w:tplc="0C4619FA">
-      <w:numFmt w:val="decimal"/>
-      <w:lvlText w:val=""/>
-      <w:lvlJc w:val="left"/>
-    </w:lvl>
-  </w:abstractNum>
-  <w:abstractNum w:abstractNumId="8" w15:restartNumberingAfterBreak="0">
-    <w:nsid w:val="28062EEC"/>
-    <w:multiLevelType w:val="hybridMultilevel"/>
-    <w:tmpl w:val="7B7A5F60"/>
-    <w:lvl w:ilvl="0" w:tplc="390E2FE4" w:tentative="1">
+    <w:tmpl w:val="52A26D96"/>
+    <w:lvl w:ilvl="0" w:tplc="9D0203DA" w:tentative="1">
       <w:start w:val="1"/>
       <w:numFmt w:val="bullet"/>
       <w:lvlText w:val="●"/>
@@ -29843,7 +29432,7 @@
         <w:ind w:left="720" w:hanging="360"/>
       </w:pPr>
     </w:lvl>
-    <w:lvl w:ilvl="1" w:tplc="85326F40" w:tentative="1">
+    <w:lvl w:ilvl="1" w:tplc="1BA63052" w:tentative="1">
       <w:start w:val="1"/>
       <w:numFmt w:val="bullet"/>
       <w:lvlText w:val="○"/>
@@ -29852,7 +29441,7 @@
         <w:ind w:left="1440" w:hanging="360"/>
       </w:pPr>
     </w:lvl>
-    <w:lvl w:ilvl="2" w:tplc="82789FB8" w:tentative="1">
+    <w:lvl w:ilvl="2" w:tplc="19FE8672" w:tentative="1">
       <w:start w:val="1"/>
       <w:numFmt w:val="bullet"/>
       <w:lvlText w:val="■"/>
@@ -29861,7 +29450,7 @@
         <w:ind w:left="2160" w:hanging="360"/>
       </w:pPr>
     </w:lvl>
-    <w:lvl w:ilvl="3" w:tplc="D250F064" w:tentative="1">
+    <w:lvl w:ilvl="3" w:tplc="63647B6E" w:tentative="1">
       <w:start w:val="1"/>
       <w:numFmt w:val="bullet"/>
       <w:lvlText w:val="●"/>
@@ -29870,7 +29459,7 @@
         <w:ind w:left="2880" w:hanging="360"/>
       </w:pPr>
     </w:lvl>
-    <w:lvl w:ilvl="4" w:tplc="ADAE62C2" w:tentative="1">
+    <w:lvl w:ilvl="4" w:tplc="AA4CA22C" w:tentative="1">
       <w:start w:val="1"/>
       <w:numFmt w:val="bullet"/>
       <w:lvlText w:val="○"/>
@@ -29879,7 +29468,7 @@
         <w:ind w:left="3600" w:hanging="360"/>
       </w:pPr>
     </w:lvl>
-    <w:lvl w:ilvl="5" w:tplc="38FEF92A" w:tentative="1">
+    <w:lvl w:ilvl="5" w:tplc="020CE984" w:tentative="1">
       <w:start w:val="1"/>
       <w:numFmt w:val="bullet"/>
       <w:lvlText w:val="■"/>
@@ -29888,7 +29477,7 @@
         <w:ind w:left="4320" w:hanging="360"/>
       </w:pPr>
     </w:lvl>
-    <w:lvl w:ilvl="6" w:tplc="53485F54" w:tentative="1">
+    <w:lvl w:ilvl="6" w:tplc="FA5E8490" w:tentative="1">
       <w:start w:val="1"/>
       <w:numFmt w:val="bullet"/>
       <w:lvlText w:val="●"/>
@@ -29897,7 +29486,7 @@
         <w:ind w:left="5040" w:hanging="360"/>
       </w:pPr>
     </w:lvl>
-    <w:lvl w:ilvl="7" w:tplc="9B78C8A8" w:tentative="1">
+    <w:lvl w:ilvl="7" w:tplc="F8882FB4" w:tentative="1">
       <w:start w:val="1"/>
       <w:numFmt w:val="bullet"/>
       <w:lvlText w:val="●"/>
@@ -29906,7 +29495,7 @@
         <w:ind w:left="5760" w:hanging="360"/>
       </w:pPr>
     </w:lvl>
-    <w:lvl w:ilvl="8" w:tplc="78DE72C0" w:tentative="1">
+    <w:lvl w:ilvl="8" w:tplc="6CAC801C" w:tentative="1">
       <w:start w:val="1"/>
       <w:numFmt w:val="bullet"/>
       <w:lvlText w:val="●"/>
@@ -29916,11 +29505,11 @@
       </w:pPr>
     </w:lvl>
   </w:abstractNum>
-  <w:abstractNum w:abstractNumId="9" w15:restartNumberingAfterBreak="0">
-    <w:nsid w:val="2F9C2D79"/>
+  <w:abstractNum w:abstractNumId="1" w15:restartNumberingAfterBreak="0">
+    <w:nsid w:val="0D216751"/>
     <w:multiLevelType w:val="hybridMultilevel"/>
-    <w:tmpl w:val="4F4EDF28"/>
-    <w:lvl w:ilvl="0" w:tplc="82520890" w:tentative="1">
+    <w:tmpl w:val="CF34A25A"/>
+    <w:lvl w:ilvl="0" w:tplc="F83E2B38">
       <w:start w:val="1"/>
       <w:numFmt w:val="decimal"/>
       <w:lvlText w:val="%1."/>
@@ -29929,52 +29518,52 @@
         <w:ind w:left="540" w:hanging="300"/>
       </w:pPr>
     </w:lvl>
-    <w:lvl w:ilvl="1" w:tplc="CB94AAF2">
+    <w:lvl w:ilvl="1" w:tplc="82709A30">
       <w:numFmt w:val="decimal"/>
       <w:lvlText w:val=""/>
       <w:lvlJc w:val="left"/>
     </w:lvl>
-    <w:lvl w:ilvl="2" w:tplc="9B9418A4">
+    <w:lvl w:ilvl="2" w:tplc="C894929A">
       <w:numFmt w:val="decimal"/>
       <w:lvlText w:val=""/>
       <w:lvlJc w:val="left"/>
     </w:lvl>
-    <w:lvl w:ilvl="3" w:tplc="C0DC6CA4">
+    <w:lvl w:ilvl="3" w:tplc="8E62D4B6">
       <w:numFmt w:val="decimal"/>
       <w:lvlText w:val=""/>
       <w:lvlJc w:val="left"/>
     </w:lvl>
-    <w:lvl w:ilvl="4" w:tplc="66C05480">
+    <w:lvl w:ilvl="4" w:tplc="D4DEF71C">
       <w:numFmt w:val="decimal"/>
       <w:lvlText w:val=""/>
       <w:lvlJc w:val="left"/>
     </w:lvl>
-    <w:lvl w:ilvl="5" w:tplc="274283D6">
+    <w:lvl w:ilvl="5" w:tplc="6FAEEF8E">
       <w:numFmt w:val="decimal"/>
       <w:lvlText w:val=""/>
       <w:lvlJc w:val="left"/>
     </w:lvl>
-    <w:lvl w:ilvl="6" w:tplc="1F9032BE">
+    <w:lvl w:ilvl="6" w:tplc="C43E03E4">
       <w:numFmt w:val="decimal"/>
       <w:lvlText w:val=""/>
       <w:lvlJc w:val="left"/>
     </w:lvl>
-    <w:lvl w:ilvl="7" w:tplc="FFB21A8E">
+    <w:lvl w:ilvl="7" w:tplc="B21EC6F8">
       <w:numFmt w:val="decimal"/>
       <w:lvlText w:val=""/>
       <w:lvlJc w:val="left"/>
     </w:lvl>
-    <w:lvl w:ilvl="8" w:tplc="21B21232">
+    <w:lvl w:ilvl="8" w:tplc="CF86CA50">
       <w:numFmt w:val="decimal"/>
       <w:lvlText w:val=""/>
       <w:lvlJc w:val="left"/>
     </w:lvl>
   </w:abstractNum>
-  <w:abstractNum w:abstractNumId="10" w15:restartNumberingAfterBreak="0">
-    <w:nsid w:val="30D47C98"/>
+  <w:abstractNum w:abstractNumId="2" w15:restartNumberingAfterBreak="0">
+    <w:nsid w:val="0E463B9B"/>
     <w:multiLevelType w:val="hybridMultilevel"/>
-    <w:tmpl w:val="44689F00"/>
-    <w:lvl w:ilvl="0" w:tplc="53A2C578" w:tentative="1">
+    <w:tmpl w:val="D564D9E8"/>
+    <w:lvl w:ilvl="0" w:tplc="4AD8B09E" w:tentative="1">
       <w:start w:val="1"/>
       <w:numFmt w:val="decimal"/>
       <w:lvlText w:val="%1."/>
@@ -29983,52 +29572,52 @@
         <w:ind w:left="540" w:hanging="300"/>
       </w:pPr>
     </w:lvl>
-    <w:lvl w:ilvl="1" w:tplc="1AEE6E08">
+    <w:lvl w:ilvl="1" w:tplc="5256FF4A">
       <w:numFmt w:val="decimal"/>
       <w:lvlText w:val=""/>
       <w:lvlJc w:val="left"/>
     </w:lvl>
-    <w:lvl w:ilvl="2" w:tplc="83BC5476">
+    <w:lvl w:ilvl="2" w:tplc="7C0094CA">
       <w:numFmt w:val="decimal"/>
       <w:lvlText w:val=""/>
       <w:lvlJc w:val="left"/>
     </w:lvl>
-    <w:lvl w:ilvl="3" w:tplc="CB921E82">
+    <w:lvl w:ilvl="3" w:tplc="6CC403EC">
       <w:numFmt w:val="decimal"/>
       <w:lvlText w:val=""/>
       <w:lvlJc w:val="left"/>
     </w:lvl>
-    <w:lvl w:ilvl="4" w:tplc="C3483592">
+    <w:lvl w:ilvl="4" w:tplc="BC800FDE">
       <w:numFmt w:val="decimal"/>
       <w:lvlText w:val=""/>
       <w:lvlJc w:val="left"/>
     </w:lvl>
-    <w:lvl w:ilvl="5" w:tplc="B1A0FA9A">
+    <w:lvl w:ilvl="5" w:tplc="0A165FCE">
       <w:numFmt w:val="decimal"/>
       <w:lvlText w:val=""/>
       <w:lvlJc w:val="left"/>
     </w:lvl>
-    <w:lvl w:ilvl="6" w:tplc="71BE021C">
+    <w:lvl w:ilvl="6" w:tplc="D7F4692E">
       <w:numFmt w:val="decimal"/>
       <w:lvlText w:val=""/>
       <w:lvlJc w:val="left"/>
     </w:lvl>
-    <w:lvl w:ilvl="7" w:tplc="3344021A">
+    <w:lvl w:ilvl="7" w:tplc="A08207AC">
       <w:numFmt w:val="decimal"/>
       <w:lvlText w:val=""/>
       <w:lvlJc w:val="left"/>
     </w:lvl>
-    <w:lvl w:ilvl="8" w:tplc="E8104BE4">
+    <w:lvl w:ilvl="8" w:tplc="C0D64EEC">
       <w:numFmt w:val="decimal"/>
       <w:lvlText w:val=""/>
       <w:lvlJc w:val="left"/>
     </w:lvl>
   </w:abstractNum>
-  <w:abstractNum w:abstractNumId="11" w15:restartNumberingAfterBreak="0">
-    <w:nsid w:val="31EB4F51"/>
+  <w:abstractNum w:abstractNumId="3" w15:restartNumberingAfterBreak="0">
+    <w:nsid w:val="0EA04704"/>
     <w:multiLevelType w:val="hybridMultilevel"/>
-    <w:tmpl w:val="19B21A80"/>
-    <w:lvl w:ilvl="0" w:tplc="1C345508" w:tentative="1">
+    <w:tmpl w:val="5240CCCA"/>
+    <w:lvl w:ilvl="0" w:tplc="F20C6A78" w:tentative="1">
       <w:start w:val="1"/>
       <w:numFmt w:val="decimal"/>
       <w:lvlText w:val="%1."/>
@@ -30037,52 +29626,52 @@
         <w:ind w:left="540" w:hanging="300"/>
       </w:pPr>
     </w:lvl>
-    <w:lvl w:ilvl="1" w:tplc="7F508AEC">
+    <w:lvl w:ilvl="1" w:tplc="0384575C">
       <w:numFmt w:val="decimal"/>
       <w:lvlText w:val=""/>
       <w:lvlJc w:val="left"/>
     </w:lvl>
-    <w:lvl w:ilvl="2" w:tplc="E2B4CC72">
+    <w:lvl w:ilvl="2" w:tplc="F0FC8B1E">
       <w:numFmt w:val="decimal"/>
       <w:lvlText w:val=""/>
       <w:lvlJc w:val="left"/>
     </w:lvl>
-    <w:lvl w:ilvl="3" w:tplc="E6281962">
+    <w:lvl w:ilvl="3" w:tplc="8DC06116">
       <w:numFmt w:val="decimal"/>
       <w:lvlText w:val=""/>
       <w:lvlJc w:val="left"/>
     </w:lvl>
-    <w:lvl w:ilvl="4" w:tplc="0FFA378A">
+    <w:lvl w:ilvl="4" w:tplc="DC84360A">
       <w:numFmt w:val="decimal"/>
       <w:lvlText w:val=""/>
       <w:lvlJc w:val="left"/>
     </w:lvl>
-    <w:lvl w:ilvl="5" w:tplc="14A69BCC">
+    <w:lvl w:ilvl="5" w:tplc="7E52928E">
       <w:numFmt w:val="decimal"/>
       <w:lvlText w:val=""/>
       <w:lvlJc w:val="left"/>
     </w:lvl>
-    <w:lvl w:ilvl="6" w:tplc="51A8FD90">
+    <w:lvl w:ilvl="6" w:tplc="D376CC80">
       <w:numFmt w:val="decimal"/>
       <w:lvlText w:val=""/>
       <w:lvlJc w:val="left"/>
     </w:lvl>
-    <w:lvl w:ilvl="7" w:tplc="20560FA2">
+    <w:lvl w:ilvl="7" w:tplc="CBFABE12">
       <w:numFmt w:val="decimal"/>
       <w:lvlText w:val=""/>
       <w:lvlJc w:val="left"/>
     </w:lvl>
-    <w:lvl w:ilvl="8" w:tplc="1DA0C9E2">
+    <w:lvl w:ilvl="8" w:tplc="5720ED04">
       <w:numFmt w:val="decimal"/>
       <w:lvlText w:val=""/>
       <w:lvlJc w:val="left"/>
     </w:lvl>
   </w:abstractNum>
-  <w:abstractNum w:abstractNumId="12" w15:restartNumberingAfterBreak="0">
-    <w:nsid w:val="375E5FFF"/>
+  <w:abstractNum w:abstractNumId="4" w15:restartNumberingAfterBreak="0">
+    <w:nsid w:val="160B692A"/>
     <w:multiLevelType w:val="hybridMultilevel"/>
-    <w:tmpl w:val="14CE9256"/>
-    <w:lvl w:ilvl="0" w:tplc="72BE612A" w:tentative="1">
+    <w:tmpl w:val="80AA9CD8"/>
+    <w:lvl w:ilvl="0" w:tplc="B3B23782" w:tentative="1">
       <w:start w:val="1"/>
       <w:numFmt w:val="decimal"/>
       <w:lvlText w:val="%1."/>
@@ -30091,52 +29680,52 @@
         <w:ind w:left="540" w:hanging="300"/>
       </w:pPr>
     </w:lvl>
-    <w:lvl w:ilvl="1" w:tplc="24262F52">
+    <w:lvl w:ilvl="1" w:tplc="C6F2B578">
       <w:numFmt w:val="decimal"/>
       <w:lvlText w:val=""/>
       <w:lvlJc w:val="left"/>
     </w:lvl>
-    <w:lvl w:ilvl="2" w:tplc="D3329F9E">
+    <w:lvl w:ilvl="2" w:tplc="3814BFF4">
       <w:numFmt w:val="decimal"/>
       <w:lvlText w:val=""/>
       <w:lvlJc w:val="left"/>
     </w:lvl>
-    <w:lvl w:ilvl="3" w:tplc="1C16D344">
+    <w:lvl w:ilvl="3" w:tplc="82C4025C">
       <w:numFmt w:val="decimal"/>
       <w:lvlText w:val=""/>
       <w:lvlJc w:val="left"/>
     </w:lvl>
-    <w:lvl w:ilvl="4" w:tplc="8FEAA586">
+    <w:lvl w:ilvl="4" w:tplc="F2E029C8">
       <w:numFmt w:val="decimal"/>
       <w:lvlText w:val=""/>
       <w:lvlJc w:val="left"/>
     </w:lvl>
-    <w:lvl w:ilvl="5" w:tplc="8FD2DBE6">
+    <w:lvl w:ilvl="5" w:tplc="6A0EF6C0">
       <w:numFmt w:val="decimal"/>
       <w:lvlText w:val=""/>
       <w:lvlJc w:val="left"/>
     </w:lvl>
-    <w:lvl w:ilvl="6" w:tplc="941C85C4">
+    <w:lvl w:ilvl="6" w:tplc="DA3CB3B4">
       <w:numFmt w:val="decimal"/>
       <w:lvlText w:val=""/>
       <w:lvlJc w:val="left"/>
     </w:lvl>
-    <w:lvl w:ilvl="7" w:tplc="2DEE7132">
+    <w:lvl w:ilvl="7" w:tplc="AFD6369A">
       <w:numFmt w:val="decimal"/>
       <w:lvlText w:val=""/>
       <w:lvlJc w:val="left"/>
     </w:lvl>
-    <w:lvl w:ilvl="8" w:tplc="12AE0A74">
+    <w:lvl w:ilvl="8" w:tplc="05EC9E6E">
       <w:numFmt w:val="decimal"/>
       <w:lvlText w:val=""/>
       <w:lvlJc w:val="left"/>
     </w:lvl>
   </w:abstractNum>
-  <w:abstractNum w:abstractNumId="13" w15:restartNumberingAfterBreak="0">
-    <w:nsid w:val="3A336A63"/>
+  <w:abstractNum w:abstractNumId="5" w15:restartNumberingAfterBreak="0">
+    <w:nsid w:val="1E4A3FF8"/>
     <w:multiLevelType w:val="hybridMultilevel"/>
-    <w:tmpl w:val="61AC62A4"/>
-    <w:lvl w:ilvl="0" w:tplc="C0AE8910" w:tentative="1">
+    <w:tmpl w:val="AED21EB8"/>
+    <w:lvl w:ilvl="0" w:tplc="CC463C9E" w:tentative="1">
       <w:start w:val="1"/>
       <w:numFmt w:val="decimal"/>
       <w:lvlText w:val="%1."/>
@@ -30145,52 +29734,52 @@
         <w:ind w:left="540" w:hanging="300"/>
       </w:pPr>
     </w:lvl>
-    <w:lvl w:ilvl="1" w:tplc="C9AED6E8">
+    <w:lvl w:ilvl="1" w:tplc="0788271A">
       <w:numFmt w:val="decimal"/>
       <w:lvlText w:val=""/>
       <w:lvlJc w:val="left"/>
     </w:lvl>
-    <w:lvl w:ilvl="2" w:tplc="30AA3B16">
+    <w:lvl w:ilvl="2" w:tplc="9C68C822">
       <w:numFmt w:val="decimal"/>
       <w:lvlText w:val=""/>
       <w:lvlJc w:val="left"/>
     </w:lvl>
-    <w:lvl w:ilvl="3" w:tplc="3A16B106">
+    <w:lvl w:ilvl="3" w:tplc="42B69A8A">
       <w:numFmt w:val="decimal"/>
       <w:lvlText w:val=""/>
       <w:lvlJc w:val="left"/>
     </w:lvl>
-    <w:lvl w:ilvl="4" w:tplc="BEA4490A">
+    <w:lvl w:ilvl="4" w:tplc="2174BD04">
       <w:numFmt w:val="decimal"/>
       <w:lvlText w:val=""/>
       <w:lvlJc w:val="left"/>
     </w:lvl>
-    <w:lvl w:ilvl="5" w:tplc="639E2D80">
+    <w:lvl w:ilvl="5" w:tplc="D564DEC8">
       <w:numFmt w:val="decimal"/>
       <w:lvlText w:val=""/>
       <w:lvlJc w:val="left"/>
     </w:lvl>
-    <w:lvl w:ilvl="6" w:tplc="CFCC4656">
+    <w:lvl w:ilvl="6" w:tplc="24926BC6">
       <w:numFmt w:val="decimal"/>
       <w:lvlText w:val=""/>
       <w:lvlJc w:val="left"/>
     </w:lvl>
-    <w:lvl w:ilvl="7" w:tplc="AA3A01F2">
+    <w:lvl w:ilvl="7" w:tplc="2222BD1A">
       <w:numFmt w:val="decimal"/>
       <w:lvlText w:val=""/>
       <w:lvlJc w:val="left"/>
     </w:lvl>
-    <w:lvl w:ilvl="8" w:tplc="E4308E86">
+    <w:lvl w:ilvl="8" w:tplc="2E38AAF8">
       <w:numFmt w:val="decimal"/>
       <w:lvlText w:val=""/>
       <w:lvlJc w:val="left"/>
     </w:lvl>
   </w:abstractNum>
-  <w:abstractNum w:abstractNumId="14" w15:restartNumberingAfterBreak="0">
-    <w:nsid w:val="3DF65A12"/>
+  <w:abstractNum w:abstractNumId="6" w15:restartNumberingAfterBreak="0">
+    <w:nsid w:val="1FD43E3C"/>
     <w:multiLevelType w:val="hybridMultilevel"/>
-    <w:tmpl w:val="4046266E"/>
-    <w:lvl w:ilvl="0" w:tplc="915018F4" w:tentative="1">
+    <w:tmpl w:val="807A6CBE"/>
+    <w:lvl w:ilvl="0" w:tplc="3D74DC8C" w:tentative="1">
       <w:start w:val="1"/>
       <w:numFmt w:val="decimal"/>
       <w:lvlText w:val="%1."/>
@@ -30199,52 +29788,52 @@
         <w:ind w:left="540" w:hanging="300"/>
       </w:pPr>
     </w:lvl>
-    <w:lvl w:ilvl="1" w:tplc="BF00E84A">
+    <w:lvl w:ilvl="1" w:tplc="669A8FDC">
       <w:numFmt w:val="decimal"/>
       <w:lvlText w:val=""/>
       <w:lvlJc w:val="left"/>
     </w:lvl>
-    <w:lvl w:ilvl="2" w:tplc="1CC4FA70">
+    <w:lvl w:ilvl="2" w:tplc="8A8E1118">
       <w:numFmt w:val="decimal"/>
       <w:lvlText w:val=""/>
       <w:lvlJc w:val="left"/>
     </w:lvl>
-    <w:lvl w:ilvl="3" w:tplc="461AEAFA">
+    <w:lvl w:ilvl="3" w:tplc="30E886D0">
       <w:numFmt w:val="decimal"/>
       <w:lvlText w:val=""/>
       <w:lvlJc w:val="left"/>
     </w:lvl>
-    <w:lvl w:ilvl="4" w:tplc="FBB6F7C2">
+    <w:lvl w:ilvl="4" w:tplc="5950EC96">
       <w:numFmt w:val="decimal"/>
       <w:lvlText w:val=""/>
       <w:lvlJc w:val="left"/>
     </w:lvl>
-    <w:lvl w:ilvl="5" w:tplc="86A83E44">
+    <w:lvl w:ilvl="5" w:tplc="CE16C950">
       <w:numFmt w:val="decimal"/>
       <w:lvlText w:val=""/>
       <w:lvlJc w:val="left"/>
     </w:lvl>
-    <w:lvl w:ilvl="6" w:tplc="2DE4E5F0">
+    <w:lvl w:ilvl="6" w:tplc="84901FD8">
       <w:numFmt w:val="decimal"/>
       <w:lvlText w:val=""/>
       <w:lvlJc w:val="left"/>
     </w:lvl>
-    <w:lvl w:ilvl="7" w:tplc="CFE2CF6E">
+    <w:lvl w:ilvl="7" w:tplc="2732ED60">
       <w:numFmt w:val="decimal"/>
       <w:lvlText w:val=""/>
       <w:lvlJc w:val="left"/>
     </w:lvl>
-    <w:lvl w:ilvl="8" w:tplc="5468970E">
+    <w:lvl w:ilvl="8" w:tplc="3E1286B6">
       <w:numFmt w:val="decimal"/>
       <w:lvlText w:val=""/>
       <w:lvlJc w:val="left"/>
     </w:lvl>
   </w:abstractNum>
-  <w:abstractNum w:abstractNumId="15" w15:restartNumberingAfterBreak="0">
-    <w:nsid w:val="41080B92"/>
+  <w:abstractNum w:abstractNumId="7" w15:restartNumberingAfterBreak="0">
+    <w:nsid w:val="20447B5E"/>
     <w:multiLevelType w:val="hybridMultilevel"/>
-    <w:tmpl w:val="2F343064"/>
-    <w:lvl w:ilvl="0" w:tplc="C3BC85C6" w:tentative="1">
+    <w:tmpl w:val="3F7AAA5C"/>
+    <w:lvl w:ilvl="0" w:tplc="390846D4" w:tentative="1">
       <w:start w:val="1"/>
       <w:numFmt w:val="decimal"/>
       <w:lvlText w:val="%1."/>
@@ -30253,52 +29842,52 @@
         <w:ind w:left="540" w:hanging="300"/>
       </w:pPr>
     </w:lvl>
-    <w:lvl w:ilvl="1" w:tplc="91224B4A">
+    <w:lvl w:ilvl="1" w:tplc="CA7A47C4">
       <w:numFmt w:val="decimal"/>
       <w:lvlText w:val=""/>
       <w:lvlJc w:val="left"/>
     </w:lvl>
-    <w:lvl w:ilvl="2" w:tplc="E84AF234">
+    <w:lvl w:ilvl="2" w:tplc="9E661EB0">
       <w:numFmt w:val="decimal"/>
       <w:lvlText w:val=""/>
       <w:lvlJc w:val="left"/>
     </w:lvl>
-    <w:lvl w:ilvl="3" w:tplc="6820F780">
+    <w:lvl w:ilvl="3" w:tplc="B442C0B6">
       <w:numFmt w:val="decimal"/>
       <w:lvlText w:val=""/>
       <w:lvlJc w:val="left"/>
     </w:lvl>
-    <w:lvl w:ilvl="4" w:tplc="AAF27EE2">
+    <w:lvl w:ilvl="4" w:tplc="9A507080">
       <w:numFmt w:val="decimal"/>
       <w:lvlText w:val=""/>
       <w:lvlJc w:val="left"/>
     </w:lvl>
-    <w:lvl w:ilvl="5" w:tplc="1DD85ABC">
+    <w:lvl w:ilvl="5" w:tplc="6D3E6DB4">
       <w:numFmt w:val="decimal"/>
       <w:lvlText w:val=""/>
       <w:lvlJc w:val="left"/>
     </w:lvl>
-    <w:lvl w:ilvl="6" w:tplc="49ACC290">
+    <w:lvl w:ilvl="6" w:tplc="EB48DF42">
       <w:numFmt w:val="decimal"/>
       <w:lvlText w:val=""/>
       <w:lvlJc w:val="left"/>
     </w:lvl>
-    <w:lvl w:ilvl="7" w:tplc="B4BAC518">
+    <w:lvl w:ilvl="7" w:tplc="903E2256">
       <w:numFmt w:val="decimal"/>
       <w:lvlText w:val=""/>
       <w:lvlJc w:val="left"/>
     </w:lvl>
-    <w:lvl w:ilvl="8" w:tplc="DD0CD48C">
+    <w:lvl w:ilvl="8" w:tplc="C9E02AEE">
       <w:numFmt w:val="decimal"/>
       <w:lvlText w:val=""/>
       <w:lvlJc w:val="left"/>
     </w:lvl>
   </w:abstractNum>
-  <w:abstractNum w:abstractNumId="16" w15:restartNumberingAfterBreak="0">
-    <w:nsid w:val="4D1B4E6D"/>
+  <w:abstractNum w:abstractNumId="8" w15:restartNumberingAfterBreak="0">
+    <w:nsid w:val="210863A8"/>
     <w:multiLevelType w:val="hybridMultilevel"/>
-    <w:tmpl w:val="ED72CCD2"/>
-    <w:lvl w:ilvl="0" w:tplc="429CAF18" w:tentative="1">
+    <w:tmpl w:val="C8A2A8D6"/>
+    <w:lvl w:ilvl="0" w:tplc="B6288ECC" w:tentative="1">
       <w:start w:val="1"/>
       <w:numFmt w:val="decimal"/>
       <w:lvlText w:val="%1."/>
@@ -30307,52 +29896,160 @@
         <w:ind w:left="540" w:hanging="300"/>
       </w:pPr>
     </w:lvl>
-    <w:lvl w:ilvl="1" w:tplc="B380E378">
+    <w:lvl w:ilvl="1" w:tplc="BE14A058">
       <w:numFmt w:val="decimal"/>
       <w:lvlText w:val=""/>
       <w:lvlJc w:val="left"/>
     </w:lvl>
-    <w:lvl w:ilvl="2" w:tplc="FFC85E58">
+    <w:lvl w:ilvl="2" w:tplc="D4EA8C4A">
       <w:numFmt w:val="decimal"/>
       <w:lvlText w:val=""/>
       <w:lvlJc w:val="left"/>
     </w:lvl>
-    <w:lvl w:ilvl="3" w:tplc="DB248DCE">
+    <w:lvl w:ilvl="3" w:tplc="9E1C2E1A">
       <w:numFmt w:val="decimal"/>
       <w:lvlText w:val=""/>
       <w:lvlJc w:val="left"/>
     </w:lvl>
-    <w:lvl w:ilvl="4" w:tplc="8D14C884">
+    <w:lvl w:ilvl="4" w:tplc="E1AE61B4">
       <w:numFmt w:val="decimal"/>
       <w:lvlText w:val=""/>
       <w:lvlJc w:val="left"/>
     </w:lvl>
-    <w:lvl w:ilvl="5" w:tplc="F9BADEB8">
+    <w:lvl w:ilvl="5" w:tplc="B95449D6">
       <w:numFmt w:val="decimal"/>
       <w:lvlText w:val=""/>
       <w:lvlJc w:val="left"/>
     </w:lvl>
-    <w:lvl w:ilvl="6" w:tplc="C070039A">
+    <w:lvl w:ilvl="6" w:tplc="1F4285FA">
       <w:numFmt w:val="decimal"/>
       <w:lvlText w:val=""/>
       <w:lvlJc w:val="left"/>
     </w:lvl>
-    <w:lvl w:ilvl="7" w:tplc="975C19C2">
+    <w:lvl w:ilvl="7" w:tplc="578AB00C">
       <w:numFmt w:val="decimal"/>
       <w:lvlText w:val=""/>
       <w:lvlJc w:val="left"/>
     </w:lvl>
-    <w:lvl w:ilvl="8" w:tplc="92F66DB0">
+    <w:lvl w:ilvl="8" w:tplc="5BC038EC">
       <w:numFmt w:val="decimal"/>
       <w:lvlText w:val=""/>
       <w:lvlJc w:val="left"/>
     </w:lvl>
   </w:abstractNum>
-  <w:abstractNum w:abstractNumId="17" w15:restartNumberingAfterBreak="0">
-    <w:nsid w:val="5935024B"/>
+  <w:abstractNum w:abstractNumId="9" w15:restartNumberingAfterBreak="0">
+    <w:nsid w:val="23436C34"/>
     <w:multiLevelType w:val="hybridMultilevel"/>
-    <w:tmpl w:val="7146EF20"/>
-    <w:lvl w:ilvl="0" w:tplc="381E63BE">
+    <w:tmpl w:val="98021262"/>
+    <w:lvl w:ilvl="0" w:tplc="BC76B00C" w:tentative="1">
+      <w:start w:val="1"/>
+      <w:numFmt w:val="decimal"/>
+      <w:lvlText w:val="%1."/>
+      <w:lvlJc w:val="left"/>
+      <w:pPr>
+        <w:ind w:left="540" w:hanging="300"/>
+      </w:pPr>
+    </w:lvl>
+    <w:lvl w:ilvl="1" w:tplc="63A062DC">
+      <w:numFmt w:val="decimal"/>
+      <w:lvlText w:val=""/>
+      <w:lvlJc w:val="left"/>
+    </w:lvl>
+    <w:lvl w:ilvl="2" w:tplc="F65E2102">
+      <w:numFmt w:val="decimal"/>
+      <w:lvlText w:val=""/>
+      <w:lvlJc w:val="left"/>
+    </w:lvl>
+    <w:lvl w:ilvl="3" w:tplc="A346476E">
+      <w:numFmt w:val="decimal"/>
+      <w:lvlText w:val=""/>
+      <w:lvlJc w:val="left"/>
+    </w:lvl>
+    <w:lvl w:ilvl="4" w:tplc="9E386E46">
+      <w:numFmt w:val="decimal"/>
+      <w:lvlText w:val=""/>
+      <w:lvlJc w:val="left"/>
+    </w:lvl>
+    <w:lvl w:ilvl="5" w:tplc="D144DE06">
+      <w:numFmt w:val="decimal"/>
+      <w:lvlText w:val=""/>
+      <w:lvlJc w:val="left"/>
+    </w:lvl>
+    <w:lvl w:ilvl="6" w:tplc="292E4216">
+      <w:numFmt w:val="decimal"/>
+      <w:lvlText w:val=""/>
+      <w:lvlJc w:val="left"/>
+    </w:lvl>
+    <w:lvl w:ilvl="7" w:tplc="CBB6BDE6">
+      <w:numFmt w:val="decimal"/>
+      <w:lvlText w:val=""/>
+      <w:lvlJc w:val="left"/>
+    </w:lvl>
+    <w:lvl w:ilvl="8" w:tplc="B12A22FC">
+      <w:numFmt w:val="decimal"/>
+      <w:lvlText w:val=""/>
+      <w:lvlJc w:val="left"/>
+    </w:lvl>
+  </w:abstractNum>
+  <w:abstractNum w:abstractNumId="10" w15:restartNumberingAfterBreak="0">
+    <w:nsid w:val="25601078"/>
+    <w:multiLevelType w:val="hybridMultilevel"/>
+    <w:tmpl w:val="DC622074"/>
+    <w:lvl w:ilvl="0" w:tplc="48FEADF4" w:tentative="1">
+      <w:start w:val="1"/>
+      <w:numFmt w:val="decimal"/>
+      <w:lvlText w:val="%1."/>
+      <w:lvlJc w:val="left"/>
+      <w:pPr>
+        <w:ind w:left="540" w:hanging="300"/>
+      </w:pPr>
+    </w:lvl>
+    <w:lvl w:ilvl="1" w:tplc="F7DA177E">
+      <w:numFmt w:val="decimal"/>
+      <w:lvlText w:val=""/>
+      <w:lvlJc w:val="left"/>
+    </w:lvl>
+    <w:lvl w:ilvl="2" w:tplc="8B24518E">
+      <w:numFmt w:val="decimal"/>
+      <w:lvlText w:val=""/>
+      <w:lvlJc w:val="left"/>
+    </w:lvl>
+    <w:lvl w:ilvl="3" w:tplc="0B5896CE">
+      <w:numFmt w:val="decimal"/>
+      <w:lvlText w:val=""/>
+      <w:lvlJc w:val="left"/>
+    </w:lvl>
+    <w:lvl w:ilvl="4" w:tplc="0C6CECF6">
+      <w:numFmt w:val="decimal"/>
+      <w:lvlText w:val=""/>
+      <w:lvlJc w:val="left"/>
+    </w:lvl>
+    <w:lvl w:ilvl="5" w:tplc="618EE08E">
+      <w:numFmt w:val="decimal"/>
+      <w:lvlText w:val=""/>
+      <w:lvlJc w:val="left"/>
+    </w:lvl>
+    <w:lvl w:ilvl="6" w:tplc="5A56FDEE">
+      <w:numFmt w:val="decimal"/>
+      <w:lvlText w:val=""/>
+      <w:lvlJc w:val="left"/>
+    </w:lvl>
+    <w:lvl w:ilvl="7" w:tplc="43E4E174">
+      <w:numFmt w:val="decimal"/>
+      <w:lvlText w:val=""/>
+      <w:lvlJc w:val="left"/>
+    </w:lvl>
+    <w:lvl w:ilvl="8" w:tplc="AEF8DD7A">
+      <w:numFmt w:val="decimal"/>
+      <w:lvlText w:val=""/>
+      <w:lvlJc w:val="left"/>
+    </w:lvl>
+  </w:abstractNum>
+  <w:abstractNum w:abstractNumId="11" w15:restartNumberingAfterBreak="0">
+    <w:nsid w:val="281E31C1"/>
+    <w:multiLevelType w:val="hybridMultilevel"/>
+    <w:tmpl w:val="E828D6C2"/>
+    <w:lvl w:ilvl="0" w:tplc="8946AF7C">
       <w:start w:val="1"/>
       <w:numFmt w:val="bullet"/>
       <w:lvlText w:val="•"/>
@@ -30361,7 +30058,7 @@
         <w:ind w:left="540" w:hanging="270"/>
       </w:pPr>
     </w:lvl>
-    <w:lvl w:ilvl="1" w:tplc="09CE9E8E" w:tentative="1">
+    <w:lvl w:ilvl="1" w:tplc="BA4C9640" w:tentative="1">
       <w:start w:val="1"/>
       <w:numFmt w:val="bullet"/>
       <w:lvlText w:val="–"/>
@@ -30370,47 +30067,47 @@
         <w:ind w:left="1000" w:hanging="270"/>
       </w:pPr>
     </w:lvl>
-    <w:lvl w:ilvl="2" w:tplc="2E1AF996">
+    <w:lvl w:ilvl="2" w:tplc="A96E7E80">
       <w:numFmt w:val="decimal"/>
       <w:lvlText w:val=""/>
       <w:lvlJc w:val="left"/>
     </w:lvl>
-    <w:lvl w:ilvl="3" w:tplc="84149D4E">
+    <w:lvl w:ilvl="3" w:tplc="623E7564">
       <w:numFmt w:val="decimal"/>
       <w:lvlText w:val=""/>
       <w:lvlJc w:val="left"/>
     </w:lvl>
-    <w:lvl w:ilvl="4" w:tplc="4AE83EF0">
+    <w:lvl w:ilvl="4" w:tplc="E5DA8E30">
       <w:numFmt w:val="decimal"/>
       <w:lvlText w:val=""/>
       <w:lvlJc w:val="left"/>
     </w:lvl>
-    <w:lvl w:ilvl="5" w:tplc="DED4108A">
+    <w:lvl w:ilvl="5" w:tplc="2DA67E88">
       <w:numFmt w:val="decimal"/>
       <w:lvlText w:val=""/>
       <w:lvlJc w:val="left"/>
     </w:lvl>
-    <w:lvl w:ilvl="6" w:tplc="01AC9146">
+    <w:lvl w:ilvl="6" w:tplc="8B081CB2">
       <w:numFmt w:val="decimal"/>
       <w:lvlText w:val=""/>
       <w:lvlJc w:val="left"/>
     </w:lvl>
-    <w:lvl w:ilvl="7" w:tplc="9D7AF85A">
+    <w:lvl w:ilvl="7" w:tplc="4C5CC118">
       <w:numFmt w:val="decimal"/>
       <w:lvlText w:val=""/>
       <w:lvlJc w:val="left"/>
     </w:lvl>
-    <w:lvl w:ilvl="8" w:tplc="5AD8888E">
+    <w:lvl w:ilvl="8" w:tplc="60784F3E">
       <w:numFmt w:val="decimal"/>
       <w:lvlText w:val=""/>
       <w:lvlJc w:val="left"/>
     </w:lvl>
   </w:abstractNum>
-  <w:abstractNum w:abstractNumId="18" w15:restartNumberingAfterBreak="0">
-    <w:nsid w:val="6B3D45AF"/>
+  <w:abstractNum w:abstractNumId="12" w15:restartNumberingAfterBreak="0">
+    <w:nsid w:val="2DA0036F"/>
     <w:multiLevelType w:val="hybridMultilevel"/>
-    <w:tmpl w:val="0E705B4A"/>
-    <w:lvl w:ilvl="0" w:tplc="A62E9D84" w:tentative="1">
+    <w:tmpl w:val="F258B6EC"/>
+    <w:lvl w:ilvl="0" w:tplc="156E847E" w:tentative="1">
       <w:start w:val="1"/>
       <w:numFmt w:val="decimal"/>
       <w:lvlText w:val="%1."/>
@@ -30419,52 +30116,52 @@
         <w:ind w:left="540" w:hanging="300"/>
       </w:pPr>
     </w:lvl>
-    <w:lvl w:ilvl="1" w:tplc="4C14EDCC">
+    <w:lvl w:ilvl="1" w:tplc="598E021A">
       <w:numFmt w:val="decimal"/>
       <w:lvlText w:val=""/>
       <w:lvlJc w:val="left"/>
     </w:lvl>
-    <w:lvl w:ilvl="2" w:tplc="6BA65382">
+    <w:lvl w:ilvl="2" w:tplc="E6CA58D6">
       <w:numFmt w:val="decimal"/>
       <w:lvlText w:val=""/>
       <w:lvlJc w:val="left"/>
     </w:lvl>
-    <w:lvl w:ilvl="3" w:tplc="071282D0">
+    <w:lvl w:ilvl="3" w:tplc="6A805126">
       <w:numFmt w:val="decimal"/>
       <w:lvlText w:val=""/>
       <w:lvlJc w:val="left"/>
     </w:lvl>
-    <w:lvl w:ilvl="4" w:tplc="C34A6450">
+    <w:lvl w:ilvl="4" w:tplc="90DCDF10">
       <w:numFmt w:val="decimal"/>
       <w:lvlText w:val=""/>
       <w:lvlJc w:val="left"/>
     </w:lvl>
-    <w:lvl w:ilvl="5" w:tplc="B0C64B58">
+    <w:lvl w:ilvl="5" w:tplc="09B00140">
       <w:numFmt w:val="decimal"/>
       <w:lvlText w:val=""/>
       <w:lvlJc w:val="left"/>
     </w:lvl>
-    <w:lvl w:ilvl="6" w:tplc="D3B0C7CC">
+    <w:lvl w:ilvl="6" w:tplc="56800488">
       <w:numFmt w:val="decimal"/>
       <w:lvlText w:val=""/>
       <w:lvlJc w:val="left"/>
     </w:lvl>
-    <w:lvl w:ilvl="7" w:tplc="8E2219C2">
+    <w:lvl w:ilvl="7" w:tplc="53428960">
       <w:numFmt w:val="decimal"/>
       <w:lvlText w:val=""/>
       <w:lvlJc w:val="left"/>
     </w:lvl>
-    <w:lvl w:ilvl="8" w:tplc="824652E4">
+    <w:lvl w:ilvl="8" w:tplc="8E88922C">
       <w:numFmt w:val="decimal"/>
       <w:lvlText w:val=""/>
       <w:lvlJc w:val="left"/>
     </w:lvl>
   </w:abstractNum>
-  <w:abstractNum w:abstractNumId="19" w15:restartNumberingAfterBreak="0">
-    <w:nsid w:val="6D3D12BE"/>
+  <w:abstractNum w:abstractNumId="13" w15:restartNumberingAfterBreak="0">
+    <w:nsid w:val="32720061"/>
     <w:multiLevelType w:val="hybridMultilevel"/>
-    <w:tmpl w:val="6452056C"/>
-    <w:lvl w:ilvl="0" w:tplc="4432AAAE" w:tentative="1">
+    <w:tmpl w:val="8474F620"/>
+    <w:lvl w:ilvl="0" w:tplc="F588F922">
       <w:start w:val="1"/>
       <w:numFmt w:val="decimal"/>
       <w:lvlText w:val="%1."/>
@@ -30473,52 +30170,52 @@
         <w:ind w:left="540" w:hanging="300"/>
       </w:pPr>
     </w:lvl>
-    <w:lvl w:ilvl="1" w:tplc="4140B18C">
+    <w:lvl w:ilvl="1" w:tplc="0E94B83C">
       <w:numFmt w:val="decimal"/>
       <w:lvlText w:val=""/>
       <w:lvlJc w:val="left"/>
     </w:lvl>
-    <w:lvl w:ilvl="2" w:tplc="F9D06328">
+    <w:lvl w:ilvl="2" w:tplc="81F8A3B2">
       <w:numFmt w:val="decimal"/>
       <w:lvlText w:val=""/>
       <w:lvlJc w:val="left"/>
     </w:lvl>
-    <w:lvl w:ilvl="3" w:tplc="6EA66EBC">
+    <w:lvl w:ilvl="3" w:tplc="63C856CC">
       <w:numFmt w:val="decimal"/>
       <w:lvlText w:val=""/>
       <w:lvlJc w:val="left"/>
     </w:lvl>
-    <w:lvl w:ilvl="4" w:tplc="A9F240EE">
+    <w:lvl w:ilvl="4" w:tplc="43F8E920">
       <w:numFmt w:val="decimal"/>
       <w:lvlText w:val=""/>
       <w:lvlJc w:val="left"/>
     </w:lvl>
-    <w:lvl w:ilvl="5" w:tplc="44B40BCE">
+    <w:lvl w:ilvl="5" w:tplc="232216F6">
       <w:numFmt w:val="decimal"/>
       <w:lvlText w:val=""/>
       <w:lvlJc w:val="left"/>
     </w:lvl>
-    <w:lvl w:ilvl="6" w:tplc="60C61838">
+    <w:lvl w:ilvl="6" w:tplc="2BE69E2E">
       <w:numFmt w:val="decimal"/>
       <w:lvlText w:val=""/>
       <w:lvlJc w:val="left"/>
     </w:lvl>
-    <w:lvl w:ilvl="7" w:tplc="9FEEE20A">
+    <w:lvl w:ilvl="7" w:tplc="E946B88E">
       <w:numFmt w:val="decimal"/>
       <w:lvlText w:val=""/>
       <w:lvlJc w:val="left"/>
     </w:lvl>
-    <w:lvl w:ilvl="8" w:tplc="1F323D84">
+    <w:lvl w:ilvl="8" w:tplc="CC28AFBA">
       <w:numFmt w:val="decimal"/>
       <w:lvlText w:val=""/>
       <w:lvlJc w:val="left"/>
     </w:lvl>
   </w:abstractNum>
-  <w:abstractNum w:abstractNumId="20" w15:restartNumberingAfterBreak="0">
-    <w:nsid w:val="70A943F1"/>
+  <w:abstractNum w:abstractNumId="14" w15:restartNumberingAfterBreak="0">
+    <w:nsid w:val="39907906"/>
     <w:multiLevelType w:val="hybridMultilevel"/>
-    <w:tmpl w:val="7334295A"/>
-    <w:lvl w:ilvl="0" w:tplc="E61EBF74" w:tentative="1">
+    <w:tmpl w:val="5FD4A2D0"/>
+    <w:lvl w:ilvl="0" w:tplc="7FE62358" w:tentative="1">
       <w:start w:val="1"/>
       <w:numFmt w:val="decimal"/>
       <w:lvlText w:val="%1."/>
@@ -30527,52 +30224,52 @@
         <w:ind w:left="540" w:hanging="300"/>
       </w:pPr>
     </w:lvl>
-    <w:lvl w:ilvl="1" w:tplc="44E69950">
+    <w:lvl w:ilvl="1" w:tplc="461616E4">
       <w:numFmt w:val="decimal"/>
       <w:lvlText w:val=""/>
       <w:lvlJc w:val="left"/>
     </w:lvl>
-    <w:lvl w:ilvl="2" w:tplc="FC18AD98">
+    <w:lvl w:ilvl="2" w:tplc="9000BD0A">
       <w:numFmt w:val="decimal"/>
       <w:lvlText w:val=""/>
       <w:lvlJc w:val="left"/>
     </w:lvl>
-    <w:lvl w:ilvl="3" w:tplc="14740FA0">
+    <w:lvl w:ilvl="3" w:tplc="D3C0F1F8">
       <w:numFmt w:val="decimal"/>
       <w:lvlText w:val=""/>
       <w:lvlJc w:val="left"/>
     </w:lvl>
-    <w:lvl w:ilvl="4" w:tplc="AC224A48">
+    <w:lvl w:ilvl="4" w:tplc="7374CD8E">
       <w:numFmt w:val="decimal"/>
       <w:lvlText w:val=""/>
       <w:lvlJc w:val="left"/>
     </w:lvl>
-    <w:lvl w:ilvl="5" w:tplc="FD4E2734">
+    <w:lvl w:ilvl="5" w:tplc="6BDC2D7C">
       <w:numFmt w:val="decimal"/>
       <w:lvlText w:val=""/>
       <w:lvlJc w:val="left"/>
     </w:lvl>
-    <w:lvl w:ilvl="6" w:tplc="3E9C6894">
+    <w:lvl w:ilvl="6" w:tplc="4CCC85CC">
       <w:numFmt w:val="decimal"/>
       <w:lvlText w:val=""/>
       <w:lvlJc w:val="left"/>
     </w:lvl>
-    <w:lvl w:ilvl="7" w:tplc="9440E272">
+    <w:lvl w:ilvl="7" w:tplc="82F8F4B4">
       <w:numFmt w:val="decimal"/>
       <w:lvlText w:val=""/>
       <w:lvlJc w:val="left"/>
     </w:lvl>
-    <w:lvl w:ilvl="8" w:tplc="B3647ED2">
+    <w:lvl w:ilvl="8" w:tplc="3F249414">
       <w:numFmt w:val="decimal"/>
       <w:lvlText w:val=""/>
       <w:lvlJc w:val="left"/>
     </w:lvl>
   </w:abstractNum>
-  <w:abstractNum w:abstractNumId="21" w15:restartNumberingAfterBreak="0">
-    <w:nsid w:val="7DEE6CEE"/>
+  <w:abstractNum w:abstractNumId="15" w15:restartNumberingAfterBreak="0">
+    <w:nsid w:val="3CC7613B"/>
     <w:multiLevelType w:val="hybridMultilevel"/>
-    <w:tmpl w:val="7EC6D04A"/>
-    <w:lvl w:ilvl="0" w:tplc="4B94F508" w:tentative="1">
+    <w:tmpl w:val="A1387622"/>
+    <w:lvl w:ilvl="0" w:tplc="72D6FBF8" w:tentative="1">
       <w:start w:val="1"/>
       <w:numFmt w:val="decimal"/>
       <w:lvlText w:val="%1."/>
@@ -30581,67 +30278,391 @@
         <w:ind w:left="540" w:hanging="300"/>
       </w:pPr>
     </w:lvl>
-    <w:lvl w:ilvl="1" w:tplc="C60C3D26">
+    <w:lvl w:ilvl="1" w:tplc="E1EEFE12">
       <w:numFmt w:val="decimal"/>
       <w:lvlText w:val=""/>
       <w:lvlJc w:val="left"/>
     </w:lvl>
-    <w:lvl w:ilvl="2" w:tplc="28D6DF86">
+    <w:lvl w:ilvl="2" w:tplc="A3BCF9F8">
       <w:numFmt w:val="decimal"/>
       <w:lvlText w:val=""/>
       <w:lvlJc w:val="left"/>
     </w:lvl>
-    <w:lvl w:ilvl="3" w:tplc="CD3CF3B6">
+    <w:lvl w:ilvl="3" w:tplc="33025492">
       <w:numFmt w:val="decimal"/>
       <w:lvlText w:val=""/>
       <w:lvlJc w:val="left"/>
     </w:lvl>
-    <w:lvl w:ilvl="4" w:tplc="107E0AA0">
+    <w:lvl w:ilvl="4" w:tplc="FF449112">
       <w:numFmt w:val="decimal"/>
       <w:lvlText w:val=""/>
       <w:lvlJc w:val="left"/>
     </w:lvl>
-    <w:lvl w:ilvl="5" w:tplc="03182226">
+    <w:lvl w:ilvl="5" w:tplc="D600434E">
       <w:numFmt w:val="decimal"/>
       <w:lvlText w:val=""/>
       <w:lvlJc w:val="left"/>
     </w:lvl>
-    <w:lvl w:ilvl="6" w:tplc="5762E01E">
+    <w:lvl w:ilvl="6" w:tplc="56E28DA6">
       <w:numFmt w:val="decimal"/>
       <w:lvlText w:val=""/>
       <w:lvlJc w:val="left"/>
     </w:lvl>
-    <w:lvl w:ilvl="7" w:tplc="91AC1FBA">
+    <w:lvl w:ilvl="7" w:tplc="85C8C60C">
       <w:numFmt w:val="decimal"/>
       <w:lvlText w:val=""/>
       <w:lvlJc w:val="left"/>
     </w:lvl>
-    <w:lvl w:ilvl="8" w:tplc="68C0FD60">
+    <w:lvl w:ilvl="8" w:tplc="31FE4BAA">
+      <w:numFmt w:val="decimal"/>
+      <w:lvlText w:val=""/>
+      <w:lvlJc w:val="left"/>
+    </w:lvl>
+  </w:abstractNum>
+  <w:abstractNum w:abstractNumId="16" w15:restartNumberingAfterBreak="0">
+    <w:nsid w:val="412D29BF"/>
+    <w:multiLevelType w:val="hybridMultilevel"/>
+    <w:tmpl w:val="6346EAA0"/>
+    <w:lvl w:ilvl="0" w:tplc="AF90953E" w:tentative="1">
+      <w:start w:val="1"/>
+      <w:numFmt w:val="decimal"/>
+      <w:lvlText w:val="%1."/>
+      <w:lvlJc w:val="left"/>
+      <w:pPr>
+        <w:ind w:left="540" w:hanging="300"/>
+      </w:pPr>
+    </w:lvl>
+    <w:lvl w:ilvl="1" w:tplc="E2080588">
+      <w:numFmt w:val="decimal"/>
+      <w:lvlText w:val=""/>
+      <w:lvlJc w:val="left"/>
+    </w:lvl>
+    <w:lvl w:ilvl="2" w:tplc="9DEABFF4">
+      <w:numFmt w:val="decimal"/>
+      <w:lvlText w:val=""/>
+      <w:lvlJc w:val="left"/>
+    </w:lvl>
+    <w:lvl w:ilvl="3" w:tplc="7212A726">
+      <w:numFmt w:val="decimal"/>
+      <w:lvlText w:val=""/>
+      <w:lvlJc w:val="left"/>
+    </w:lvl>
+    <w:lvl w:ilvl="4" w:tplc="0B840188">
+      <w:numFmt w:val="decimal"/>
+      <w:lvlText w:val=""/>
+      <w:lvlJc w:val="left"/>
+    </w:lvl>
+    <w:lvl w:ilvl="5" w:tplc="18ACF242">
+      <w:numFmt w:val="decimal"/>
+      <w:lvlText w:val=""/>
+      <w:lvlJc w:val="left"/>
+    </w:lvl>
+    <w:lvl w:ilvl="6" w:tplc="6186EB66">
+      <w:numFmt w:val="decimal"/>
+      <w:lvlText w:val=""/>
+      <w:lvlJc w:val="left"/>
+    </w:lvl>
+    <w:lvl w:ilvl="7" w:tplc="4BD2388A">
+      <w:numFmt w:val="decimal"/>
+      <w:lvlText w:val=""/>
+      <w:lvlJc w:val="left"/>
+    </w:lvl>
+    <w:lvl w:ilvl="8" w:tplc="75E65276">
+      <w:numFmt w:val="decimal"/>
+      <w:lvlText w:val=""/>
+      <w:lvlJc w:val="left"/>
+    </w:lvl>
+  </w:abstractNum>
+  <w:abstractNum w:abstractNumId="17" w15:restartNumberingAfterBreak="0">
+    <w:nsid w:val="4D6F5DDC"/>
+    <w:multiLevelType w:val="hybridMultilevel"/>
+    <w:tmpl w:val="1AC2F65C"/>
+    <w:lvl w:ilvl="0" w:tplc="BDBC889E" w:tentative="1">
+      <w:start w:val="1"/>
+      <w:numFmt w:val="decimal"/>
+      <w:lvlText w:val="%1."/>
+      <w:lvlJc w:val="left"/>
+      <w:pPr>
+        <w:ind w:left="540" w:hanging="300"/>
+      </w:pPr>
+    </w:lvl>
+    <w:lvl w:ilvl="1" w:tplc="AE660C3C">
+      <w:numFmt w:val="decimal"/>
+      <w:lvlText w:val=""/>
+      <w:lvlJc w:val="left"/>
+    </w:lvl>
+    <w:lvl w:ilvl="2" w:tplc="D54409AC">
+      <w:numFmt w:val="decimal"/>
+      <w:lvlText w:val=""/>
+      <w:lvlJc w:val="left"/>
+    </w:lvl>
+    <w:lvl w:ilvl="3" w:tplc="5FCA29F8">
+      <w:numFmt w:val="decimal"/>
+      <w:lvlText w:val=""/>
+      <w:lvlJc w:val="left"/>
+    </w:lvl>
+    <w:lvl w:ilvl="4" w:tplc="96A49F30">
+      <w:numFmt w:val="decimal"/>
+      <w:lvlText w:val=""/>
+      <w:lvlJc w:val="left"/>
+    </w:lvl>
+    <w:lvl w:ilvl="5" w:tplc="78A4AD0A">
+      <w:numFmt w:val="decimal"/>
+      <w:lvlText w:val=""/>
+      <w:lvlJc w:val="left"/>
+    </w:lvl>
+    <w:lvl w:ilvl="6" w:tplc="C99AA27E">
+      <w:numFmt w:val="decimal"/>
+      <w:lvlText w:val=""/>
+      <w:lvlJc w:val="left"/>
+    </w:lvl>
+    <w:lvl w:ilvl="7" w:tplc="2A5680AE">
+      <w:numFmt w:val="decimal"/>
+      <w:lvlText w:val=""/>
+      <w:lvlJc w:val="left"/>
+    </w:lvl>
+    <w:lvl w:ilvl="8" w:tplc="1FFC59EA">
+      <w:numFmt w:val="decimal"/>
+      <w:lvlText w:val=""/>
+      <w:lvlJc w:val="left"/>
+    </w:lvl>
+  </w:abstractNum>
+  <w:abstractNum w:abstractNumId="18" w15:restartNumberingAfterBreak="0">
+    <w:nsid w:val="6554090E"/>
+    <w:multiLevelType w:val="hybridMultilevel"/>
+    <w:tmpl w:val="31DAF73A"/>
+    <w:lvl w:ilvl="0" w:tplc="1134639A" w:tentative="1">
+      <w:start w:val="1"/>
+      <w:numFmt w:val="decimal"/>
+      <w:lvlText w:val="%1."/>
+      <w:lvlJc w:val="left"/>
+      <w:pPr>
+        <w:ind w:left="540" w:hanging="300"/>
+      </w:pPr>
+    </w:lvl>
+    <w:lvl w:ilvl="1" w:tplc="88E2B334">
+      <w:numFmt w:val="decimal"/>
+      <w:lvlText w:val=""/>
+      <w:lvlJc w:val="left"/>
+    </w:lvl>
+    <w:lvl w:ilvl="2" w:tplc="52AE6D80">
+      <w:numFmt w:val="decimal"/>
+      <w:lvlText w:val=""/>
+      <w:lvlJc w:val="left"/>
+    </w:lvl>
+    <w:lvl w:ilvl="3" w:tplc="4600F80A">
+      <w:numFmt w:val="decimal"/>
+      <w:lvlText w:val=""/>
+      <w:lvlJc w:val="left"/>
+    </w:lvl>
+    <w:lvl w:ilvl="4" w:tplc="44B8AA66">
+      <w:numFmt w:val="decimal"/>
+      <w:lvlText w:val=""/>
+      <w:lvlJc w:val="left"/>
+    </w:lvl>
+    <w:lvl w:ilvl="5" w:tplc="9236C6DA">
+      <w:numFmt w:val="decimal"/>
+      <w:lvlText w:val=""/>
+      <w:lvlJc w:val="left"/>
+    </w:lvl>
+    <w:lvl w:ilvl="6" w:tplc="1ECE379C">
+      <w:numFmt w:val="decimal"/>
+      <w:lvlText w:val=""/>
+      <w:lvlJc w:val="left"/>
+    </w:lvl>
+    <w:lvl w:ilvl="7" w:tplc="C51096BC">
+      <w:numFmt w:val="decimal"/>
+      <w:lvlText w:val=""/>
+      <w:lvlJc w:val="left"/>
+    </w:lvl>
+    <w:lvl w:ilvl="8" w:tplc="15F4920C">
+      <w:numFmt w:val="decimal"/>
+      <w:lvlText w:val=""/>
+      <w:lvlJc w:val="left"/>
+    </w:lvl>
+  </w:abstractNum>
+  <w:abstractNum w:abstractNumId="19" w15:restartNumberingAfterBreak="0">
+    <w:nsid w:val="668121C1"/>
+    <w:multiLevelType w:val="hybridMultilevel"/>
+    <w:tmpl w:val="37F28ADA"/>
+    <w:lvl w:ilvl="0" w:tplc="2DE2B9C0" w:tentative="1">
+      <w:start w:val="1"/>
+      <w:numFmt w:val="decimal"/>
+      <w:lvlText w:val="%1."/>
+      <w:lvlJc w:val="left"/>
+      <w:pPr>
+        <w:ind w:left="540" w:hanging="300"/>
+      </w:pPr>
+    </w:lvl>
+    <w:lvl w:ilvl="1" w:tplc="ACC69954">
+      <w:numFmt w:val="decimal"/>
+      <w:lvlText w:val=""/>
+      <w:lvlJc w:val="left"/>
+    </w:lvl>
+    <w:lvl w:ilvl="2" w:tplc="CE423264">
+      <w:numFmt w:val="decimal"/>
+      <w:lvlText w:val=""/>
+      <w:lvlJc w:val="left"/>
+    </w:lvl>
+    <w:lvl w:ilvl="3" w:tplc="AD60D536">
+      <w:numFmt w:val="decimal"/>
+      <w:lvlText w:val=""/>
+      <w:lvlJc w:val="left"/>
+    </w:lvl>
+    <w:lvl w:ilvl="4" w:tplc="328452AA">
+      <w:numFmt w:val="decimal"/>
+      <w:lvlText w:val=""/>
+      <w:lvlJc w:val="left"/>
+    </w:lvl>
+    <w:lvl w:ilvl="5" w:tplc="D8DAB152">
+      <w:numFmt w:val="decimal"/>
+      <w:lvlText w:val=""/>
+      <w:lvlJc w:val="left"/>
+    </w:lvl>
+    <w:lvl w:ilvl="6" w:tplc="23A02A2E">
+      <w:numFmt w:val="decimal"/>
+      <w:lvlText w:val=""/>
+      <w:lvlJc w:val="left"/>
+    </w:lvl>
+    <w:lvl w:ilvl="7" w:tplc="8B5A77B0">
+      <w:numFmt w:val="decimal"/>
+      <w:lvlText w:val=""/>
+      <w:lvlJc w:val="left"/>
+    </w:lvl>
+    <w:lvl w:ilvl="8" w:tplc="FA30C43C">
+      <w:numFmt w:val="decimal"/>
+      <w:lvlText w:val=""/>
+      <w:lvlJc w:val="left"/>
+    </w:lvl>
+  </w:abstractNum>
+  <w:abstractNum w:abstractNumId="20" w15:restartNumberingAfterBreak="0">
+    <w:nsid w:val="67463750"/>
+    <w:multiLevelType w:val="hybridMultilevel"/>
+    <w:tmpl w:val="7DD036E2"/>
+    <w:lvl w:ilvl="0" w:tplc="E5966586" w:tentative="1">
+      <w:start w:val="1"/>
+      <w:numFmt w:val="decimal"/>
+      <w:lvlText w:val="%1."/>
+      <w:lvlJc w:val="left"/>
+      <w:pPr>
+        <w:ind w:left="540" w:hanging="300"/>
+      </w:pPr>
+    </w:lvl>
+    <w:lvl w:ilvl="1" w:tplc="53E8811A">
+      <w:numFmt w:val="decimal"/>
+      <w:lvlText w:val=""/>
+      <w:lvlJc w:val="left"/>
+    </w:lvl>
+    <w:lvl w:ilvl="2" w:tplc="57167A6A">
+      <w:numFmt w:val="decimal"/>
+      <w:lvlText w:val=""/>
+      <w:lvlJc w:val="left"/>
+    </w:lvl>
+    <w:lvl w:ilvl="3" w:tplc="B6E045FE">
+      <w:numFmt w:val="decimal"/>
+      <w:lvlText w:val=""/>
+      <w:lvlJc w:val="left"/>
+    </w:lvl>
+    <w:lvl w:ilvl="4" w:tplc="92DA5AD0">
+      <w:numFmt w:val="decimal"/>
+      <w:lvlText w:val=""/>
+      <w:lvlJc w:val="left"/>
+    </w:lvl>
+    <w:lvl w:ilvl="5" w:tplc="7B5E5ED0">
+      <w:numFmt w:val="decimal"/>
+      <w:lvlText w:val=""/>
+      <w:lvlJc w:val="left"/>
+    </w:lvl>
+    <w:lvl w:ilvl="6" w:tplc="AEE2ABBA">
+      <w:numFmt w:val="decimal"/>
+      <w:lvlText w:val=""/>
+      <w:lvlJc w:val="left"/>
+    </w:lvl>
+    <w:lvl w:ilvl="7" w:tplc="68424044">
+      <w:numFmt w:val="decimal"/>
+      <w:lvlText w:val=""/>
+      <w:lvlJc w:val="left"/>
+    </w:lvl>
+    <w:lvl w:ilvl="8" w:tplc="06765EA4">
+      <w:numFmt w:val="decimal"/>
+      <w:lvlText w:val=""/>
+      <w:lvlJc w:val="left"/>
+    </w:lvl>
+  </w:abstractNum>
+  <w:abstractNum w:abstractNumId="21" w15:restartNumberingAfterBreak="0">
+    <w:nsid w:val="743619E2"/>
+    <w:multiLevelType w:val="hybridMultilevel"/>
+    <w:tmpl w:val="550E90E0"/>
+    <w:lvl w:ilvl="0" w:tplc="55727388" w:tentative="1">
+      <w:start w:val="1"/>
+      <w:numFmt w:val="decimal"/>
+      <w:lvlText w:val="%1."/>
+      <w:lvlJc w:val="left"/>
+      <w:pPr>
+        <w:ind w:left="540" w:hanging="300"/>
+      </w:pPr>
+    </w:lvl>
+    <w:lvl w:ilvl="1" w:tplc="B84AA526">
+      <w:numFmt w:val="decimal"/>
+      <w:lvlText w:val=""/>
+      <w:lvlJc w:val="left"/>
+    </w:lvl>
+    <w:lvl w:ilvl="2" w:tplc="2CA40ACE">
+      <w:numFmt w:val="decimal"/>
+      <w:lvlText w:val=""/>
+      <w:lvlJc w:val="left"/>
+    </w:lvl>
+    <w:lvl w:ilvl="3" w:tplc="BDD67542">
+      <w:numFmt w:val="decimal"/>
+      <w:lvlText w:val=""/>
+      <w:lvlJc w:val="left"/>
+    </w:lvl>
+    <w:lvl w:ilvl="4" w:tplc="C796628A">
+      <w:numFmt w:val="decimal"/>
+      <w:lvlText w:val=""/>
+      <w:lvlJc w:val="left"/>
+    </w:lvl>
+    <w:lvl w:ilvl="5" w:tplc="CEE85550">
+      <w:numFmt w:val="decimal"/>
+      <w:lvlText w:val=""/>
+      <w:lvlJc w:val="left"/>
+    </w:lvl>
+    <w:lvl w:ilvl="6" w:tplc="3A206616">
+      <w:numFmt w:val="decimal"/>
+      <w:lvlText w:val=""/>
+      <w:lvlJc w:val="left"/>
+    </w:lvl>
+    <w:lvl w:ilvl="7" w:tplc="AEB03424">
+      <w:numFmt w:val="decimal"/>
+      <w:lvlText w:val=""/>
+      <w:lvlJc w:val="left"/>
+    </w:lvl>
+    <w:lvl w:ilvl="8" w:tplc="9426EF4C">
       <w:numFmt w:val="decimal"/>
       <w:lvlText w:val=""/>
       <w:lvlJc w:val="left"/>
     </w:lvl>
   </w:abstractNum>
   <w:num w:numId="1">
-    <w:abstractNumId w:val="8"/>
+    <w:abstractNumId w:val="0"/>
     <w:lvlOverride w:ilvl="0">
       <w:startOverride w:val="1"/>
     </w:lvlOverride>
   </w:num>
   <w:num w:numId="2">
-    <w:abstractNumId w:val="17"/>
+    <w:abstractNumId w:val="11"/>
     <w:lvlOverride w:ilvl="0">
       <w:startOverride w:val="1"/>
     </w:lvlOverride>
   </w:num>
   <w:num w:numId="3">
-    <w:abstractNumId w:val="4"/>
+    <w:abstractNumId w:val="13"/>
     <w:lvlOverride w:ilvl="0">
       <w:startOverride w:val="1"/>
     </w:lvlOverride>
   </w:num>
   <w:num w:numId="4">
-    <w:abstractNumId w:val="2"/>
+    <w:abstractNumId w:val="1"/>
     <w:lvlOverride w:ilvl="0">
       <w:startOverride w:val="1"/>
     </w:lvlOverride>
@@ -31285,7 +31306,7 @@
     <w:autoRedefine/>
     <w:uiPriority w:val="39"/>
     <w:unhideWhenUsed/>
-    <w:rsid w:val="00252F0B"/>
+    <w:rsid w:val="00B147FC"/>
     <w:pPr>
       <w:spacing w:after="100"/>
     </w:pPr>
@@ -31297,7 +31318,7 @@
     <w:autoRedefine/>
     <w:uiPriority w:val="39"/>
     <w:unhideWhenUsed/>
-    <w:rsid w:val="00252F0B"/>
+    <w:rsid w:val="00B147FC"/>
     <w:pPr>
       <w:spacing w:after="100"/>
       <w:ind w:left="210"/>

</xml_diff>

<commit_message>
Analisis Siswa: Tinjau kesalahan sesi kelompok; panduan guru diperbarui
- Kartu Latihan mandiri: soal salah 5 sesi terakhir, pembahasan dibuka, sudah dipahami, soal serupa dijawab
- Catatan otomatis menyebut Belum meninjau / Meninjau kesalahan
- Panduan (docx/pdf): 1.3, 4.5, tanya jawab 5.2

Co-Authored-By: Claude Opus 5.5 <noreply@anthropic.com>
</commit_message>
<xml_diff>
--- a/Panduan_Membaca_Data_Matdas.docx
+++ b/Panduan_Membaca_Data_Matdas.docx
@@ -140,15 +140,7 @@
           <w:sz w:val="20"/>
           <w:szCs w:val="20"/>
         </w:rPr>
-        <w:t>Versi: 17 Oktober 2026, menambah peringkat Paling rajin latihan mandiri</w:t>
-      </w:r>
-      <w:r>
-        <w:rPr>
-          <w:color w:val="5B6B7D"/>
-          <w:sz w:val="20"/>
-          <w:szCs w:val="20"/>
-        </w:rPr>
-        <w:t xml:space="preserve"> (sesuai tampilan aplikasi per tanggal tersebut)</w:t>
+        <w:t>Versi: 20 Oktober 2026, menambah pembahasan langkah demi langkah dan Tinjau kesalahanku di latihan mandiri (sesuai tampilan aplikasi per tanggal tersebut)</w:t>
       </w:r>
     </w:p>
     <w:p>
@@ -201,7 +193,7 @@
           <w:r>
             <w:fldChar w:fldCharType="separate"/>
           </w:r>
-          <w:hyperlink w:anchor="_Toc243165890" w:history="1">
+          <w:hyperlink w:anchor="_Toc243302206" w:history="1">
             <w:r>
               <w:rPr>
                 <w:rStyle w:val="Hyperlink"/>
@@ -225,7 +217,7 @@
               <w:rPr>
                 <w:noProof/>
               </w:rPr>
-              <w:instrText xml:space="preserve"> PAGEREF _Toc243165890 \h </w:instrText>
+              <w:instrText xml:space="preserve"> PAGEREF _Toc243302206 \h </w:instrText>
             </w:r>
             <w:r>
               <w:rPr>
@@ -265,7 +257,7 @@
               <w:szCs w:val="22"/>
             </w:rPr>
           </w:pPr>
-          <w:hyperlink w:anchor="_Toc243165891" w:history="1">
+          <w:hyperlink w:anchor="_Toc243302207" w:history="1">
             <w:r>
               <w:rPr>
                 <w:rStyle w:val="Hyperlink"/>
@@ -289,7 +281,7 @@
               <w:rPr>
                 <w:noProof/>
               </w:rPr>
-              <w:instrText xml:space="preserve"> PAGEREF _Toc243165891 \h </w:instrText>
+              <w:instrText xml:space="preserve"> PAGEREF _Toc243302207 \h </w:instrText>
             </w:r>
             <w:r>
               <w:rPr>
@@ -329,7 +321,7 @@
               <w:szCs w:val="22"/>
             </w:rPr>
           </w:pPr>
-          <w:hyperlink w:anchor="_Toc243165892" w:history="1">
+          <w:hyperlink w:anchor="_Toc243302208" w:history="1">
             <w:r>
               <w:rPr>
                 <w:rStyle w:val="Hyperlink"/>
@@ -353,7 +345,7 @@
               <w:rPr>
                 <w:noProof/>
               </w:rPr>
-              <w:instrText xml:space="preserve"> PAGEREF _Toc243165892 \h </w:instrText>
+              <w:instrText xml:space="preserve"> PAGEREF _Toc243302208 \h </w:instrText>
             </w:r>
             <w:r>
               <w:rPr>
@@ -393,7 +385,7 @@
               <w:szCs w:val="22"/>
             </w:rPr>
           </w:pPr>
-          <w:hyperlink w:anchor="_Toc243165893" w:history="1">
+          <w:hyperlink w:anchor="_Toc243302209" w:history="1">
             <w:r>
               <w:rPr>
                 <w:rStyle w:val="Hyperlink"/>
@@ -417,7 +409,7 @@
               <w:rPr>
                 <w:noProof/>
               </w:rPr>
-              <w:instrText xml:space="preserve"> PAGEREF _Toc243165893 \h </w:instrText>
+              <w:instrText xml:space="preserve"> PAGEREF _Toc243302209 \h </w:instrText>
             </w:r>
             <w:r>
               <w:rPr>
@@ -457,7 +449,7 @@
               <w:szCs w:val="22"/>
             </w:rPr>
           </w:pPr>
-          <w:hyperlink w:anchor="_Toc243165894" w:history="1">
+          <w:hyperlink w:anchor="_Toc243302210" w:history="1">
             <w:r>
               <w:rPr>
                 <w:rStyle w:val="Hyperlink"/>
@@ -481,7 +473,7 @@
               <w:rPr>
                 <w:noProof/>
               </w:rPr>
-              <w:instrText xml:space="preserve"> PAGEREF _Toc243165894 \h </w:instrText>
+              <w:instrText xml:space="preserve"> PAGEREF _Toc243302210 \h </w:instrText>
             </w:r>
             <w:r>
               <w:rPr>
@@ -521,7 +513,7 @@
               <w:szCs w:val="22"/>
             </w:rPr>
           </w:pPr>
-          <w:hyperlink w:anchor="_Toc243165895" w:history="1">
+          <w:hyperlink w:anchor="_Toc243302211" w:history="1">
             <w:r>
               <w:rPr>
                 <w:rStyle w:val="Hyperlink"/>
@@ -545,7 +537,7 @@
               <w:rPr>
                 <w:noProof/>
               </w:rPr>
-              <w:instrText xml:space="preserve"> PAGEREF _Toc243165895 \h </w:instrText>
+              <w:instrText xml:space="preserve"> PAGEREF _Toc243302211 \h </w:instrText>
             </w:r>
             <w:r>
               <w:rPr>
@@ -585,7 +577,7 @@
               <w:szCs w:val="22"/>
             </w:rPr>
           </w:pPr>
-          <w:hyperlink w:anchor="_Toc243165896" w:history="1">
+          <w:hyperlink w:anchor="_Toc243302212" w:history="1">
             <w:r>
               <w:rPr>
                 <w:rStyle w:val="Hyperlink"/>
@@ -609,7 +601,7 @@
               <w:rPr>
                 <w:noProof/>
               </w:rPr>
-              <w:instrText xml:space="preserve"> PAGEREF _Toc243165896 \h </w:instrText>
+              <w:instrText xml:space="preserve"> PAGEREF _Toc243302212 \h </w:instrText>
             </w:r>
             <w:r>
               <w:rPr>
@@ -649,7 +641,7 @@
               <w:szCs w:val="22"/>
             </w:rPr>
           </w:pPr>
-          <w:hyperlink w:anchor="_Toc243165897" w:history="1">
+          <w:hyperlink w:anchor="_Toc243302213" w:history="1">
             <w:r>
               <w:rPr>
                 <w:rStyle w:val="Hyperlink"/>
@@ -673,7 +665,7 @@
               <w:rPr>
                 <w:noProof/>
               </w:rPr>
-              <w:instrText xml:space="preserve"> PAGEREF _Toc243165897 \h </w:instrText>
+              <w:instrText xml:space="preserve"> PAGEREF _Toc243302213 \h </w:instrText>
             </w:r>
             <w:r>
               <w:rPr>
@@ -690,7 +682,7 @@
               <w:rPr>
                 <w:noProof/>
               </w:rPr>
-              <w:t>6</w:t>
+              <w:t>7</w:t>
             </w:r>
             <w:r>
               <w:rPr>
@@ -713,7 +705,7 @@
               <w:szCs w:val="22"/>
             </w:rPr>
           </w:pPr>
-          <w:hyperlink w:anchor="_Toc243165898" w:history="1">
+          <w:hyperlink w:anchor="_Toc243302214" w:history="1">
             <w:r>
               <w:rPr>
                 <w:rStyle w:val="Hyperlink"/>
@@ -737,7 +729,7 @@
               <w:rPr>
                 <w:noProof/>
               </w:rPr>
-              <w:instrText xml:space="preserve"> PAGEREF _Toc243165898 \h </w:instrText>
+              <w:instrText xml:space="preserve"> PAGEREF _Toc243302214 \h </w:instrText>
             </w:r>
             <w:r>
               <w:rPr>
@@ -754,7 +746,7 @@
               <w:rPr>
                 <w:noProof/>
               </w:rPr>
-              <w:t>6</w:t>
+              <w:t>7</w:t>
             </w:r>
             <w:r>
               <w:rPr>
@@ -777,7 +769,7 @@
               <w:szCs w:val="22"/>
             </w:rPr>
           </w:pPr>
-          <w:hyperlink w:anchor="_Toc243165899" w:history="1">
+          <w:hyperlink w:anchor="_Toc243302215" w:history="1">
             <w:r>
               <w:rPr>
                 <w:rStyle w:val="Hyperlink"/>
@@ -801,7 +793,7 @@
               <w:rPr>
                 <w:noProof/>
               </w:rPr>
-              <w:instrText xml:space="preserve"> PAGEREF _Toc243165899 \h </w:instrText>
+              <w:instrText xml:space="preserve"> PAGEREF _Toc243302215 \h </w:instrText>
             </w:r>
             <w:r>
               <w:rPr>
@@ -818,7 +810,7 @@
               <w:rPr>
                 <w:noProof/>
               </w:rPr>
-              <w:t>6</w:t>
+              <w:t>7</w:t>
             </w:r>
             <w:r>
               <w:rPr>
@@ -841,7 +833,7 @@
               <w:szCs w:val="22"/>
             </w:rPr>
           </w:pPr>
-          <w:hyperlink w:anchor="_Toc243165900" w:history="1">
+          <w:hyperlink w:anchor="_Toc243302216" w:history="1">
             <w:r>
               <w:rPr>
                 <w:rStyle w:val="Hyperlink"/>
@@ -865,7 +857,7 @@
               <w:rPr>
                 <w:noProof/>
               </w:rPr>
-              <w:instrText xml:space="preserve"> PAGEREF _Toc243165900 \h </w:instrText>
+              <w:instrText xml:space="preserve"> PAGEREF _Toc243302216 \h </w:instrText>
             </w:r>
             <w:r>
               <w:rPr>
@@ -882,7 +874,7 @@
               <w:rPr>
                 <w:noProof/>
               </w:rPr>
-              <w:t>7</w:t>
+              <w:t>8</w:t>
             </w:r>
             <w:r>
               <w:rPr>
@@ -905,7 +897,7 @@
               <w:szCs w:val="22"/>
             </w:rPr>
           </w:pPr>
-          <w:hyperlink w:anchor="_Toc243165901" w:history="1">
+          <w:hyperlink w:anchor="_Toc243302217" w:history="1">
             <w:r>
               <w:rPr>
                 <w:rStyle w:val="Hyperlink"/>
@@ -929,7 +921,7 @@
               <w:rPr>
                 <w:noProof/>
               </w:rPr>
-              <w:instrText xml:space="preserve"> PAGEREF _Toc243165901 \h </w:instrText>
+              <w:instrText xml:space="preserve"> PAGEREF _Toc243302217 \h </w:instrText>
             </w:r>
             <w:r>
               <w:rPr>
@@ -946,7 +938,7 @@
               <w:rPr>
                 <w:noProof/>
               </w:rPr>
-              <w:t>7</w:t>
+              <w:t>8</w:t>
             </w:r>
             <w:r>
               <w:rPr>
@@ -969,7 +961,7 @@
               <w:szCs w:val="22"/>
             </w:rPr>
           </w:pPr>
-          <w:hyperlink w:anchor="_Toc243165902" w:history="1">
+          <w:hyperlink w:anchor="_Toc243302218" w:history="1">
             <w:r>
               <w:rPr>
                 <w:rStyle w:val="Hyperlink"/>
@@ -993,7 +985,7 @@
               <w:rPr>
                 <w:noProof/>
               </w:rPr>
-              <w:instrText xml:space="preserve"> PAGEREF _Toc243165902 \h </w:instrText>
+              <w:instrText xml:space="preserve"> PAGEREF _Toc243302218 \h </w:instrText>
             </w:r>
             <w:r>
               <w:rPr>
@@ -1010,7 +1002,7 @@
               <w:rPr>
                 <w:noProof/>
               </w:rPr>
-              <w:t>8</w:t>
+              <w:t>9</w:t>
             </w:r>
             <w:r>
               <w:rPr>
@@ -1033,7 +1025,7 @@
               <w:szCs w:val="22"/>
             </w:rPr>
           </w:pPr>
-          <w:hyperlink w:anchor="_Toc243165903" w:history="1">
+          <w:hyperlink w:anchor="_Toc243302219" w:history="1">
             <w:r>
               <w:rPr>
                 <w:rStyle w:val="Hyperlink"/>
@@ -1057,7 +1049,7 @@
               <w:rPr>
                 <w:noProof/>
               </w:rPr>
-              <w:instrText xml:space="preserve"> PAGEREF _Toc243165903 \h </w:instrText>
+              <w:instrText xml:space="preserve"> PAGEREF _Toc243302219 \h </w:instrText>
             </w:r>
             <w:r>
               <w:rPr>
@@ -1074,7 +1066,7 @@
               <w:rPr>
                 <w:noProof/>
               </w:rPr>
-              <w:t>8</w:t>
+              <w:t>9</w:t>
             </w:r>
             <w:r>
               <w:rPr>
@@ -1097,7 +1089,7 @@
               <w:szCs w:val="22"/>
             </w:rPr>
           </w:pPr>
-          <w:hyperlink w:anchor="_Toc243165904" w:history="1">
+          <w:hyperlink w:anchor="_Toc243302220" w:history="1">
             <w:r>
               <w:rPr>
                 <w:rStyle w:val="Hyperlink"/>
@@ -1121,7 +1113,7 @@
               <w:rPr>
                 <w:noProof/>
               </w:rPr>
-              <w:instrText xml:space="preserve"> PAGEREF _Toc243165904 \h </w:instrText>
+              <w:instrText xml:space="preserve"> PAGEREF _Toc243302220 \h </w:instrText>
             </w:r>
             <w:r>
               <w:rPr>
@@ -1138,7 +1130,7 @@
               <w:rPr>
                 <w:noProof/>
               </w:rPr>
-              <w:t>9</w:t>
+              <w:t>10</w:t>
             </w:r>
             <w:r>
               <w:rPr>
@@ -1161,7 +1153,7 @@
               <w:szCs w:val="22"/>
             </w:rPr>
           </w:pPr>
-          <w:hyperlink w:anchor="_Toc243165905" w:history="1">
+          <w:hyperlink w:anchor="_Toc243302221" w:history="1">
             <w:r>
               <w:rPr>
                 <w:rStyle w:val="Hyperlink"/>
@@ -1185,7 +1177,7 @@
               <w:rPr>
                 <w:noProof/>
               </w:rPr>
-              <w:instrText xml:space="preserve"> PAGEREF _Toc243165905 \h </w:instrText>
+              <w:instrText xml:space="preserve"> PAGEREF _Toc243302221 \h </w:instrText>
             </w:r>
             <w:r>
               <w:rPr>
@@ -1202,7 +1194,7 @@
               <w:rPr>
                 <w:noProof/>
               </w:rPr>
-              <w:t>10</w:t>
+              <w:t>11</w:t>
             </w:r>
             <w:r>
               <w:rPr>
@@ -1225,7 +1217,7 @@
               <w:szCs w:val="22"/>
             </w:rPr>
           </w:pPr>
-          <w:hyperlink w:anchor="_Toc243165906" w:history="1">
+          <w:hyperlink w:anchor="_Toc243302222" w:history="1">
             <w:r>
               <w:rPr>
                 <w:rStyle w:val="Hyperlink"/>
@@ -1249,7 +1241,7 @@
               <w:rPr>
                 <w:noProof/>
               </w:rPr>
-              <w:instrText xml:space="preserve"> PAGEREF _Toc243165906 \h </w:instrText>
+              <w:instrText xml:space="preserve"> PAGEREF _Toc243302222 \h </w:instrText>
             </w:r>
             <w:r>
               <w:rPr>
@@ -1266,7 +1258,7 @@
               <w:rPr>
                 <w:noProof/>
               </w:rPr>
-              <w:t>10</w:t>
+              <w:t>11</w:t>
             </w:r>
             <w:r>
               <w:rPr>
@@ -1289,7 +1281,7 @@
               <w:szCs w:val="22"/>
             </w:rPr>
           </w:pPr>
-          <w:hyperlink w:anchor="_Toc243165907" w:history="1">
+          <w:hyperlink w:anchor="_Toc243302223" w:history="1">
             <w:r>
               <w:rPr>
                 <w:rStyle w:val="Hyperlink"/>
@@ -1313,7 +1305,7 @@
               <w:rPr>
                 <w:noProof/>
               </w:rPr>
-              <w:instrText xml:space="preserve"> PAGEREF _Toc243165907 \h </w:instrText>
+              <w:instrText xml:space="preserve"> PAGEREF _Toc243302223 \h </w:instrText>
             </w:r>
             <w:r>
               <w:rPr>
@@ -1330,7 +1322,7 @@
               <w:rPr>
                 <w:noProof/>
               </w:rPr>
-              <w:t>11</w:t>
+              <w:t>12</w:t>
             </w:r>
             <w:r>
               <w:rPr>
@@ -1353,7 +1345,7 @@
               <w:szCs w:val="22"/>
             </w:rPr>
           </w:pPr>
-          <w:hyperlink w:anchor="_Toc243165908" w:history="1">
+          <w:hyperlink w:anchor="_Toc243302224" w:history="1">
             <w:r>
               <w:rPr>
                 <w:rStyle w:val="Hyperlink"/>
@@ -1377,7 +1369,7 @@
               <w:rPr>
                 <w:noProof/>
               </w:rPr>
-              <w:instrText xml:space="preserve"> PAGEREF _Toc243165908 \h </w:instrText>
+              <w:instrText xml:space="preserve"> PAGEREF _Toc243302224 \h </w:instrText>
             </w:r>
             <w:r>
               <w:rPr>
@@ -1394,7 +1386,7 @@
               <w:rPr>
                 <w:noProof/>
               </w:rPr>
-              <w:t>13</w:t>
+              <w:t>14</w:t>
             </w:r>
             <w:r>
               <w:rPr>
@@ -1417,7 +1409,7 @@
               <w:szCs w:val="22"/>
             </w:rPr>
           </w:pPr>
-          <w:hyperlink w:anchor="_Toc243165909" w:history="1">
+          <w:hyperlink w:anchor="_Toc243302225" w:history="1">
             <w:r>
               <w:rPr>
                 <w:rStyle w:val="Hyperlink"/>
@@ -1441,7 +1433,7 @@
               <w:rPr>
                 <w:noProof/>
               </w:rPr>
-              <w:instrText xml:space="preserve"> PAGEREF _Toc243165909 \h </w:instrText>
+              <w:instrText xml:space="preserve"> PAGEREF _Toc243302225 \h </w:instrText>
             </w:r>
             <w:r>
               <w:rPr>
@@ -1458,7 +1450,7 @@
               <w:rPr>
                 <w:noProof/>
               </w:rPr>
-              <w:t>16</w:t>
+              <w:t>17</w:t>
             </w:r>
             <w:r>
               <w:rPr>
@@ -1481,7 +1473,7 @@
               <w:szCs w:val="22"/>
             </w:rPr>
           </w:pPr>
-          <w:hyperlink w:anchor="_Toc243165910" w:history="1">
+          <w:hyperlink w:anchor="_Toc243302226" w:history="1">
             <w:r>
               <w:rPr>
                 <w:rStyle w:val="Hyperlink"/>
@@ -1505,7 +1497,7 @@
               <w:rPr>
                 <w:noProof/>
               </w:rPr>
-              <w:instrText xml:space="preserve"> PAGEREF _Toc243165910 \h </w:instrText>
+              <w:instrText xml:space="preserve"> PAGEREF _Toc243302226 \h </w:instrText>
             </w:r>
             <w:r>
               <w:rPr>
@@ -1522,7 +1514,7 @@
               <w:rPr>
                 <w:noProof/>
               </w:rPr>
-              <w:t>16</w:t>
+              <w:t>17</w:t>
             </w:r>
             <w:r>
               <w:rPr>
@@ -1545,7 +1537,7 @@
               <w:szCs w:val="22"/>
             </w:rPr>
           </w:pPr>
-          <w:hyperlink w:anchor="_Toc243165911" w:history="1">
+          <w:hyperlink w:anchor="_Toc243302227" w:history="1">
             <w:r>
               <w:rPr>
                 <w:rStyle w:val="Hyperlink"/>
@@ -1569,7 +1561,7 @@
               <w:rPr>
                 <w:noProof/>
               </w:rPr>
-              <w:instrText xml:space="preserve"> PAGEREF _Toc243165911 \h </w:instrText>
+              <w:instrText xml:space="preserve"> PAGEREF _Toc243302227 \h </w:instrText>
             </w:r>
             <w:r>
               <w:rPr>
@@ -1586,7 +1578,7 @@
               <w:rPr>
                 <w:noProof/>
               </w:rPr>
-              <w:t>16</w:t>
+              <w:t>17</w:t>
             </w:r>
             <w:r>
               <w:rPr>
@@ -1609,7 +1601,7 @@
               <w:szCs w:val="22"/>
             </w:rPr>
           </w:pPr>
-          <w:hyperlink w:anchor="_Toc243165912" w:history="1">
+          <w:hyperlink w:anchor="_Toc243302228" w:history="1">
             <w:r>
               <w:rPr>
                 <w:rStyle w:val="Hyperlink"/>
@@ -1633,7 +1625,7 @@
               <w:rPr>
                 <w:noProof/>
               </w:rPr>
-              <w:instrText xml:space="preserve"> PAGEREF _Toc243165912 \h </w:instrText>
+              <w:instrText xml:space="preserve"> PAGEREF _Toc243302228 \h </w:instrText>
             </w:r>
             <w:r>
               <w:rPr>
@@ -1650,7 +1642,7 @@
               <w:rPr>
                 <w:noProof/>
               </w:rPr>
-              <w:t>17</w:t>
+              <w:t>18</w:t>
             </w:r>
             <w:r>
               <w:rPr>
@@ -1673,7 +1665,7 @@
               <w:szCs w:val="22"/>
             </w:rPr>
           </w:pPr>
-          <w:hyperlink w:anchor="_Toc243165913" w:history="1">
+          <w:hyperlink w:anchor="_Toc243302229" w:history="1">
             <w:r>
               <w:rPr>
                 <w:rStyle w:val="Hyperlink"/>
@@ -1697,7 +1689,7 @@
               <w:rPr>
                 <w:noProof/>
               </w:rPr>
-              <w:instrText xml:space="preserve"> PAGEREF _Toc243165913 \h </w:instrText>
+              <w:instrText xml:space="preserve"> PAGEREF _Toc243302229 \h </w:instrText>
             </w:r>
             <w:r>
               <w:rPr>
@@ -1714,7 +1706,7 @@
               <w:rPr>
                 <w:noProof/>
               </w:rPr>
-              <w:t>17</w:t>
+              <w:t>18</w:t>
             </w:r>
             <w:r>
               <w:rPr>
@@ -1737,7 +1729,7 @@
               <w:szCs w:val="22"/>
             </w:rPr>
           </w:pPr>
-          <w:hyperlink w:anchor="_Toc243165914" w:history="1">
+          <w:hyperlink w:anchor="_Toc243302230" w:history="1">
             <w:r>
               <w:rPr>
                 <w:rStyle w:val="Hyperlink"/>
@@ -1761,7 +1753,7 @@
               <w:rPr>
                 <w:noProof/>
               </w:rPr>
-              <w:instrText xml:space="preserve"> PAGEREF _Toc243165914 \h </w:instrText>
+              <w:instrText xml:space="preserve"> PAGEREF _Toc243302230 \h </w:instrText>
             </w:r>
             <w:r>
               <w:rPr>
@@ -1778,7 +1770,7 @@
               <w:rPr>
                 <w:noProof/>
               </w:rPr>
-              <w:t>18</w:t>
+              <w:t>19</w:t>
             </w:r>
             <w:r>
               <w:rPr>
@@ -1801,7 +1793,7 @@
               <w:szCs w:val="22"/>
             </w:rPr>
           </w:pPr>
-          <w:hyperlink w:anchor="_Toc243165915" w:history="1">
+          <w:hyperlink w:anchor="_Toc243302231" w:history="1">
             <w:r>
               <w:rPr>
                 <w:rStyle w:val="Hyperlink"/>
@@ -1825,7 +1817,7 @@
               <w:rPr>
                 <w:noProof/>
               </w:rPr>
-              <w:instrText xml:space="preserve"> PAGEREF _Toc243165915 \h </w:instrText>
+              <w:instrText xml:space="preserve"> PAGEREF _Toc243302231 \h </w:instrText>
             </w:r>
             <w:r>
               <w:rPr>
@@ -1842,7 +1834,7 @@
               <w:rPr>
                 <w:noProof/>
               </w:rPr>
-              <w:t>18</w:t>
+              <w:t>19</w:t>
             </w:r>
             <w:r>
               <w:rPr>
@@ -1865,7 +1857,7 @@
               <w:szCs w:val="22"/>
             </w:rPr>
           </w:pPr>
-          <w:hyperlink w:anchor="_Toc243165916" w:history="1">
+          <w:hyperlink w:anchor="_Toc243302232" w:history="1">
             <w:r>
               <w:rPr>
                 <w:rStyle w:val="Hyperlink"/>
@@ -1889,7 +1881,7 @@
               <w:rPr>
                 <w:noProof/>
               </w:rPr>
-              <w:instrText xml:space="preserve"> PAGEREF _Toc243165916 \h </w:instrText>
+              <w:instrText xml:space="preserve"> PAGEREF _Toc243302232 \h </w:instrText>
             </w:r>
             <w:r>
               <w:rPr>
@@ -1906,7 +1898,7 @@
               <w:rPr>
                 <w:noProof/>
               </w:rPr>
-              <w:t>18</w:t>
+              <w:t>19</w:t>
             </w:r>
             <w:r>
               <w:rPr>
@@ -1929,7 +1921,7 @@
               <w:szCs w:val="22"/>
             </w:rPr>
           </w:pPr>
-          <w:hyperlink w:anchor="_Toc243165917" w:history="1">
+          <w:hyperlink w:anchor="_Toc243302233" w:history="1">
             <w:r>
               <w:rPr>
                 <w:rStyle w:val="Hyperlink"/>
@@ -1953,7 +1945,7 @@
               <w:rPr>
                 <w:noProof/>
               </w:rPr>
-              <w:instrText xml:space="preserve"> PAGEREF _Toc243165917 \h </w:instrText>
+              <w:instrText xml:space="preserve"> PAGEREF _Toc243302233 \h </w:instrText>
             </w:r>
             <w:r>
               <w:rPr>
@@ -1970,7 +1962,7 @@
               <w:rPr>
                 <w:noProof/>
               </w:rPr>
-              <w:t>18</w:t>
+              <w:t>20</w:t>
             </w:r>
             <w:r>
               <w:rPr>
@@ -1993,7 +1985,7 @@
               <w:szCs w:val="22"/>
             </w:rPr>
           </w:pPr>
-          <w:hyperlink w:anchor="_Toc243165918" w:history="1">
+          <w:hyperlink w:anchor="_Toc243302234" w:history="1">
             <w:r>
               <w:rPr>
                 <w:rStyle w:val="Hyperlink"/>
@@ -2017,7 +2009,7 @@
               <w:rPr>
                 <w:noProof/>
               </w:rPr>
-              <w:instrText xml:space="preserve"> PAGEREF _Toc243165918 \h </w:instrText>
+              <w:instrText xml:space="preserve"> PAGEREF _Toc243302234 \h </w:instrText>
             </w:r>
             <w:r>
               <w:rPr>
@@ -2034,7 +2026,7 @@
               <w:rPr>
                 <w:noProof/>
               </w:rPr>
-              <w:t>20</w:t>
+              <w:t>21</w:t>
             </w:r>
             <w:r>
               <w:rPr>
@@ -2057,7 +2049,7 @@
               <w:szCs w:val="22"/>
             </w:rPr>
           </w:pPr>
-          <w:hyperlink w:anchor="_Toc243165919" w:history="1">
+          <w:hyperlink w:anchor="_Toc243302235" w:history="1">
             <w:r>
               <w:rPr>
                 <w:rStyle w:val="Hyperlink"/>
@@ -2081,7 +2073,7 @@
               <w:rPr>
                 <w:noProof/>
               </w:rPr>
-              <w:instrText xml:space="preserve"> PAGEREF _Toc243165919 \h </w:instrText>
+              <w:instrText xml:space="preserve"> PAGEREF _Toc243302235 \h </w:instrText>
             </w:r>
             <w:r>
               <w:rPr>
@@ -2098,7 +2090,7 @@
               <w:rPr>
                 <w:noProof/>
               </w:rPr>
-              <w:t>20</w:t>
+              <w:t>21</w:t>
             </w:r>
             <w:r>
               <w:rPr>
@@ -2121,7 +2113,7 @@
               <w:szCs w:val="22"/>
             </w:rPr>
           </w:pPr>
-          <w:hyperlink w:anchor="_Toc243165920" w:history="1">
+          <w:hyperlink w:anchor="_Toc243302236" w:history="1">
             <w:r>
               <w:rPr>
                 <w:rStyle w:val="Hyperlink"/>
@@ -2145,7 +2137,7 @@
               <w:rPr>
                 <w:noProof/>
               </w:rPr>
-              <w:instrText xml:space="preserve"> PAGEREF _Toc243165920 \h </w:instrText>
+              <w:instrText xml:space="preserve"> PAGEREF _Toc243302236 \h </w:instrText>
             </w:r>
             <w:r>
               <w:rPr>
@@ -2162,7 +2154,7 @@
               <w:rPr>
                 <w:noProof/>
               </w:rPr>
-              <w:t>20</w:t>
+              <w:t>21</w:t>
             </w:r>
             <w:r>
               <w:rPr>
@@ -2185,7 +2177,7 @@
               <w:szCs w:val="22"/>
             </w:rPr>
           </w:pPr>
-          <w:hyperlink w:anchor="_Toc243165921" w:history="1">
+          <w:hyperlink w:anchor="_Toc243302237" w:history="1">
             <w:r>
               <w:rPr>
                 <w:rStyle w:val="Hyperlink"/>
@@ -2209,7 +2201,7 @@
               <w:rPr>
                 <w:noProof/>
               </w:rPr>
-              <w:instrText xml:space="preserve"> PAGEREF _Toc243165921 \h </w:instrText>
+              <w:instrText xml:space="preserve"> PAGEREF _Toc243302237 \h </w:instrText>
             </w:r>
             <w:r>
               <w:rPr>
@@ -2226,7 +2218,7 @@
               <w:rPr>
                 <w:noProof/>
               </w:rPr>
-              <w:t>21</w:t>
+              <w:t>22</w:t>
             </w:r>
             <w:r>
               <w:rPr>
@@ -2249,7 +2241,7 @@
               <w:szCs w:val="22"/>
             </w:rPr>
           </w:pPr>
-          <w:hyperlink w:anchor="_Toc243165922" w:history="1">
+          <w:hyperlink w:anchor="_Toc243302238" w:history="1">
             <w:r>
               <w:rPr>
                 <w:rStyle w:val="Hyperlink"/>
@@ -2273,7 +2265,7 @@
               <w:rPr>
                 <w:noProof/>
               </w:rPr>
-              <w:instrText xml:space="preserve"> PAGEREF _Toc243165922 \h </w:instrText>
+              <w:instrText xml:space="preserve"> PAGEREF _Toc243302238 \h </w:instrText>
             </w:r>
             <w:r>
               <w:rPr>
@@ -2290,7 +2282,7 @@
               <w:rPr>
                 <w:noProof/>
               </w:rPr>
-              <w:t>22</w:t>
+              <w:t>23</w:t>
             </w:r>
             <w:r>
               <w:rPr>
@@ -2313,7 +2305,7 @@
               <w:szCs w:val="22"/>
             </w:rPr>
           </w:pPr>
-          <w:hyperlink w:anchor="_Toc243165923" w:history="1">
+          <w:hyperlink w:anchor="_Toc243302239" w:history="1">
             <w:r>
               <w:rPr>
                 <w:rStyle w:val="Hyperlink"/>
@@ -2337,7 +2329,7 @@
               <w:rPr>
                 <w:noProof/>
               </w:rPr>
-              <w:instrText xml:space="preserve"> PAGEREF _Toc243165923 \h </w:instrText>
+              <w:instrText xml:space="preserve"> PAGEREF _Toc243302239 \h </w:instrText>
             </w:r>
             <w:r>
               <w:rPr>
@@ -2354,7 +2346,7 @@
               <w:rPr>
                 <w:noProof/>
               </w:rPr>
-              <w:t>22</w:t>
+              <w:t>23</w:t>
             </w:r>
             <w:r>
               <w:rPr>
@@ -2377,7 +2369,7 @@
               <w:szCs w:val="22"/>
             </w:rPr>
           </w:pPr>
-          <w:hyperlink w:anchor="_Toc243165924" w:history="1">
+          <w:hyperlink w:anchor="_Toc243302240" w:history="1">
             <w:r>
               <w:rPr>
                 <w:rStyle w:val="Hyperlink"/>
@@ -2401,7 +2393,7 @@
               <w:rPr>
                 <w:noProof/>
               </w:rPr>
-              <w:instrText xml:space="preserve"> PAGEREF _Toc243165924 \h </w:instrText>
+              <w:instrText xml:space="preserve"> PAGEREF _Toc243302240 \h </w:instrText>
             </w:r>
             <w:r>
               <w:rPr>
@@ -2418,7 +2410,7 @@
               <w:rPr>
                 <w:noProof/>
               </w:rPr>
-              <w:t>23</w:t>
+              <w:t>24</w:t>
             </w:r>
             <w:r>
               <w:rPr>
@@ -2440,7 +2432,7 @@
         <w:pStyle w:val="Heading1"/>
         <w:pageBreakBefore/>
       </w:pPr>
-      <w:bookmarkStart w:id="0" w:name="_Toc243165890"/>
+      <w:bookmarkStart w:id="0" w:name="_Toc243302206"/>
       <w:r>
         <w:lastRenderedPageBreak/>
         <w:t>1. Sebelum Mulai: Istilah Dasar</w:t>
@@ -2459,7 +2451,7 @@
       <w:pPr>
         <w:pStyle w:val="Heading2"/>
       </w:pPr>
-      <w:bookmarkStart w:id="1" w:name="_Toc243165891"/>
+      <w:bookmarkStart w:id="1" w:name="_Toc243302207"/>
       <w:r>
         <w:t>1.1 Susunan materi: Modul, Tingkat, dan Level</w:t>
       </w:r>
@@ -2987,7 +2979,7 @@
       <w:pPr>
         <w:pStyle w:val="Heading2"/>
       </w:pPr>
-      <w:bookmarkStart w:id="2" w:name="_Toc243165892"/>
+      <w:bookmarkStart w:id="2" w:name="_Toc243302208"/>
       <w:r>
         <w:t>1.2 Istilah kemajuan</w:t>
       </w:r>
@@ -3619,7 +3611,7 @@
       <w:pPr>
         <w:pStyle w:val="Heading2"/>
       </w:pPr>
-      <w:bookmarkStart w:id="3" w:name="_Toc243165893"/>
+      <w:bookmarkStart w:id="3" w:name="_Toc243302209"/>
       <w:r>
         <w:t>1.3 Sesi kelompok dan latihan mandiri</w:t>
       </w:r>
@@ -4179,6 +4171,103 @@
                 <w:sz w:val="19"/>
                 <w:szCs w:val="19"/>
               </w:rPr>
+              <w:t>Pembahasan &amp; Tinjau</w:t>
+            </w:r>
+          </w:p>
+        </w:tc>
+        <w:tc>
+          <w:tcPr>
+            <w:tcW w:w="3855" w:type="dxa"/>
+            <w:tcBorders>
+              <w:top w:val="single" w:sz="4" w:space="0" w:color="C9D3DE"/>
+              <w:left w:val="single" w:sz="4" w:space="0" w:color="C9D3DE"/>
+              <w:bottom w:val="single" w:sz="4" w:space="0" w:color="C9D3DE"/>
+              <w:right w:val="single" w:sz="4" w:space="0" w:color="C9D3DE"/>
+            </w:tcBorders>
+            <w:shd w:val="clear" w:color="auto" w:fill="F8FAFC"/>
+            <w:tcMar>
+              <w:top w:w="70" w:type="dxa"/>
+              <w:left w:w="110" w:type="dxa"/>
+              <w:bottom w:w="70" w:type="dxa"/>
+              <w:right w:w="110" w:type="dxa"/>
+            </w:tcMar>
+          </w:tcPr>
+          <w:p>
+            <w:pPr>
+              <w:spacing w:after="30"/>
+            </w:pPr>
+            <w:r>
+              <w:rPr>
+                <w:sz w:val="19"/>
+                <w:szCs w:val="19"/>
+              </w:rPr>
+              <w:t>Tidak ada. Sesi kelompok dipakai untuk mengukur kemampuan, jadi siswa hanya melihat jawaban benar (bila diizinkan).</w:t>
+            </w:r>
+          </w:p>
+        </w:tc>
+        <w:tc>
+          <w:tcPr>
+            <w:tcW w:w="3856" w:type="dxa"/>
+            <w:tcBorders>
+              <w:top w:val="single" w:sz="4" w:space="0" w:color="C9D3DE"/>
+              <w:left w:val="single" w:sz="4" w:space="0" w:color="C9D3DE"/>
+              <w:bottom w:val="single" w:sz="4" w:space="0" w:color="C9D3DE"/>
+              <w:right w:val="single" w:sz="4" w:space="0" w:color="C9D3DE"/>
+            </w:tcBorders>
+            <w:shd w:val="clear" w:color="auto" w:fill="F8FAFC"/>
+            <w:tcMar>
+              <w:top w:w="70" w:type="dxa"/>
+              <w:left w:w="110" w:type="dxa"/>
+              <w:bottom w:w="70" w:type="dxa"/>
+              <w:right w:w="110" w:type="dxa"/>
+            </w:tcMar>
+          </w:tcPr>
+          <w:p>
+            <w:pPr>
+              <w:spacing w:after="30"/>
+            </w:pPr>
+            <w:r>
+              <w:rPr>
+                <w:sz w:val="19"/>
+                <w:szCs w:val="19"/>
+              </w:rPr>
+              <w:t>Ada. Saat salah: pembahasan langkah demi langkah. Kartu Tinjau kesalahanku: soal yang salah di 5 sesi kelompok terakhir + Coba soal serupa.</w:t>
+            </w:r>
+          </w:p>
+        </w:tc>
+      </w:tr>
+      <w:tr>
+        <w:trPr>
+          <w:cantSplit/>
+        </w:trPr>
+        <w:tc>
+          <w:tcPr>
+            <w:tcW w:w="1927" w:type="dxa"/>
+            <w:tcBorders>
+              <w:top w:val="single" w:sz="4" w:space="0" w:color="C9D3DE"/>
+              <w:left w:val="single" w:sz="4" w:space="0" w:color="C9D3DE"/>
+              <w:bottom w:val="single" w:sz="4" w:space="0" w:color="C9D3DE"/>
+              <w:right w:val="single" w:sz="4" w:space="0" w:color="C9D3DE"/>
+            </w:tcBorders>
+            <w:shd w:val="clear" w:color="auto" w:fill="EEF3F8"/>
+            <w:tcMar>
+              <w:top w:w="70" w:type="dxa"/>
+              <w:left w:w="110" w:type="dxa"/>
+              <w:bottom w:w="70" w:type="dxa"/>
+              <w:right w:w="110" w:type="dxa"/>
+            </w:tcMar>
+          </w:tcPr>
+          <w:p>
+            <w:pPr>
+              <w:spacing w:after="30"/>
+            </w:pPr>
+            <w:r>
+              <w:rPr>
+                <w:b/>
+                <w:bCs/>
+                <w:sz w:val="19"/>
+                <w:szCs w:val="19"/>
+              </w:rPr>
               <w:t>Muncul di</w:t>
             </w:r>
           </w:p>
@@ -4322,9 +4411,25 @@
     </w:p>
     <w:p>
       <w:pPr>
+        <w:spacing w:after="120" w:line="276" w:lineRule="auto"/>
+      </w:pPr>
+      <w:r>
+        <w:t>Pembahasan di latihan mandiri disusun otomatis untuk setiap soal (MD10, MD11, MD12) dari soal dan kunci yang sama dengan yang diperiksa server: cara bersusun, porogapit, aturan tanda, KPK, letak koma, persen, eksponen, pindah ruas, eliminasi, pola, dan pola penalaran. Langkah yang berkaitan dengan jenis kesalahan siswa ditandai “← perhatikan”. Pembahasan juga tidak muncul bila jawaban benar disembunyikan.</w:t>
+      </w:r>
+    </w:p>
+    <w:p>
+      <w:pPr>
+        <w:spacing w:after="120" w:line="276" w:lineRule="auto"/>
+      </w:pPr>
+      <w:r>
+        <w:t>Kartu Tinjau kesalahanku hanya berisi sesi kelompok yang sudah selesai. “Coba soal serupa” memberi satu soal baru dari level yang sama; bila benar, kesalahan itu ditandai “sudah dipahami”. Keduanya tidak mengubah posisi maupun nilai resmi. Guru melihat hasilnya di Analisis Siswa (bagian 4.5).</w:t>
+      </w:r>
+    </w:p>
+    <w:p>
+      <w:pPr>
         <w:pStyle w:val="Heading2"/>
       </w:pPr>
-      <w:bookmarkStart w:id="4" w:name="_Toc243165894"/>
+      <w:bookmarkStart w:id="4" w:name="_Toc243302210"/>
       <w:r>
         <w:t>1.4 Pertemuan terakhir</w:t>
       </w:r>
@@ -4418,7 +4523,7 @@
       <w:pPr>
         <w:pStyle w:val="Heading2"/>
       </w:pPr>
-      <w:bookmarkStart w:id="5" w:name="_Toc243165895"/>
+      <w:bookmarkStart w:id="5" w:name="_Toc243302211"/>
       <w:r>
         <w:t>1.5 Arti warna label</w:t>
       </w:r>
@@ -4483,6 +4588,7 @@
                 <w:sz w:val="19"/>
                 <w:szCs w:val="19"/>
               </w:rPr>
+              <w:lastRenderedPageBreak/>
               <w:t>Warna</w:t>
             </w:r>
           </w:p>
@@ -5080,7 +5186,6 @@
                 <w:sz w:val="20"/>
                 <w:szCs w:val="20"/>
               </w:rPr>
-              <w:lastRenderedPageBreak/>
               <w:t>Kebiasaan yang membantu</w:t>
             </w:r>
           </w:p>
@@ -5124,7 +5229,7 @@
       <w:pPr>
         <w:pStyle w:val="Heading2"/>
       </w:pPr>
-      <w:bookmarkStart w:id="6" w:name="_Toc243165896"/>
+      <w:bookmarkStart w:id="6" w:name="_Toc243302212"/>
       <w:r>
         <w:t>1.6 Profil aturan dan tahapan khusus</w:t>
       </w:r>
@@ -5740,6 +5845,7 @@
           <w:b/>
           <w:bCs/>
         </w:rPr>
+        <w:lastRenderedPageBreak/>
         <w:t>Aturan dasar</w:t>
       </w:r>
       <w:r>
@@ -5904,7 +6010,7 @@
         <w:pStyle w:val="Heading1"/>
         <w:pageBreakBefore/>
       </w:pPr>
-      <w:bookmarkStart w:id="7" w:name="_Toc243165897"/>
+      <w:bookmarkStart w:id="7" w:name="_Toc243302213"/>
       <w:r>
         <w:lastRenderedPageBreak/>
         <w:t>2. Tab Sesi Kegiatan</w:t>
@@ -6051,7 +6157,7 @@
       <w:pPr>
         <w:pStyle w:val="Heading2"/>
       </w:pPr>
-      <w:bookmarkStart w:id="8" w:name="_Toc243165898"/>
+      <w:bookmarkStart w:id="8" w:name="_Toc243302214"/>
       <w:r>
         <w:t>2.1 Bilah saringan</w:t>
       </w:r>
@@ -6551,7 +6657,7 @@
       <w:pPr>
         <w:pStyle w:val="Heading2"/>
       </w:pPr>
-      <w:bookmarkStart w:id="9" w:name="_Toc243165899"/>
+      <w:bookmarkStart w:id="9" w:name="_Toc243302215"/>
       <w:r>
         <w:t>2.2 Kartu Sesi latihan</w:t>
       </w:r>
@@ -7368,7 +7474,7 @@
       <w:pPr>
         <w:pStyle w:val="Heading2"/>
       </w:pPr>
-      <w:bookmarkStart w:id="10" w:name="_Toc243165900"/>
+      <w:bookmarkStart w:id="10" w:name="_Toc243302216"/>
       <w:r>
         <w:t>2.3 Kotak Aturan dan tahapan yang berlaku</w:t>
       </w:r>
@@ -7721,7 +7827,7 @@
       <w:pPr>
         <w:pStyle w:val="Heading2"/>
       </w:pPr>
-      <w:bookmarkStart w:id="11" w:name="_Toc243165901"/>
+      <w:bookmarkStart w:id="11" w:name="_Toc243302217"/>
       <w:r>
         <w:t>2.4 Enam kotak ringkasan</w:t>
       </w:r>
@@ -8837,7 +8943,7 @@
       <w:pPr>
         <w:pStyle w:val="Heading2"/>
       </w:pPr>
-      <w:bookmarkStart w:id="12" w:name="_Toc243165902"/>
+      <w:bookmarkStart w:id="12" w:name="_Toc243302218"/>
       <w:r>
         <w:t>2.5 Tabel siswa</w:t>
       </w:r>
@@ -9402,7 +9508,7 @@
       <w:pPr>
         <w:pStyle w:val="Heading2"/>
       </w:pPr>
-      <w:bookmarkStart w:id="13" w:name="_Toc243165903"/>
+      <w:bookmarkStart w:id="13" w:name="_Toc243302219"/>
       <w:r>
         <w:t>2.6 Arti kolom Status</w:t>
       </w:r>
@@ -10407,7 +10513,7 @@
       <w:pPr>
         <w:pStyle w:val="Heading2"/>
       </w:pPr>
-      <w:bookmarkStart w:id="14" w:name="_Toc243165904"/>
+      <w:bookmarkStart w:id="14" w:name="_Toc243302220"/>
       <w:r>
         <w:t>2.7 Bilah aksi untuk siswa terpilih</w:t>
       </w:r>
@@ -10845,7 +10951,7 @@
         <w:pStyle w:val="Heading1"/>
         <w:pageBreakBefore/>
       </w:pPr>
-      <w:bookmarkStart w:id="15" w:name="_Toc243165905"/>
+      <w:bookmarkStart w:id="15" w:name="_Toc243302221"/>
       <w:r>
         <w:lastRenderedPageBreak/>
         <w:t>3. Tab Perkembangan Siswa</w:t>
@@ -10945,7 +11051,7 @@
       <w:pPr>
         <w:pStyle w:val="Heading2"/>
       </w:pPr>
-      <w:bookmarkStart w:id="16" w:name="_Toc243165906"/>
+      <w:bookmarkStart w:id="16" w:name="_Toc243302222"/>
       <w:r>
         <w:t>3.1 Sub-tab Per Siswa</w:t>
       </w:r>
@@ -14217,7 +14323,7 @@
       <w:pPr>
         <w:pStyle w:val="Heading2"/>
       </w:pPr>
-      <w:bookmarkStart w:id="17" w:name="_Toc243165907"/>
+      <w:bookmarkStart w:id="17" w:name="_Toc243302223"/>
       <w:r>
         <w:t>3.2 Sub-tab Per Kelompok</w:t>
       </w:r>
@@ -15959,7 +16065,7 @@
       <w:pPr>
         <w:pStyle w:val="Heading2"/>
       </w:pPr>
-      <w:bookmarkStart w:id="18" w:name="_Toc243165908"/>
+      <w:bookmarkStart w:id="18" w:name="_Toc243302224"/>
       <w:r>
         <w:lastRenderedPageBreak/>
         <w:t>3.3 Sub-tab Peringkat</w:t>
@@ -19707,7 +19813,7 @@
         <w:pStyle w:val="Heading1"/>
         <w:pageBreakBefore/>
       </w:pPr>
-      <w:bookmarkStart w:id="19" w:name="_Toc243165909"/>
+      <w:bookmarkStart w:id="19" w:name="_Toc243302225"/>
       <w:r>
         <w:lastRenderedPageBreak/>
         <w:t>4. Tab Analisis Siswa</w:t>
@@ -20986,7 +21092,7 @@
       <w:pPr>
         <w:pStyle w:val="Heading2"/>
       </w:pPr>
-      <w:bookmarkStart w:id="20" w:name="_Toc243165910"/>
+      <w:bookmarkStart w:id="20" w:name="_Toc243302226"/>
       <w:r>
         <w:t>4.1 Kartu identitas</w:t>
       </w:r>
@@ -21014,7 +21120,7 @@
       <w:pPr>
         <w:pStyle w:val="Heading2"/>
       </w:pPr>
-      <w:bookmarkStart w:id="21" w:name="_Toc243165911"/>
+      <w:bookmarkStart w:id="21" w:name="_Toc243302227"/>
       <w:r>
         <w:t>4.2 Lima kotak ringkasan</w:t>
       </w:r>
@@ -21898,7 +22004,7 @@
       <w:pPr>
         <w:pStyle w:val="Heading2"/>
       </w:pPr>
-      <w:bookmarkStart w:id="22" w:name="_Toc243165912"/>
+      <w:bookmarkStart w:id="22" w:name="_Toc243302228"/>
       <w:r>
         <w:t>4.3 Aturan dan tahapan yang berlaku</w:t>
       </w:r>
@@ -22203,7 +22309,7 @@
       <w:pPr>
         <w:pStyle w:val="Heading2"/>
       </w:pPr>
-      <w:bookmarkStart w:id="23" w:name="_Toc243165913"/>
+      <w:bookmarkStart w:id="23" w:name="_Toc243302229"/>
       <w:r>
         <w:t>4.4 Catatan otomatis</w:t>
       </w:r>
@@ -22955,7 +23061,7 @@
       <w:pPr>
         <w:pStyle w:val="Heading2"/>
       </w:pPr>
-      <w:bookmarkStart w:id="24" w:name="_Toc243165914"/>
+      <w:bookmarkStart w:id="24" w:name="_Toc243302230"/>
       <w:r>
         <w:t>4.5 Kartu Latihan mandiri (di luar sesi)</w:t>
       </w:r>
@@ -23396,6 +23502,266 @@
           </w:p>
         </w:tc>
       </w:tr>
+      <w:tr>
+        <w:trPr>
+          <w:cantSplit/>
+        </w:trPr>
+        <w:tc>
+          <w:tcPr>
+            <w:tcW w:w="3373" w:type="dxa"/>
+            <w:tcBorders>
+              <w:top w:val="single" w:sz="4" w:space="0" w:color="C9D3DE"/>
+              <w:left w:val="single" w:sz="4" w:space="0" w:color="C9D3DE"/>
+              <w:bottom w:val="single" w:sz="4" w:space="0" w:color="C9D3DE"/>
+              <w:right w:val="single" w:sz="4" w:space="0" w:color="C9D3DE"/>
+            </w:tcBorders>
+            <w:tcMar>
+              <w:top w:w="70" w:type="dxa"/>
+              <w:left w:w="110" w:type="dxa"/>
+              <w:bottom w:w="70" w:type="dxa"/>
+              <w:right w:w="110" w:type="dxa"/>
+            </w:tcMar>
+          </w:tcPr>
+          <w:p>
+            <w:pPr>
+              <w:spacing w:after="30"/>
+            </w:pPr>
+            <w:r>
+              <w:rPr>
+                <w:b/>
+                <w:bCs/>
+                <w:sz w:val="19"/>
+                <w:szCs w:val="19"/>
+              </w:rPr>
+              <w:t>soal salah di 5 sesi terakhir</w:t>
+            </w:r>
+          </w:p>
+        </w:tc>
+        <w:tc>
+          <w:tcPr>
+            <w:tcW w:w="6265" w:type="dxa"/>
+            <w:tcBorders>
+              <w:top w:val="single" w:sz="4" w:space="0" w:color="C9D3DE"/>
+              <w:left w:val="single" w:sz="4" w:space="0" w:color="C9D3DE"/>
+              <w:bottom w:val="single" w:sz="4" w:space="0" w:color="C9D3DE"/>
+              <w:right w:val="single" w:sz="4" w:space="0" w:color="C9D3DE"/>
+            </w:tcBorders>
+            <w:tcMar>
+              <w:top w:w="70" w:type="dxa"/>
+              <w:left w:w="110" w:type="dxa"/>
+              <w:bottom w:w="70" w:type="dxa"/>
+              <w:right w:w="110" w:type="dxa"/>
+            </w:tcMar>
+          </w:tcPr>
+          <w:p>
+            <w:pPr>
+              <w:spacing w:after="30"/>
+            </w:pPr>
+            <w:r>
+              <w:rPr>
+                <w:sz w:val="19"/>
+                <w:szCs w:val="19"/>
+              </w:rPr>
+              <w:t>Bagian Tinjau kesalahan sesi kelompok: soal yang salah di 5 sesi kelompok terakhir (yang sudah selesai).</w:t>
+            </w:r>
+          </w:p>
+        </w:tc>
+      </w:tr>
+      <w:tr>
+        <w:trPr>
+          <w:cantSplit/>
+        </w:trPr>
+        <w:tc>
+          <w:tcPr>
+            <w:tcW w:w="3373" w:type="dxa"/>
+            <w:tcBorders>
+              <w:top w:val="single" w:sz="4" w:space="0" w:color="C9D3DE"/>
+              <w:left w:val="single" w:sz="4" w:space="0" w:color="C9D3DE"/>
+              <w:bottom w:val="single" w:sz="4" w:space="0" w:color="C9D3DE"/>
+              <w:right w:val="single" w:sz="4" w:space="0" w:color="C9D3DE"/>
+            </w:tcBorders>
+            <w:tcMar>
+              <w:top w:w="70" w:type="dxa"/>
+              <w:left w:w="110" w:type="dxa"/>
+              <w:bottom w:w="70" w:type="dxa"/>
+              <w:right w:w="110" w:type="dxa"/>
+            </w:tcMar>
+          </w:tcPr>
+          <w:p>
+            <w:pPr>
+              <w:spacing w:after="30"/>
+            </w:pPr>
+            <w:r>
+              <w:rPr>
+                <w:b/>
+                <w:bCs/>
+                <w:sz w:val="19"/>
+                <w:szCs w:val="19"/>
+              </w:rPr>
+              <w:t>pembahasan dibuka (x%)</w:t>
+            </w:r>
+          </w:p>
+        </w:tc>
+        <w:tc>
+          <w:tcPr>
+            <w:tcW w:w="6265" w:type="dxa"/>
+            <w:tcBorders>
+              <w:top w:val="single" w:sz="4" w:space="0" w:color="C9D3DE"/>
+              <w:left w:val="single" w:sz="4" w:space="0" w:color="C9D3DE"/>
+              <w:bottom w:val="single" w:sz="4" w:space="0" w:color="C9D3DE"/>
+              <w:right w:val="single" w:sz="4" w:space="0" w:color="C9D3DE"/>
+            </w:tcBorders>
+            <w:tcMar>
+              <w:top w:w="70" w:type="dxa"/>
+              <w:left w:w="110" w:type="dxa"/>
+              <w:bottom w:w="70" w:type="dxa"/>
+              <w:right w:w="110" w:type="dxa"/>
+            </w:tcMar>
+          </w:tcPr>
+          <w:p>
+            <w:pPr>
+              <w:spacing w:after="30"/>
+            </w:pPr>
+            <w:r>
+              <w:rPr>
+                <w:sz w:val="19"/>
+                <w:szCs w:val="19"/>
+              </w:rPr>
+              <w:t>Berapa di antaranya yang pembahasannya sudah dibuka siswa. Kuning bila 0.</w:t>
+            </w:r>
+          </w:p>
+        </w:tc>
+      </w:tr>
+      <w:tr>
+        <w:trPr>
+          <w:cantSplit/>
+        </w:trPr>
+        <w:tc>
+          <w:tcPr>
+            <w:tcW w:w="3373" w:type="dxa"/>
+            <w:tcBorders>
+              <w:top w:val="single" w:sz="4" w:space="0" w:color="C9D3DE"/>
+              <w:left w:val="single" w:sz="4" w:space="0" w:color="C9D3DE"/>
+              <w:bottom w:val="single" w:sz="4" w:space="0" w:color="C9D3DE"/>
+              <w:right w:val="single" w:sz="4" w:space="0" w:color="C9D3DE"/>
+            </w:tcBorders>
+            <w:tcMar>
+              <w:top w:w="70" w:type="dxa"/>
+              <w:left w:w="110" w:type="dxa"/>
+              <w:bottom w:w="70" w:type="dxa"/>
+              <w:right w:w="110" w:type="dxa"/>
+            </w:tcMar>
+          </w:tcPr>
+          <w:p>
+            <w:pPr>
+              <w:spacing w:after="30"/>
+            </w:pPr>
+            <w:r>
+              <w:rPr>
+                <w:b/>
+                <w:bCs/>
+                <w:sz w:val="19"/>
+                <w:szCs w:val="19"/>
+              </w:rPr>
+              <w:t>sudah dipahami (x%)</w:t>
+            </w:r>
+          </w:p>
+        </w:tc>
+        <w:tc>
+          <w:tcPr>
+            <w:tcW w:w="6265" w:type="dxa"/>
+            <w:tcBorders>
+              <w:top w:val="single" w:sz="4" w:space="0" w:color="C9D3DE"/>
+              <w:left w:val="single" w:sz="4" w:space="0" w:color="C9D3DE"/>
+              <w:bottom w:val="single" w:sz="4" w:space="0" w:color="C9D3DE"/>
+              <w:right w:val="single" w:sz="4" w:space="0" w:color="C9D3DE"/>
+            </w:tcBorders>
+            <w:tcMar>
+              <w:top w:w="70" w:type="dxa"/>
+              <w:left w:w="110" w:type="dxa"/>
+              <w:bottom w:w="70" w:type="dxa"/>
+              <w:right w:w="110" w:type="dxa"/>
+            </w:tcMar>
+          </w:tcPr>
+          <w:p>
+            <w:pPr>
+              <w:spacing w:after="30"/>
+            </w:pPr>
+            <w:r>
+              <w:rPr>
+                <w:sz w:val="19"/>
+                <w:szCs w:val="19"/>
+              </w:rPr>
+              <w:t>Berapa yang sudah dibuktikan benar lewat Coba soal serupa.</w:t>
+            </w:r>
+          </w:p>
+        </w:tc>
+      </w:tr>
+      <w:tr>
+        <w:trPr>
+          <w:cantSplit/>
+        </w:trPr>
+        <w:tc>
+          <w:tcPr>
+            <w:tcW w:w="3373" w:type="dxa"/>
+            <w:tcBorders>
+              <w:top w:val="single" w:sz="4" w:space="0" w:color="C9D3DE"/>
+              <w:left w:val="single" w:sz="4" w:space="0" w:color="C9D3DE"/>
+              <w:bottom w:val="single" w:sz="4" w:space="0" w:color="C9D3DE"/>
+              <w:right w:val="single" w:sz="4" w:space="0" w:color="C9D3DE"/>
+            </w:tcBorders>
+            <w:tcMar>
+              <w:top w:w="70" w:type="dxa"/>
+              <w:left w:w="110" w:type="dxa"/>
+              <w:bottom w:w="70" w:type="dxa"/>
+              <w:right w:w="110" w:type="dxa"/>
+            </w:tcMar>
+          </w:tcPr>
+          <w:p>
+            <w:pPr>
+              <w:spacing w:after="30"/>
+            </w:pPr>
+            <w:r>
+              <w:rPr>
+                <w:b/>
+                <w:bCs/>
+                <w:sz w:val="19"/>
+                <w:szCs w:val="19"/>
+              </w:rPr>
+              <w:t>soal serupa dijawab</w:t>
+            </w:r>
+          </w:p>
+        </w:tc>
+        <w:tc>
+          <w:tcPr>
+            <w:tcW w:w="6265" w:type="dxa"/>
+            <w:tcBorders>
+              <w:top w:val="single" w:sz="4" w:space="0" w:color="C9D3DE"/>
+              <w:left w:val="single" w:sz="4" w:space="0" w:color="C9D3DE"/>
+              <w:bottom w:val="single" w:sz="4" w:space="0" w:color="C9D3DE"/>
+              <w:right w:val="single" w:sz="4" w:space="0" w:color="C9D3DE"/>
+            </w:tcBorders>
+            <w:tcMar>
+              <w:top w:w="70" w:type="dxa"/>
+              <w:left w:w="110" w:type="dxa"/>
+              <w:bottom w:w="70" w:type="dxa"/>
+              <w:right w:w="110" w:type="dxa"/>
+            </w:tcMar>
+          </w:tcPr>
+          <w:p>
+            <w:pPr>
+              <w:spacing w:after="30"/>
+            </w:pPr>
+            <w:r>
+              <w:rPr>
+                <w:sz w:val="19"/>
+                <w:szCs w:val="19"/>
+              </w:rPr>
+              <w:t>Banyak soal serupa yang dikerjakan (benar maupun salah); menunjukkan kesungguhan belajar dari kesalahan.</w:t>
+            </w:r>
+          </w:p>
+        </w:tc>
+      </w:tr>
     </w:tbl>
     <w:p>
       <w:pPr>
@@ -23412,9 +23778,17 @@
     </w:p>
     <w:p>
       <w:pPr>
+        <w:spacing w:after="120" w:line="276" w:lineRule="auto"/>
+      </w:pPr>
+      <w:r>
+        <w:t>Catatan otomatis ikut menyebut “Belum meninjau N soal …” bila siswa belum membuka satu pun pembahasan, atau “Meninjau kesalahan sesi kelompok: x dari N …” bila sudah. Siswa yang banyak salah tetapi tidak pernah meninjau perlu diajak membuka Tinjau kesalahanku di rumah.</w:t>
+      </w:r>
+    </w:p>
+    <w:p>
+      <w:pPr>
         <w:pStyle w:val="Heading2"/>
       </w:pPr>
-      <w:bookmarkStart w:id="25" w:name="_Toc243165915"/>
+      <w:bookmarkStart w:id="25" w:name="_Toc243302231"/>
       <w:r>
         <w:t>4.6 Riwayat semester (arsip)</w:t>
       </w:r>
@@ -23512,7 +23886,7 @@
       <w:pPr>
         <w:pStyle w:val="Heading2"/>
       </w:pPr>
-      <w:bookmarkStart w:id="26" w:name="_Toc243165916"/>
+      <w:bookmarkStart w:id="26" w:name="_Toc243302232"/>
       <w:r>
         <w:t>4.7 Grafik Kemajuan level tuntas</w:t>
       </w:r>
@@ -23853,6 +24227,7 @@
                 <w:sz w:val="19"/>
                 <w:szCs w:val="19"/>
               </w:rPr>
+              <w:lastRenderedPageBreak/>
               <w:t>Melambat setelah tanggal tertentu</w:t>
             </w:r>
           </w:p>
@@ -23898,7 +24273,7 @@
       <w:pPr>
         <w:pStyle w:val="Heading2"/>
       </w:pPr>
-      <w:bookmarkStart w:id="27" w:name="_Toc243165917"/>
+      <w:bookmarkStart w:id="27" w:name="_Toc243302233"/>
       <w:r>
         <w:t>4.8 Jenis kesalahan</w:t>
       </w:r>
@@ -23962,7 +24337,6 @@
                 <w:sz w:val="19"/>
                 <w:szCs w:val="19"/>
               </w:rPr>
-              <w:lastRenderedPageBreak/>
               <w:t>Jenis kesalahan</w:t>
             </w:r>
           </w:p>
@@ -25705,6 +26079,7 @@
                 <w:sz w:val="20"/>
                 <w:szCs w:val="20"/>
               </w:rPr>
+              <w:lastRenderedPageBreak/>
               <w:t>Cara memakai bagian ini</w:t>
             </w:r>
           </w:p>
@@ -25748,9 +26123,8 @@
       <w:pPr>
         <w:pStyle w:val="Heading2"/>
       </w:pPr>
-      <w:bookmarkStart w:id="28" w:name="_Toc243165918"/>
+      <w:bookmarkStart w:id="28" w:name="_Toc243302234"/>
       <w:r>
-        <w:lastRenderedPageBreak/>
         <w:t>4.9 Per tingkat</w:t>
       </w:r>
       <w:bookmarkEnd w:id="28"/>
@@ -26141,7 +26515,7 @@
       <w:pPr>
         <w:pStyle w:val="Heading2"/>
       </w:pPr>
-      <w:bookmarkStart w:id="29" w:name="_Toc243165919"/>
+      <w:bookmarkStart w:id="29" w:name="_Toc243302235"/>
       <w:r>
         <w:t>4.10 Kesalahan terakhir</w:t>
       </w:r>
@@ -26747,7 +27121,7 @@
       <w:pPr>
         <w:pStyle w:val="Heading2"/>
       </w:pPr>
-      <w:bookmarkStart w:id="30" w:name="_Toc243165920"/>
+      <w:bookmarkStart w:id="30" w:name="_Toc243302236"/>
       <w:r>
         <w:t>4.11 Riwayat level tuntas</w:t>
       </w:r>
@@ -27200,6 +27574,7 @@
                 <w:sz w:val="19"/>
                 <w:szCs w:val="19"/>
               </w:rPr>
+              <w:lastRenderedPageBreak/>
               <w:t>Salah</w:t>
             </w:r>
           </w:p>
@@ -27369,9 +27744,8 @@
       <w:pPr>
         <w:pStyle w:val="Heading2"/>
       </w:pPr>
-      <w:bookmarkStart w:id="31" w:name="_Toc243165921"/>
+      <w:bookmarkStart w:id="31" w:name="_Toc243302237"/>
       <w:r>
-        <w:lastRenderedPageBreak/>
         <w:t>4.12 Pindahkan posisi dan Hapus data latihan</w:t>
       </w:r>
       <w:bookmarkEnd w:id="31"/>
@@ -27550,7 +27924,7 @@
         <w:pStyle w:val="Heading1"/>
         <w:pageBreakBefore/>
       </w:pPr>
-      <w:bookmarkStart w:id="32" w:name="_Toc243165922"/>
+      <w:bookmarkStart w:id="32" w:name="_Toc243302238"/>
       <w:r>
         <w:lastRenderedPageBreak/>
         <w:t>5. Dari Data ke Tindakan</w:t>
@@ -27561,7 +27935,7 @@
       <w:pPr>
         <w:pStyle w:val="Heading2"/>
       </w:pPr>
-      <w:bookmarkStart w:id="33" w:name="_Toc243165923"/>
+      <w:bookmarkStart w:id="33" w:name="_Toc243302239"/>
       <w:r>
         <w:t>5.1 Situasi umum dan tindakan</w:t>
       </w:r>
@@ -28669,7 +29043,7 @@
         <w:pStyle w:val="Heading2"/>
         <w:pageBreakBefore/>
       </w:pPr>
-      <w:bookmarkStart w:id="34" w:name="_Toc243165924"/>
+      <w:bookmarkStart w:id="34" w:name="_Toc243302240"/>
       <w:r>
         <w:lastRenderedPageBreak/>
         <w:t>5.2 Tanya jawab singkat</w:t>
@@ -29482,6 +29856,225 @@
                 <w:szCs w:val="19"/>
               </w:rPr>
               <w:t>Buka Perkembangan Siswa → Peringkat → jenis Paling rajin latihan mandiri, lalu pilih periode (mis. 30 hari). Guru hanya melihat siswa dari kelompok yang diajarnya (mengajar dua kelompok = siswa dari kedua kelompok itu); admin melihat semua kelompok. Siswa yang belum berlatih mandiri dalam periode itu tidak masuk daftar.</w:t>
+            </w:r>
+          </w:p>
+        </w:tc>
+      </w:tr>
+      <w:tr>
+        <w:trPr>
+          <w:cantSplit/>
+        </w:trPr>
+        <w:tc>
+          <w:tcPr>
+            <w:tcW w:w="3855" w:type="dxa"/>
+            <w:tcBorders>
+              <w:top w:val="single" w:sz="4" w:space="0" w:color="C9D3DE"/>
+              <w:left w:val="single" w:sz="4" w:space="0" w:color="C9D3DE"/>
+              <w:bottom w:val="single" w:sz="4" w:space="0" w:color="C9D3DE"/>
+              <w:right w:val="single" w:sz="4" w:space="0" w:color="C9D3DE"/>
+            </w:tcBorders>
+            <w:shd w:val="clear" w:color="auto" w:fill="F8FAFC"/>
+            <w:tcMar>
+              <w:top w:w="70" w:type="dxa"/>
+              <w:left w:w="110" w:type="dxa"/>
+              <w:bottom w:w="70" w:type="dxa"/>
+              <w:right w:w="110" w:type="dxa"/>
+            </w:tcMar>
+          </w:tcPr>
+          <w:p>
+            <w:pPr>
+              <w:spacing w:after="30"/>
+              <w:rPr>
+                <w:sz w:val="19"/>
+                <w:szCs w:val="19"/>
+              </w:rPr>
+            </w:pPr>
+            <w:r>
+              <w:rPr>
+                <w:sz w:val="19"/>
+                <w:szCs w:val="19"/>
+              </w:rPr>
+              <w:t>Mengapa pembahasan tidak muncul saat sesi kelompok?</w:t>
+            </w:r>
+          </w:p>
+        </w:tc>
+        <w:tc>
+          <w:tcPr>
+            <w:tcW w:w="5783" w:type="dxa"/>
+            <w:tcBorders>
+              <w:top w:val="single" w:sz="4" w:space="0" w:color="C9D3DE"/>
+              <w:left w:val="single" w:sz="4" w:space="0" w:color="C9D3DE"/>
+              <w:bottom w:val="single" w:sz="4" w:space="0" w:color="C9D3DE"/>
+              <w:right w:val="single" w:sz="4" w:space="0" w:color="C9D3DE"/>
+            </w:tcBorders>
+            <w:shd w:val="clear" w:color="auto" w:fill="F8FAFC"/>
+            <w:tcMar>
+              <w:top w:w="70" w:type="dxa"/>
+              <w:left w:w="110" w:type="dxa"/>
+              <w:bottom w:w="70" w:type="dxa"/>
+              <w:right w:w="110" w:type="dxa"/>
+            </w:tcMar>
+          </w:tcPr>
+          <w:p>
+            <w:pPr>
+              <w:spacing w:after="30"/>
+              <w:rPr>
+                <w:sz w:val="19"/>
+                <w:szCs w:val="19"/>
+              </w:rPr>
+            </w:pPr>
+            <w:r>
+              <w:rPr>
+                <w:sz w:val="19"/>
+                <w:szCs w:val="19"/>
+              </w:rPr>
+              <w:t>Disengaja. Sesi kelompok untuk mengukur kemampuan. Pembahasan dan Tinjau kesalahanku hanya ada di latihan mandiri, yang harus diizinkan admin: Pengaturan Umum → Halaman Latihan → Latihan mandiri di luar sesi kelompok.</w:t>
+            </w:r>
+          </w:p>
+        </w:tc>
+      </w:tr>
+      <w:tr>
+        <w:trPr>
+          <w:cantSplit/>
+        </w:trPr>
+        <w:tc>
+          <w:tcPr>
+            <w:tcW w:w="3855" w:type="dxa"/>
+            <w:tcBorders>
+              <w:top w:val="single" w:sz="4" w:space="0" w:color="C9D3DE"/>
+              <w:left w:val="single" w:sz="4" w:space="0" w:color="C9D3DE"/>
+              <w:bottom w:val="single" w:sz="4" w:space="0" w:color="C9D3DE"/>
+              <w:right w:val="single" w:sz="4" w:space="0" w:color="C9D3DE"/>
+            </w:tcBorders>
+            <w:shd w:val="clear" w:color="auto" w:fill="F8FAFC"/>
+            <w:tcMar>
+              <w:top w:w="70" w:type="dxa"/>
+              <w:left w:w="110" w:type="dxa"/>
+              <w:bottom w:w="70" w:type="dxa"/>
+              <w:right w:w="110" w:type="dxa"/>
+            </w:tcMar>
+          </w:tcPr>
+          <w:p>
+            <w:pPr>
+              <w:spacing w:after="30"/>
+              <w:rPr>
+                <w:sz w:val="19"/>
+                <w:szCs w:val="19"/>
+              </w:rPr>
+            </w:pPr>
+            <w:r>
+              <w:rPr>
+                <w:sz w:val="19"/>
+                <w:szCs w:val="19"/>
+              </w:rPr>
+              <w:t>Bagaimana memeriksa isi pembahasan?</w:t>
+            </w:r>
+          </w:p>
+        </w:tc>
+        <w:tc>
+          <w:tcPr>
+            <w:tcW w:w="5783" w:type="dxa"/>
+            <w:tcBorders>
+              <w:top w:val="single" w:sz="4" w:space="0" w:color="C9D3DE"/>
+              <w:left w:val="single" w:sz="4" w:space="0" w:color="C9D3DE"/>
+              <w:bottom w:val="single" w:sz="4" w:space="0" w:color="C9D3DE"/>
+              <w:right w:val="single" w:sz="4" w:space="0" w:color="C9D3DE"/>
+            </w:tcBorders>
+            <w:shd w:val="clear" w:color="auto" w:fill="F8FAFC"/>
+            <w:tcMar>
+              <w:top w:w="70" w:type="dxa"/>
+              <w:left w:w="110" w:type="dxa"/>
+              <w:bottom w:w="70" w:type="dxa"/>
+              <w:right w:w="110" w:type="dxa"/>
+            </w:tcMar>
+          </w:tcPr>
+          <w:p>
+            <w:pPr>
+              <w:spacing w:after="30"/>
+              <w:rPr>
+                <w:sz w:val="19"/>
+                <w:szCs w:val="19"/>
+              </w:rPr>
+            </w:pPr>
+            <w:r>
+              <w:rPr>
+                <w:sz w:val="19"/>
+                <w:szCs w:val="19"/>
+              </w:rPr>
+              <w:t>Tab Tahapan Level → tombol Contoh → centang Tampilkan Jawaban, lalu buka “Cara mengerjakan” di bawah soal. Bisa juga tombol Coba (uji coba guru), lalu jawab salah dengan sengaja.</w:t>
+            </w:r>
+          </w:p>
+        </w:tc>
+      </w:tr>
+      <w:tr>
+        <w:trPr>
+          <w:cantSplit/>
+        </w:trPr>
+        <w:tc>
+          <w:tcPr>
+            <w:tcW w:w="3855" w:type="dxa"/>
+            <w:tcBorders>
+              <w:top w:val="single" w:sz="4" w:space="0" w:color="C9D3DE"/>
+              <w:left w:val="single" w:sz="4" w:space="0" w:color="C9D3DE"/>
+              <w:bottom w:val="single" w:sz="4" w:space="0" w:color="C9D3DE"/>
+              <w:right w:val="single" w:sz="4" w:space="0" w:color="C9D3DE"/>
+            </w:tcBorders>
+            <w:shd w:val="clear" w:color="auto" w:fill="F8FAFC"/>
+            <w:tcMar>
+              <w:top w:w="70" w:type="dxa"/>
+              <w:left w:w="110" w:type="dxa"/>
+              <w:bottom w:w="70" w:type="dxa"/>
+              <w:right w:w="110" w:type="dxa"/>
+            </w:tcMar>
+          </w:tcPr>
+          <w:p>
+            <w:pPr>
+              <w:spacing w:after="30"/>
+              <w:rPr>
+                <w:sz w:val="19"/>
+                <w:szCs w:val="19"/>
+              </w:rPr>
+            </w:pPr>
+            <w:r>
+              <w:rPr>
+                <w:sz w:val="19"/>
+                <w:szCs w:val="19"/>
+              </w:rPr>
+              <w:t>Apakah Coba soal serupa menaikkan nilai atau posisi?</w:t>
+            </w:r>
+          </w:p>
+        </w:tc>
+        <w:tc>
+          <w:tcPr>
+            <w:tcW w:w="5783" w:type="dxa"/>
+            <w:tcBorders>
+              <w:top w:val="single" w:sz="4" w:space="0" w:color="C9D3DE"/>
+              <w:left w:val="single" w:sz="4" w:space="0" w:color="C9D3DE"/>
+              <w:bottom w:val="single" w:sz="4" w:space="0" w:color="C9D3DE"/>
+              <w:right w:val="single" w:sz="4" w:space="0" w:color="C9D3DE"/>
+            </w:tcBorders>
+            <w:shd w:val="clear" w:color="auto" w:fill="F8FAFC"/>
+            <w:tcMar>
+              <w:top w:w="70" w:type="dxa"/>
+              <w:left w:w="110" w:type="dxa"/>
+              <w:bottom w:w="70" w:type="dxa"/>
+              <w:right w:w="110" w:type="dxa"/>
+            </w:tcMar>
+          </w:tcPr>
+          <w:p>
+            <w:pPr>
+              <w:spacing w:after="30"/>
+              <w:rPr>
+                <w:sz w:val="19"/>
+                <w:szCs w:val="19"/>
+              </w:rPr>
+            </w:pPr>
+            <w:r>
+              <w:rPr>
+                <w:sz w:val="19"/>
+                <w:szCs w:val="19"/>
+              </w:rPr>
+              <w:t>Tidak. Hanya menandai kesalahan itu “sudah dipahami”. Hasilnya terlihat di Analisis Siswa → kartu Latihan mandiri → Tinjau kesalahan sesi kelompok.</w:t>
             </w:r>
           </w:p>
         </w:tc>

</xml_diff>

<commit_message>
Lanjut dari nomor terakhir; pesan perangkat lain; pantauan Sesi Kegiatan
- Halaman siswa: masuk lagi melanjutkan dari nomor terakhir; HP yang tergeser
  karena NISN sama dipakai di perangkat lain mendapat pesan yang benar; "Sesi
  ditutup oleh guru" dibedakan dari "Waktu latihan habis".
- Sesi Kegiatan: jam pembaruan terakhir + tanda bila pembaruan gagal; balasan
  lama tidak lagi menimpa kelompok yang baru dipilih; catatan "NISN dipakai di
  perangkat lain N×".
- Keterangan "Lama satu sesi", README, dan panduan guru (docx/pdf) diperbarui.

Co-Authored-By: Claude Opus 5.5 <noreply@anthropic.com>
</commit_message>
<xml_diff>
--- a/Panduan_Membaca_Data_Matdas.docx
+++ b/Panduan_Membaca_Data_Matdas.docx
@@ -140,7 +140,7 @@
           <w:sz w:val="20"/>
           <w:szCs w:val="20"/>
         </w:rPr>
-        <w:t>Versi: 20 Oktober 2026, menambah pembahasan langkah demi langkah dan Tinjau kesalahanku di latihan mandiri (sesuai tampilan aplikasi per tanggal tersebut)</w:t>
+        <w:t>Versi: 20 Oktober 2026 (pembaruan sore): pembahasan dan Tinjau kesalahanku di latihan mandiri; siswa melanjutkan dari nomor terakhir, sesi siswa berakhir bersama sesi kelompok, dan tanda NISN dipakai di perangkat lain (sesuai tampilan aplikasi per tanggal tersebut)</w:t>
       </w:r>
     </w:p>
     <w:p>
@@ -193,7 +193,7 @@
           <w:r>
             <w:fldChar w:fldCharType="separate"/>
           </w:r>
-          <w:hyperlink w:anchor="_Toc243302206" w:history="1">
+          <w:hyperlink w:anchor="_Toc243379218" w:history="1">
             <w:r>
               <w:rPr>
                 <w:rStyle w:val="Hyperlink"/>
@@ -217,7 +217,7 @@
               <w:rPr>
                 <w:noProof/>
               </w:rPr>
-              <w:instrText xml:space="preserve"> PAGEREF _Toc243302206 \h </w:instrText>
+              <w:instrText xml:space="preserve"> PAGEREF _Toc243379218 \h </w:instrText>
             </w:r>
             <w:r>
               <w:rPr>
@@ -257,7 +257,7 @@
               <w:szCs w:val="22"/>
             </w:rPr>
           </w:pPr>
-          <w:hyperlink w:anchor="_Toc243302207" w:history="1">
+          <w:hyperlink w:anchor="_Toc243379219" w:history="1">
             <w:r>
               <w:rPr>
                 <w:rStyle w:val="Hyperlink"/>
@@ -281,7 +281,7 @@
               <w:rPr>
                 <w:noProof/>
               </w:rPr>
-              <w:instrText xml:space="preserve"> PAGEREF _Toc243302207 \h </w:instrText>
+              <w:instrText xml:space="preserve"> PAGEREF _Toc243379219 \h </w:instrText>
             </w:r>
             <w:r>
               <w:rPr>
@@ -321,7 +321,7 @@
               <w:szCs w:val="22"/>
             </w:rPr>
           </w:pPr>
-          <w:hyperlink w:anchor="_Toc243302208" w:history="1">
+          <w:hyperlink w:anchor="_Toc243379220" w:history="1">
             <w:r>
               <w:rPr>
                 <w:rStyle w:val="Hyperlink"/>
@@ -345,7 +345,7 @@
               <w:rPr>
                 <w:noProof/>
               </w:rPr>
-              <w:instrText xml:space="preserve"> PAGEREF _Toc243302208 \h </w:instrText>
+              <w:instrText xml:space="preserve"> PAGEREF _Toc243379220 \h </w:instrText>
             </w:r>
             <w:r>
               <w:rPr>
@@ -385,7 +385,7 @@
               <w:szCs w:val="22"/>
             </w:rPr>
           </w:pPr>
-          <w:hyperlink w:anchor="_Toc243302209" w:history="1">
+          <w:hyperlink w:anchor="_Toc243379221" w:history="1">
             <w:r>
               <w:rPr>
                 <w:rStyle w:val="Hyperlink"/>
@@ -409,7 +409,7 @@
               <w:rPr>
                 <w:noProof/>
               </w:rPr>
-              <w:instrText xml:space="preserve"> PAGEREF _Toc243302209 \h </w:instrText>
+              <w:instrText xml:space="preserve"> PAGEREF _Toc243379221 \h </w:instrText>
             </w:r>
             <w:r>
               <w:rPr>
@@ -449,7 +449,7 @@
               <w:szCs w:val="22"/>
             </w:rPr>
           </w:pPr>
-          <w:hyperlink w:anchor="_Toc243302210" w:history="1">
+          <w:hyperlink w:anchor="_Toc243379222" w:history="1">
             <w:r>
               <w:rPr>
                 <w:rStyle w:val="Hyperlink"/>
@@ -473,7 +473,7 @@
               <w:rPr>
                 <w:noProof/>
               </w:rPr>
-              <w:instrText xml:space="preserve"> PAGEREF _Toc243302210 \h </w:instrText>
+              <w:instrText xml:space="preserve"> PAGEREF _Toc243379222 \h </w:instrText>
             </w:r>
             <w:r>
               <w:rPr>
@@ -513,7 +513,7 @@
               <w:szCs w:val="22"/>
             </w:rPr>
           </w:pPr>
-          <w:hyperlink w:anchor="_Toc243302211" w:history="1">
+          <w:hyperlink w:anchor="_Toc243379223" w:history="1">
             <w:r>
               <w:rPr>
                 <w:rStyle w:val="Hyperlink"/>
@@ -537,7 +537,7 @@
               <w:rPr>
                 <w:noProof/>
               </w:rPr>
-              <w:instrText xml:space="preserve"> PAGEREF _Toc243302211 \h </w:instrText>
+              <w:instrText xml:space="preserve"> PAGEREF _Toc243379223 \h </w:instrText>
             </w:r>
             <w:r>
               <w:rPr>
@@ -577,7 +577,7 @@
               <w:szCs w:val="22"/>
             </w:rPr>
           </w:pPr>
-          <w:hyperlink w:anchor="_Toc243302212" w:history="1">
+          <w:hyperlink w:anchor="_Toc243379224" w:history="1">
             <w:r>
               <w:rPr>
                 <w:rStyle w:val="Hyperlink"/>
@@ -601,7 +601,7 @@
               <w:rPr>
                 <w:noProof/>
               </w:rPr>
-              <w:instrText xml:space="preserve"> PAGEREF _Toc243302212 \h </w:instrText>
+              <w:instrText xml:space="preserve"> PAGEREF _Toc243379224 \h </w:instrText>
             </w:r>
             <w:r>
               <w:rPr>
@@ -641,7 +641,7 @@
               <w:szCs w:val="22"/>
             </w:rPr>
           </w:pPr>
-          <w:hyperlink w:anchor="_Toc243302213" w:history="1">
+          <w:hyperlink w:anchor="_Toc243379225" w:history="1">
             <w:r>
               <w:rPr>
                 <w:rStyle w:val="Hyperlink"/>
@@ -665,7 +665,7 @@
               <w:rPr>
                 <w:noProof/>
               </w:rPr>
-              <w:instrText xml:space="preserve"> PAGEREF _Toc243302213 \h </w:instrText>
+              <w:instrText xml:space="preserve"> PAGEREF _Toc243379225 \h </w:instrText>
             </w:r>
             <w:r>
               <w:rPr>
@@ -705,7 +705,7 @@
               <w:szCs w:val="22"/>
             </w:rPr>
           </w:pPr>
-          <w:hyperlink w:anchor="_Toc243302214" w:history="1">
+          <w:hyperlink w:anchor="_Toc243379226" w:history="1">
             <w:r>
               <w:rPr>
                 <w:rStyle w:val="Hyperlink"/>
@@ -729,7 +729,7 @@
               <w:rPr>
                 <w:noProof/>
               </w:rPr>
-              <w:instrText xml:space="preserve"> PAGEREF _Toc243302214 \h </w:instrText>
+              <w:instrText xml:space="preserve"> PAGEREF _Toc243379226 \h </w:instrText>
             </w:r>
             <w:r>
               <w:rPr>
@@ -769,7 +769,7 @@
               <w:szCs w:val="22"/>
             </w:rPr>
           </w:pPr>
-          <w:hyperlink w:anchor="_Toc243302215" w:history="1">
+          <w:hyperlink w:anchor="_Toc243379227" w:history="1">
             <w:r>
               <w:rPr>
                 <w:rStyle w:val="Hyperlink"/>
@@ -793,7 +793,7 @@
               <w:rPr>
                 <w:noProof/>
               </w:rPr>
-              <w:instrText xml:space="preserve"> PAGEREF _Toc243302215 \h </w:instrText>
+              <w:instrText xml:space="preserve"> PAGEREF _Toc243379227 \h </w:instrText>
             </w:r>
             <w:r>
               <w:rPr>
@@ -833,7 +833,7 @@
               <w:szCs w:val="22"/>
             </w:rPr>
           </w:pPr>
-          <w:hyperlink w:anchor="_Toc243302216" w:history="1">
+          <w:hyperlink w:anchor="_Toc243379228" w:history="1">
             <w:r>
               <w:rPr>
                 <w:rStyle w:val="Hyperlink"/>
@@ -857,7 +857,7 @@
               <w:rPr>
                 <w:noProof/>
               </w:rPr>
-              <w:instrText xml:space="preserve"> PAGEREF _Toc243302216 \h </w:instrText>
+              <w:instrText xml:space="preserve"> PAGEREF _Toc243379228 \h </w:instrText>
             </w:r>
             <w:r>
               <w:rPr>
@@ -897,7 +897,7 @@
               <w:szCs w:val="22"/>
             </w:rPr>
           </w:pPr>
-          <w:hyperlink w:anchor="_Toc243302217" w:history="1">
+          <w:hyperlink w:anchor="_Toc243379229" w:history="1">
             <w:r>
               <w:rPr>
                 <w:rStyle w:val="Hyperlink"/>
@@ -921,7 +921,7 @@
               <w:rPr>
                 <w:noProof/>
               </w:rPr>
-              <w:instrText xml:space="preserve"> PAGEREF _Toc243302217 \h </w:instrText>
+              <w:instrText xml:space="preserve"> PAGEREF _Toc243379229 \h </w:instrText>
             </w:r>
             <w:r>
               <w:rPr>
@@ -961,7 +961,7 @@
               <w:szCs w:val="22"/>
             </w:rPr>
           </w:pPr>
-          <w:hyperlink w:anchor="_Toc243302218" w:history="1">
+          <w:hyperlink w:anchor="_Toc243379230" w:history="1">
             <w:r>
               <w:rPr>
                 <w:rStyle w:val="Hyperlink"/>
@@ -985,7 +985,7 @@
               <w:rPr>
                 <w:noProof/>
               </w:rPr>
-              <w:instrText xml:space="preserve"> PAGEREF _Toc243302218 \h </w:instrText>
+              <w:instrText xml:space="preserve"> PAGEREF _Toc243379230 \h </w:instrText>
             </w:r>
             <w:r>
               <w:rPr>
@@ -1025,7 +1025,7 @@
               <w:szCs w:val="22"/>
             </w:rPr>
           </w:pPr>
-          <w:hyperlink w:anchor="_Toc243302219" w:history="1">
+          <w:hyperlink w:anchor="_Toc243379231" w:history="1">
             <w:r>
               <w:rPr>
                 <w:rStyle w:val="Hyperlink"/>
@@ -1049,7 +1049,7 @@
               <w:rPr>
                 <w:noProof/>
               </w:rPr>
-              <w:instrText xml:space="preserve"> PAGEREF _Toc243302219 \h </w:instrText>
+              <w:instrText xml:space="preserve"> PAGEREF _Toc243379231 \h </w:instrText>
             </w:r>
             <w:r>
               <w:rPr>
@@ -1089,7 +1089,7 @@
               <w:szCs w:val="22"/>
             </w:rPr>
           </w:pPr>
-          <w:hyperlink w:anchor="_Toc243302220" w:history="1">
+          <w:hyperlink w:anchor="_Toc243379232" w:history="1">
             <w:r>
               <w:rPr>
                 <w:rStyle w:val="Hyperlink"/>
@@ -1113,7 +1113,7 @@
               <w:rPr>
                 <w:noProof/>
               </w:rPr>
-              <w:instrText xml:space="preserve"> PAGEREF _Toc243302220 \h </w:instrText>
+              <w:instrText xml:space="preserve"> PAGEREF _Toc243379232 \h </w:instrText>
             </w:r>
             <w:r>
               <w:rPr>
@@ -1153,7 +1153,7 @@
               <w:szCs w:val="22"/>
             </w:rPr>
           </w:pPr>
-          <w:hyperlink w:anchor="_Toc243302221" w:history="1">
+          <w:hyperlink w:anchor="_Toc243379233" w:history="1">
             <w:r>
               <w:rPr>
                 <w:rStyle w:val="Hyperlink"/>
@@ -1177,7 +1177,7 @@
               <w:rPr>
                 <w:noProof/>
               </w:rPr>
-              <w:instrText xml:space="preserve"> PAGEREF _Toc243302221 \h </w:instrText>
+              <w:instrText xml:space="preserve"> PAGEREF _Toc243379233 \h </w:instrText>
             </w:r>
             <w:r>
               <w:rPr>
@@ -1217,7 +1217,7 @@
               <w:szCs w:val="22"/>
             </w:rPr>
           </w:pPr>
-          <w:hyperlink w:anchor="_Toc243302222" w:history="1">
+          <w:hyperlink w:anchor="_Toc243379234" w:history="1">
             <w:r>
               <w:rPr>
                 <w:rStyle w:val="Hyperlink"/>
@@ -1241,7 +1241,7 @@
               <w:rPr>
                 <w:noProof/>
               </w:rPr>
-              <w:instrText xml:space="preserve"> PAGEREF _Toc243302222 \h </w:instrText>
+              <w:instrText xml:space="preserve"> PAGEREF _Toc243379234 \h </w:instrText>
             </w:r>
             <w:r>
               <w:rPr>
@@ -1281,7 +1281,7 @@
               <w:szCs w:val="22"/>
             </w:rPr>
           </w:pPr>
-          <w:hyperlink w:anchor="_Toc243302223" w:history="1">
+          <w:hyperlink w:anchor="_Toc243379235" w:history="1">
             <w:r>
               <w:rPr>
                 <w:rStyle w:val="Hyperlink"/>
@@ -1305,7 +1305,7 @@
               <w:rPr>
                 <w:noProof/>
               </w:rPr>
-              <w:instrText xml:space="preserve"> PAGEREF _Toc243302223 \h </w:instrText>
+              <w:instrText xml:space="preserve"> PAGEREF _Toc243379235 \h </w:instrText>
             </w:r>
             <w:r>
               <w:rPr>
@@ -1345,7 +1345,7 @@
               <w:szCs w:val="22"/>
             </w:rPr>
           </w:pPr>
-          <w:hyperlink w:anchor="_Toc243302224" w:history="1">
+          <w:hyperlink w:anchor="_Toc243379236" w:history="1">
             <w:r>
               <w:rPr>
                 <w:rStyle w:val="Hyperlink"/>
@@ -1369,7 +1369,7 @@
               <w:rPr>
                 <w:noProof/>
               </w:rPr>
-              <w:instrText xml:space="preserve"> PAGEREF _Toc243302224 \h </w:instrText>
+              <w:instrText xml:space="preserve"> PAGEREF _Toc243379236 \h </w:instrText>
             </w:r>
             <w:r>
               <w:rPr>
@@ -1409,7 +1409,7 @@
               <w:szCs w:val="22"/>
             </w:rPr>
           </w:pPr>
-          <w:hyperlink w:anchor="_Toc243302225" w:history="1">
+          <w:hyperlink w:anchor="_Toc243379237" w:history="1">
             <w:r>
               <w:rPr>
                 <w:rStyle w:val="Hyperlink"/>
@@ -1433,7 +1433,7 @@
               <w:rPr>
                 <w:noProof/>
               </w:rPr>
-              <w:instrText xml:space="preserve"> PAGEREF _Toc243302225 \h </w:instrText>
+              <w:instrText xml:space="preserve"> PAGEREF _Toc243379237 \h </w:instrText>
             </w:r>
             <w:r>
               <w:rPr>
@@ -1473,7 +1473,7 @@
               <w:szCs w:val="22"/>
             </w:rPr>
           </w:pPr>
-          <w:hyperlink w:anchor="_Toc243302226" w:history="1">
+          <w:hyperlink w:anchor="_Toc243379238" w:history="1">
             <w:r>
               <w:rPr>
                 <w:rStyle w:val="Hyperlink"/>
@@ -1497,7 +1497,7 @@
               <w:rPr>
                 <w:noProof/>
               </w:rPr>
-              <w:instrText xml:space="preserve"> PAGEREF _Toc243302226 \h </w:instrText>
+              <w:instrText xml:space="preserve"> PAGEREF _Toc243379238 \h </w:instrText>
             </w:r>
             <w:r>
               <w:rPr>
@@ -1537,7 +1537,7 @@
               <w:szCs w:val="22"/>
             </w:rPr>
           </w:pPr>
-          <w:hyperlink w:anchor="_Toc243302227" w:history="1">
+          <w:hyperlink w:anchor="_Toc243379239" w:history="1">
             <w:r>
               <w:rPr>
                 <w:rStyle w:val="Hyperlink"/>
@@ -1561,7 +1561,7 @@
               <w:rPr>
                 <w:noProof/>
               </w:rPr>
-              <w:instrText xml:space="preserve"> PAGEREF _Toc243302227 \h </w:instrText>
+              <w:instrText xml:space="preserve"> PAGEREF _Toc243379239 \h </w:instrText>
             </w:r>
             <w:r>
               <w:rPr>
@@ -1601,7 +1601,7 @@
               <w:szCs w:val="22"/>
             </w:rPr>
           </w:pPr>
-          <w:hyperlink w:anchor="_Toc243302228" w:history="1">
+          <w:hyperlink w:anchor="_Toc243379240" w:history="1">
             <w:r>
               <w:rPr>
                 <w:rStyle w:val="Hyperlink"/>
@@ -1625,7 +1625,7 @@
               <w:rPr>
                 <w:noProof/>
               </w:rPr>
-              <w:instrText xml:space="preserve"> PAGEREF _Toc243302228 \h </w:instrText>
+              <w:instrText xml:space="preserve"> PAGEREF _Toc243379240 \h </w:instrText>
             </w:r>
             <w:r>
               <w:rPr>
@@ -1665,7 +1665,7 @@
               <w:szCs w:val="22"/>
             </w:rPr>
           </w:pPr>
-          <w:hyperlink w:anchor="_Toc243302229" w:history="1">
+          <w:hyperlink w:anchor="_Toc243379241" w:history="1">
             <w:r>
               <w:rPr>
                 <w:rStyle w:val="Hyperlink"/>
@@ -1689,7 +1689,7 @@
               <w:rPr>
                 <w:noProof/>
               </w:rPr>
-              <w:instrText xml:space="preserve"> PAGEREF _Toc243302229 \h </w:instrText>
+              <w:instrText xml:space="preserve"> PAGEREF _Toc243379241 \h </w:instrText>
             </w:r>
             <w:r>
               <w:rPr>
@@ -1729,7 +1729,7 @@
               <w:szCs w:val="22"/>
             </w:rPr>
           </w:pPr>
-          <w:hyperlink w:anchor="_Toc243302230" w:history="1">
+          <w:hyperlink w:anchor="_Toc243379242" w:history="1">
             <w:r>
               <w:rPr>
                 <w:rStyle w:val="Hyperlink"/>
@@ -1753,7 +1753,7 @@
               <w:rPr>
                 <w:noProof/>
               </w:rPr>
-              <w:instrText xml:space="preserve"> PAGEREF _Toc243302230 \h </w:instrText>
+              <w:instrText xml:space="preserve"> PAGEREF _Toc243379242 \h </w:instrText>
             </w:r>
             <w:r>
               <w:rPr>
@@ -1793,7 +1793,7 @@
               <w:szCs w:val="22"/>
             </w:rPr>
           </w:pPr>
-          <w:hyperlink w:anchor="_Toc243302231" w:history="1">
+          <w:hyperlink w:anchor="_Toc243379243" w:history="1">
             <w:r>
               <w:rPr>
                 <w:rStyle w:val="Hyperlink"/>
@@ -1817,7 +1817,7 @@
               <w:rPr>
                 <w:noProof/>
               </w:rPr>
-              <w:instrText xml:space="preserve"> PAGEREF _Toc243302231 \h </w:instrText>
+              <w:instrText xml:space="preserve"> PAGEREF _Toc243379243 \h </w:instrText>
             </w:r>
             <w:r>
               <w:rPr>
@@ -1857,7 +1857,7 @@
               <w:szCs w:val="22"/>
             </w:rPr>
           </w:pPr>
-          <w:hyperlink w:anchor="_Toc243302232" w:history="1">
+          <w:hyperlink w:anchor="_Toc243379244" w:history="1">
             <w:r>
               <w:rPr>
                 <w:rStyle w:val="Hyperlink"/>
@@ -1881,7 +1881,7 @@
               <w:rPr>
                 <w:noProof/>
               </w:rPr>
-              <w:instrText xml:space="preserve"> PAGEREF _Toc243302232 \h </w:instrText>
+              <w:instrText xml:space="preserve"> PAGEREF _Toc243379244 \h </w:instrText>
             </w:r>
             <w:r>
               <w:rPr>
@@ -1921,7 +1921,7 @@
               <w:szCs w:val="22"/>
             </w:rPr>
           </w:pPr>
-          <w:hyperlink w:anchor="_Toc243302233" w:history="1">
+          <w:hyperlink w:anchor="_Toc243379245" w:history="1">
             <w:r>
               <w:rPr>
                 <w:rStyle w:val="Hyperlink"/>
@@ -1945,7 +1945,7 @@
               <w:rPr>
                 <w:noProof/>
               </w:rPr>
-              <w:instrText xml:space="preserve"> PAGEREF _Toc243302233 \h </w:instrText>
+              <w:instrText xml:space="preserve"> PAGEREF _Toc243379245 \h </w:instrText>
             </w:r>
             <w:r>
               <w:rPr>
@@ -1985,7 +1985,7 @@
               <w:szCs w:val="22"/>
             </w:rPr>
           </w:pPr>
-          <w:hyperlink w:anchor="_Toc243302234" w:history="1">
+          <w:hyperlink w:anchor="_Toc243379246" w:history="1">
             <w:r>
               <w:rPr>
                 <w:rStyle w:val="Hyperlink"/>
@@ -2009,7 +2009,7 @@
               <w:rPr>
                 <w:noProof/>
               </w:rPr>
-              <w:instrText xml:space="preserve"> PAGEREF _Toc243302234 \h </w:instrText>
+              <w:instrText xml:space="preserve"> PAGEREF _Toc243379246 \h </w:instrText>
             </w:r>
             <w:r>
               <w:rPr>
@@ -2049,7 +2049,7 @@
               <w:szCs w:val="22"/>
             </w:rPr>
           </w:pPr>
-          <w:hyperlink w:anchor="_Toc243302235" w:history="1">
+          <w:hyperlink w:anchor="_Toc243379247" w:history="1">
             <w:r>
               <w:rPr>
                 <w:rStyle w:val="Hyperlink"/>
@@ -2073,7 +2073,7 @@
               <w:rPr>
                 <w:noProof/>
               </w:rPr>
-              <w:instrText xml:space="preserve"> PAGEREF _Toc243302235 \h </w:instrText>
+              <w:instrText xml:space="preserve"> PAGEREF _Toc243379247 \h </w:instrText>
             </w:r>
             <w:r>
               <w:rPr>
@@ -2113,7 +2113,7 @@
               <w:szCs w:val="22"/>
             </w:rPr>
           </w:pPr>
-          <w:hyperlink w:anchor="_Toc243302236" w:history="1">
+          <w:hyperlink w:anchor="_Toc243379248" w:history="1">
             <w:r>
               <w:rPr>
                 <w:rStyle w:val="Hyperlink"/>
@@ -2137,7 +2137,7 @@
               <w:rPr>
                 <w:noProof/>
               </w:rPr>
-              <w:instrText xml:space="preserve"> PAGEREF _Toc243302236 \h </w:instrText>
+              <w:instrText xml:space="preserve"> PAGEREF _Toc243379248 \h </w:instrText>
             </w:r>
             <w:r>
               <w:rPr>
@@ -2177,7 +2177,7 @@
               <w:szCs w:val="22"/>
             </w:rPr>
           </w:pPr>
-          <w:hyperlink w:anchor="_Toc243302237" w:history="1">
+          <w:hyperlink w:anchor="_Toc243379249" w:history="1">
             <w:r>
               <w:rPr>
                 <w:rStyle w:val="Hyperlink"/>
@@ -2201,7 +2201,7 @@
               <w:rPr>
                 <w:noProof/>
               </w:rPr>
-              <w:instrText xml:space="preserve"> PAGEREF _Toc243302237 \h </w:instrText>
+              <w:instrText xml:space="preserve"> PAGEREF _Toc243379249 \h </w:instrText>
             </w:r>
             <w:r>
               <w:rPr>
@@ -2241,7 +2241,7 @@
               <w:szCs w:val="22"/>
             </w:rPr>
           </w:pPr>
-          <w:hyperlink w:anchor="_Toc243302238" w:history="1">
+          <w:hyperlink w:anchor="_Toc243379250" w:history="1">
             <w:r>
               <w:rPr>
                 <w:rStyle w:val="Hyperlink"/>
@@ -2265,7 +2265,7 @@
               <w:rPr>
                 <w:noProof/>
               </w:rPr>
-              <w:instrText xml:space="preserve"> PAGEREF _Toc243302238 \h </w:instrText>
+              <w:instrText xml:space="preserve"> PAGEREF _Toc243379250 \h </w:instrText>
             </w:r>
             <w:r>
               <w:rPr>
@@ -2305,7 +2305,7 @@
               <w:szCs w:val="22"/>
             </w:rPr>
           </w:pPr>
-          <w:hyperlink w:anchor="_Toc243302239" w:history="1">
+          <w:hyperlink w:anchor="_Toc243379251" w:history="1">
             <w:r>
               <w:rPr>
                 <w:rStyle w:val="Hyperlink"/>
@@ -2329,7 +2329,7 @@
               <w:rPr>
                 <w:noProof/>
               </w:rPr>
-              <w:instrText xml:space="preserve"> PAGEREF _Toc243302239 \h </w:instrText>
+              <w:instrText xml:space="preserve"> PAGEREF _Toc243379251 \h </w:instrText>
             </w:r>
             <w:r>
               <w:rPr>
@@ -2369,7 +2369,7 @@
               <w:szCs w:val="22"/>
             </w:rPr>
           </w:pPr>
-          <w:hyperlink w:anchor="_Toc243302240" w:history="1">
+          <w:hyperlink w:anchor="_Toc243379252" w:history="1">
             <w:r>
               <w:rPr>
                 <w:rStyle w:val="Hyperlink"/>
@@ -2393,7 +2393,7 @@
               <w:rPr>
                 <w:noProof/>
               </w:rPr>
-              <w:instrText xml:space="preserve"> PAGEREF _Toc243302240 \h </w:instrText>
+              <w:instrText xml:space="preserve"> PAGEREF _Toc243379252 \h </w:instrText>
             </w:r>
             <w:r>
               <w:rPr>
@@ -2432,7 +2432,7 @@
         <w:pStyle w:val="Heading1"/>
         <w:pageBreakBefore/>
       </w:pPr>
-      <w:bookmarkStart w:id="0" w:name="_Toc243302206"/>
+      <w:bookmarkStart w:id="0" w:name="_Toc243379218"/>
       <w:r>
         <w:lastRenderedPageBreak/>
         <w:t>1. Sebelum Mulai: Istilah Dasar</w:t>
@@ -2451,7 +2451,7 @@
       <w:pPr>
         <w:pStyle w:val="Heading2"/>
       </w:pPr>
-      <w:bookmarkStart w:id="1" w:name="_Toc243302207"/>
+      <w:bookmarkStart w:id="1" w:name="_Toc243379219"/>
       <w:r>
         <w:t>1.1 Susunan materi: Modul, Tingkat, dan Level</w:t>
       </w:r>
@@ -2979,7 +2979,7 @@
       <w:pPr>
         <w:pStyle w:val="Heading2"/>
       </w:pPr>
-      <w:bookmarkStart w:id="2" w:name="_Toc243302208"/>
+      <w:bookmarkStart w:id="2" w:name="_Toc243379220"/>
       <w:r>
         <w:t>1.2 Istilah kemajuan</w:t>
       </w:r>
@@ -3397,7 +3397,7 @@
                 <w:sz w:val="19"/>
                 <w:szCs w:val="19"/>
               </w:rPr>
-              <w:t>Berapa kali siswa memulai level yang sama. Percobaan bertambah 1 setiap kali level diulang dari nomor 1 karena salah melebihi batas (bawaan: lebih dari 3 salah).</w:t>
+              <w:t>Berapa kali siswa memulai level yang sama. Percobaan bertambah 1 setiap kali level diulang dari nomor 1 karena salah melebihi batas (bawaan: lebih dari 3 salah). Masuk lagi untuk melanjutkan dari nomor terakhir tidak menambah percobaan.</w:t>
             </w:r>
           </w:p>
         </w:tc>
@@ -3611,7 +3611,7 @@
       <w:pPr>
         <w:pStyle w:val="Heading2"/>
       </w:pPr>
-      <w:bookmarkStart w:id="3" w:name="_Toc243302209"/>
+      <w:bookmarkStart w:id="3" w:name="_Toc243379221"/>
       <w:r>
         <w:t>1.3 Sesi kelompok dan latihan mandiri</w:t>
       </w:r>
@@ -4429,7 +4429,7 @@
       <w:pPr>
         <w:pStyle w:val="Heading2"/>
       </w:pPr>
-      <w:bookmarkStart w:id="4" w:name="_Toc243302210"/>
+      <w:bookmarkStart w:id="4" w:name="_Toc243379222"/>
       <w:r>
         <w:t>1.4 Pertemuan terakhir</w:t>
       </w:r>
@@ -4460,7 +4460,7 @@
         <w:t>Pertemuan terakhir</w:t>
       </w:r>
       <w:r>
-        <w:t xml:space="preserve"> = tanggal pertemuan Matdas terakhir kelompok itu menurut jadwal KBM di Data Induk.</w:t>
+        <w:t xml:space="preserve"> = tanggal pertemuan Matdas terakhir kelompok itu menurut jadwal KBM di Data Induk. Hari guru membuka sesi kelompok juga dihitung pertemuan, walau sesi dibuka sebelum jam di jadwal atau di luar hari jadwal.</w:t>
       </w:r>
     </w:p>
     <w:p>
@@ -4523,7 +4523,7 @@
       <w:pPr>
         <w:pStyle w:val="Heading2"/>
       </w:pPr>
-      <w:bookmarkStart w:id="5" w:name="_Toc243302211"/>
+      <w:bookmarkStart w:id="5" w:name="_Toc243379223"/>
       <w:r>
         <w:t>1.5 Arti warna label</w:t>
       </w:r>
@@ -5229,7 +5229,7 @@
       <w:pPr>
         <w:pStyle w:val="Heading2"/>
       </w:pPr>
-      <w:bookmarkStart w:id="6" w:name="_Toc243302212"/>
+      <w:bookmarkStart w:id="6" w:name="_Toc243379224"/>
       <w:r>
         <w:t>1.6 Profil aturan dan tahapan khusus</w:t>
       </w:r>
@@ -6010,7 +6010,7 @@
         <w:pStyle w:val="Heading1"/>
         <w:pageBreakBefore/>
       </w:pPr>
-      <w:bookmarkStart w:id="7" w:name="_Toc243302213"/>
+      <w:bookmarkStart w:id="7" w:name="_Toc243379225"/>
       <w:r>
         <w:lastRenderedPageBreak/>
         <w:t>2. Tab Sesi Kegiatan</w:t>
@@ -6032,7 +6032,7 @@
         <w:t>ruang kendali saat pelajaran berlangsung</w:t>
       </w:r>
       <w:r>
-        <w:t>. Gunanya: membuka sesi latihan, membagikan kode akses, melihat siapa yang sedang berlatih atau terkunci, dan mengatur siswa tertentu. Data diperbarui otomatis setiap 30 detik selama tab terbuka.</w:t>
+        <w:t>. Gunanya: membuka sesi latihan, membagikan kode akses, melihat siapa yang sedang berlatih atau terkunci, dan mengatur siswa tertentu. Data diperbarui otomatis setiap 30 detik selama tab terbuka; di bawah judul tertulis jam pembaruan terakhir. Bila pembaruan gagal (mis. sinyal), muncul tulisan merah “Gagal memperbarui …” dan angka di layar mungkin belum terbaru.</w:t>
       </w:r>
     </w:p>
     <w:p>
@@ -6157,7 +6157,7 @@
       <w:pPr>
         <w:pStyle w:val="Heading2"/>
       </w:pPr>
-      <w:bookmarkStart w:id="8" w:name="_Toc243302214"/>
+      <w:bookmarkStart w:id="8" w:name="_Toc243379226"/>
       <w:r>
         <w:t>2.1 Bilah saringan</w:t>
       </w:r>
@@ -6657,7 +6657,7 @@
       <w:pPr>
         <w:pStyle w:val="Heading2"/>
       </w:pPr>
-      <w:bookmarkStart w:id="9" w:name="_Toc243302215"/>
+      <w:bookmarkStart w:id="9" w:name="_Toc243379227"/>
       <w:r>
         <w:t>2.2 Kartu Sesi latihan</w:t>
       </w:r>
@@ -7090,7 +7090,7 @@
                 <w:sz w:val="19"/>
                 <w:szCs w:val="19"/>
               </w:rPr>
-              <w:t>Lama sesi (30–120 menit). Tanda "(profil)" = lama bawaan dari aturan dasar kelompok (profil kelompok atau aturan dasar tahapan) atau Pengaturan Umum.</w:t>
+              <w:t>Lama sesi (30–120 menit). Tanda "(profil)" = lama bawaan dari aturan dasar kelompok (profil kelompok atau aturan dasar tahapan) atau Pengaturan Umum. Sesi setiap siswa berakhir bersama sesi kelompok ini, berapa pun Lama satu sesi di profil.</w:t>
             </w:r>
           </w:p>
         </w:tc>
@@ -7127,6 +7127,7 @@
                 <w:sz w:val="19"/>
                 <w:szCs w:val="19"/>
               </w:rPr>
+              <w:lastRenderedPageBreak/>
               <w:t>QR &amp; kode masuk</w:t>
             </w:r>
           </w:p>
@@ -7193,7 +7194,6 @@
                 <w:sz w:val="19"/>
                 <w:szCs w:val="19"/>
               </w:rPr>
-              <w:lastRenderedPageBreak/>
               <w:t>Tampilkan teratas</w:t>
             </w:r>
           </w:p>
@@ -7371,7 +7371,7 @@
                 <w:sz w:val="19"/>
                 <w:szCs w:val="19"/>
               </w:rPr>
-              <w:t>Mengakhiri sesi. Siswa yang sedang berlatih dikeluarkan; kemajuannya tetap tersimpan.</w:t>
+              <w:t>Mengakhiri sesi. Siswa yang sedang berlatih dikeluarkan (layarnya bertuliskan “Sesi ditutup oleh guru”); kemajuannya, termasuk nomor soal, tetap tersimpan.</w:t>
             </w:r>
           </w:p>
         </w:tc>
@@ -7443,7 +7443,7 @@
                 <w:sz w:val="19"/>
                 <w:szCs w:val="19"/>
               </w:rPr>
-              <w:t xml:space="preserve">Saat waktu sesi habis, halaman siswa tertutup sendiri dan siswa yang masih berlatih ikut selesai. Bila kelas masih membutuhkan waktu, tekan </w:t>
+              <w:t xml:space="preserve">Saat waktu sesi habis, halaman siswa tertutup sendiri dan siswa yang masih berlatih ikut selesai. Nomor soalnya tersimpan: di sesi berikutnya siswa melanjutkan dari nomor terakhir. Bila kelas masih membutuhkan waktu, tekan </w:t>
             </w:r>
             <w:r>
               <w:rPr>
@@ -7459,7 +7459,7 @@
                 <w:sz w:val="19"/>
                 <w:szCs w:val="19"/>
               </w:rPr>
-              <w:t xml:space="preserve"> sebelum waktunya habis.</w:t>
+              <w:t xml:space="preserve"> sebelum waktunya habis; waktu semua siswa ikut bertambah.</w:t>
             </w:r>
           </w:p>
         </w:tc>
@@ -7474,7 +7474,7 @@
       <w:pPr>
         <w:pStyle w:val="Heading2"/>
       </w:pPr>
-      <w:bookmarkStart w:id="10" w:name="_Toc243302216"/>
+      <w:bookmarkStart w:id="10" w:name="_Toc243379228"/>
       <w:r>
         <w:t>2.3 Kotak Aturan dan tahapan yang berlaku</w:t>
       </w:r>
@@ -7827,7 +7827,7 @@
       <w:pPr>
         <w:pStyle w:val="Heading2"/>
       </w:pPr>
-      <w:bookmarkStart w:id="11" w:name="_Toc243302217"/>
+      <w:bookmarkStart w:id="11" w:name="_Toc243379229"/>
       <w:r>
         <w:t>2.4 Enam kotak ringkasan</w:t>
       </w:r>
@@ -8397,6 +8397,7 @@
                 <w:sz w:val="19"/>
                 <w:szCs w:val="19"/>
               </w:rPr>
+              <w:lastRenderedPageBreak/>
               <w:t>sedang berlatih sekarang</w:t>
             </w:r>
           </w:p>
@@ -8427,7 +8428,7 @@
                 <w:sz w:val="19"/>
                 <w:szCs w:val="19"/>
               </w:rPr>
-              <w:t>Siswa yang sesi latihannya masih berjalan saat ini.</w:t>
+              <w:t>Siswa yang sesi latihannya masih berjalan dan mendapat soal dalam 15 menit terakhir (siswa yang lama berpikir tetap terhitung).</w:t>
             </w:r>
           </w:p>
         </w:tc>
@@ -8588,7 +8589,6 @@
                 <w:sz w:val="19"/>
                 <w:szCs w:val="19"/>
               </w:rPr>
-              <w:lastRenderedPageBreak/>
               <w:t>sudah selesai</w:t>
             </w:r>
           </w:p>
@@ -8943,7 +8943,7 @@
       <w:pPr>
         <w:pStyle w:val="Heading2"/>
       </w:pPr>
-      <w:bookmarkStart w:id="12" w:name="_Toc243302218"/>
+      <w:bookmarkStart w:id="12" w:name="_Toc243379230"/>
       <w:r>
         <w:t>2.5 Tabel siswa</w:t>
       </w:r>
@@ -9508,7 +9508,7 @@
       <w:pPr>
         <w:pStyle w:val="Heading2"/>
       </w:pPr>
-      <w:bookmarkStart w:id="13" w:name="_Toc243302219"/>
+      <w:bookmarkStart w:id="13" w:name="_Toc243379231"/>
       <w:r>
         <w:t>2.6 Arti kolom Status</w:t>
       </w:r>
@@ -9838,7 +9838,7 @@
                 <w:sz w:val="19"/>
                 <w:szCs w:val="19"/>
               </w:rPr>
-              <w:t>Sesi latihannya sedang berjalan (titik hijau berkedip).</w:t>
+              <w:t>Sesi latihannya sedang berjalan dan ada soal dalam 15 menit terakhir (titik hijau berkedip).</w:t>
             </w:r>
           </w:p>
         </w:tc>
@@ -9872,6 +9872,7 @@
                 <w:sz w:val="19"/>
                 <w:szCs w:val="19"/>
               </w:rPr>
+              <w:lastRenderedPageBreak/>
               <w:t>3</w:t>
             </w:r>
           </w:p>
@@ -10155,7 +10156,6 @@
                 <w:sz w:val="19"/>
                 <w:szCs w:val="19"/>
               </w:rPr>
-              <w:lastRenderedPageBreak/>
               <w:t>6</w:t>
             </w:r>
           </w:p>
@@ -10511,9 +10511,27 @@
     </w:p>
     <w:p>
       <w:pPr>
+        <w:spacing w:after="120" w:line="276" w:lineRule="auto"/>
+      </w:pPr>
+      <w:r>
+        <w:t xml:space="preserve">Di bawah status bisa muncul catatan merah </w:t>
+      </w:r>
+      <w:r>
+        <w:rPr>
+          <w:b/>
+          <w:bCs/>
+        </w:rPr>
+        <w:t>NISN dipakai di perangkat lain N×</w:t>
+      </w:r>
+      <w:r>
+        <w:t>: sejak pertemuan terakhir, sesi siswa itu tertutup N kali karena NISN yang sama dipakai masuk di HP atau tab lain. Satu NISN hanya untuk satu sesi; HP yang tergeser menampilkan “NISN-mu dipakai masuk di perangkat lain”. Periksa apakah ada siswa yang memakai NISN temannya (mis. salah ketik) atau membuka dua tab.</w:t>
+      </w:r>
+    </w:p>
+    <w:p>
+      <w:pPr>
         <w:pStyle w:val="Heading2"/>
       </w:pPr>
-      <w:bookmarkStart w:id="14" w:name="_Toc243302220"/>
+      <w:bookmarkStart w:id="14" w:name="_Toc243379232"/>
       <w:r>
         <w:t>2.7 Bilah aksi untuk siswa terpilih</w:t>
       </w:r>
@@ -10951,7 +10969,7 @@
         <w:pStyle w:val="Heading1"/>
         <w:pageBreakBefore/>
       </w:pPr>
-      <w:bookmarkStart w:id="15" w:name="_Toc243302221"/>
+      <w:bookmarkStart w:id="15" w:name="_Toc243379233"/>
       <w:r>
         <w:lastRenderedPageBreak/>
         <w:t>3. Tab Perkembangan Siswa</w:t>
@@ -11051,7 +11069,7 @@
       <w:pPr>
         <w:pStyle w:val="Heading2"/>
       </w:pPr>
-      <w:bookmarkStart w:id="16" w:name="_Toc243302222"/>
+      <w:bookmarkStart w:id="16" w:name="_Toc243379234"/>
       <w:r>
         <w:t>3.1 Sub-tab Per Siswa</w:t>
       </w:r>
@@ -14323,7 +14341,7 @@
       <w:pPr>
         <w:pStyle w:val="Heading2"/>
       </w:pPr>
-      <w:bookmarkStart w:id="17" w:name="_Toc243302223"/>
+      <w:bookmarkStart w:id="17" w:name="_Toc243379235"/>
       <w:r>
         <w:t>3.2 Sub-tab Per Kelompok</w:t>
       </w:r>
@@ -16065,7 +16083,7 @@
       <w:pPr>
         <w:pStyle w:val="Heading2"/>
       </w:pPr>
-      <w:bookmarkStart w:id="18" w:name="_Toc243302224"/>
+      <w:bookmarkStart w:id="18" w:name="_Toc243379236"/>
       <w:r>
         <w:lastRenderedPageBreak/>
         <w:t>3.3 Sub-tab Peringkat</w:t>
@@ -19813,7 +19831,7 @@
         <w:pStyle w:val="Heading1"/>
         <w:pageBreakBefore/>
       </w:pPr>
-      <w:bookmarkStart w:id="19" w:name="_Toc243302225"/>
+      <w:bookmarkStart w:id="19" w:name="_Toc243379237"/>
       <w:r>
         <w:lastRenderedPageBreak/>
         <w:t>4. Tab Analisis Siswa</w:t>
@@ -21092,7 +21110,7 @@
       <w:pPr>
         <w:pStyle w:val="Heading2"/>
       </w:pPr>
-      <w:bookmarkStart w:id="20" w:name="_Toc243302226"/>
+      <w:bookmarkStart w:id="20" w:name="_Toc243379238"/>
       <w:r>
         <w:t>4.1 Kartu identitas</w:t>
       </w:r>
@@ -21120,7 +21138,7 @@
       <w:pPr>
         <w:pStyle w:val="Heading2"/>
       </w:pPr>
-      <w:bookmarkStart w:id="21" w:name="_Toc243302227"/>
+      <w:bookmarkStart w:id="21" w:name="_Toc243379239"/>
       <w:r>
         <w:t>4.2 Lima kotak ringkasan</w:t>
       </w:r>
@@ -22004,7 +22022,7 @@
       <w:pPr>
         <w:pStyle w:val="Heading2"/>
       </w:pPr>
-      <w:bookmarkStart w:id="22" w:name="_Toc243302228"/>
+      <w:bookmarkStart w:id="22" w:name="_Toc243379240"/>
       <w:r>
         <w:t>4.3 Aturan dan tahapan yang berlaku</w:t>
       </w:r>
@@ -22309,7 +22327,7 @@
       <w:pPr>
         <w:pStyle w:val="Heading2"/>
       </w:pPr>
-      <w:bookmarkStart w:id="23" w:name="_Toc243302229"/>
+      <w:bookmarkStart w:id="23" w:name="_Toc243379241"/>
       <w:r>
         <w:t>4.4 Catatan otomatis</w:t>
       </w:r>
@@ -23061,7 +23079,7 @@
       <w:pPr>
         <w:pStyle w:val="Heading2"/>
       </w:pPr>
-      <w:bookmarkStart w:id="24" w:name="_Toc243302230"/>
+      <w:bookmarkStart w:id="24" w:name="_Toc243379242"/>
       <w:r>
         <w:t>4.5 Kartu Latihan mandiri (di luar sesi)</w:t>
       </w:r>
@@ -23788,7 +23806,7 @@
       <w:pPr>
         <w:pStyle w:val="Heading2"/>
       </w:pPr>
-      <w:bookmarkStart w:id="25" w:name="_Toc243302231"/>
+      <w:bookmarkStart w:id="25" w:name="_Toc243379243"/>
       <w:r>
         <w:t>4.6 Riwayat semester (arsip)</w:t>
       </w:r>
@@ -23886,7 +23904,7 @@
       <w:pPr>
         <w:pStyle w:val="Heading2"/>
       </w:pPr>
-      <w:bookmarkStart w:id="26" w:name="_Toc243302232"/>
+      <w:bookmarkStart w:id="26" w:name="_Toc243379244"/>
       <w:r>
         <w:t>4.7 Grafik Kemajuan level tuntas</w:t>
       </w:r>
@@ -24273,7 +24291,7 @@
       <w:pPr>
         <w:pStyle w:val="Heading2"/>
       </w:pPr>
-      <w:bookmarkStart w:id="27" w:name="_Toc243302233"/>
+      <w:bookmarkStart w:id="27" w:name="_Toc243379245"/>
       <w:r>
         <w:t>4.8 Jenis kesalahan</w:t>
       </w:r>
@@ -26123,7 +26141,7 @@
       <w:pPr>
         <w:pStyle w:val="Heading2"/>
       </w:pPr>
-      <w:bookmarkStart w:id="28" w:name="_Toc243302234"/>
+      <w:bookmarkStart w:id="28" w:name="_Toc243379246"/>
       <w:r>
         <w:t>4.9 Per tingkat</w:t>
       </w:r>
@@ -26515,7 +26533,7 @@
       <w:pPr>
         <w:pStyle w:val="Heading2"/>
       </w:pPr>
-      <w:bookmarkStart w:id="29" w:name="_Toc243302235"/>
+      <w:bookmarkStart w:id="29" w:name="_Toc243379247"/>
       <w:r>
         <w:t>4.10 Kesalahan terakhir</w:t>
       </w:r>
@@ -27121,7 +27139,7 @@
       <w:pPr>
         <w:pStyle w:val="Heading2"/>
       </w:pPr>
-      <w:bookmarkStart w:id="30" w:name="_Toc243302236"/>
+      <w:bookmarkStart w:id="30" w:name="_Toc243379248"/>
       <w:r>
         <w:t>4.11 Riwayat level tuntas</w:t>
       </w:r>
@@ -27744,7 +27762,7 @@
       <w:pPr>
         <w:pStyle w:val="Heading2"/>
       </w:pPr>
-      <w:bookmarkStart w:id="31" w:name="_Toc243302237"/>
+      <w:bookmarkStart w:id="31" w:name="_Toc243379249"/>
       <w:r>
         <w:t>4.12 Pindahkan posisi dan Hapus data latihan</w:t>
       </w:r>
@@ -27924,7 +27942,7 @@
         <w:pStyle w:val="Heading1"/>
         <w:pageBreakBefore/>
       </w:pPr>
-      <w:bookmarkStart w:id="32" w:name="_Toc243302238"/>
+      <w:bookmarkStart w:id="32" w:name="_Toc243379250"/>
       <w:r>
         <w:lastRenderedPageBreak/>
         <w:t>5. Dari Data ke Tindakan</w:t>
@@ -27935,7 +27953,7 @@
       <w:pPr>
         <w:pStyle w:val="Heading2"/>
       </w:pPr>
-      <w:bookmarkStart w:id="33" w:name="_Toc243302239"/>
+      <w:bookmarkStart w:id="33" w:name="_Toc243379251"/>
       <w:r>
         <w:t>5.1 Situasi umum dan tindakan</w:t>
       </w:r>
@@ -28192,6 +28210,98 @@
               <w:bottom w:val="single" w:sz="4" w:space="0" w:color="C9D3DE"/>
               <w:right w:val="single" w:sz="4" w:space="0" w:color="C9D3DE"/>
             </w:tcBorders>
+            <w:tcMar>
+              <w:top w:w="70" w:type="dxa"/>
+              <w:left w:w="110" w:type="dxa"/>
+              <w:bottom w:w="70" w:type="dxa"/>
+              <w:right w:w="110" w:type="dxa"/>
+            </w:tcMar>
+          </w:tcPr>
+          <w:p>
+            <w:pPr>
+              <w:spacing w:after="30"/>
+            </w:pPr>
+            <w:r>
+              <w:rPr>
+                <w:sz w:val="19"/>
+                <w:szCs w:val="19"/>
+              </w:rPr>
+              <w:t>Siswa tiba-tiba keluar saat sesi masih berjalan</w:t>
+            </w:r>
+          </w:p>
+        </w:tc>
+        <w:tc>
+          <w:tcPr>
+            <w:tcW w:w="3373" w:type="dxa"/>
+            <w:tcBorders>
+              <w:top w:val="single" w:sz="4" w:space="0" w:color="C9D3DE"/>
+              <w:left w:val="single" w:sz="4" w:space="0" w:color="C9D3DE"/>
+              <w:bottom w:val="single" w:sz="4" w:space="0" w:color="C9D3DE"/>
+              <w:right w:val="single" w:sz="4" w:space="0" w:color="C9D3DE"/>
+            </w:tcBorders>
+            <w:tcMar>
+              <w:top w:w="70" w:type="dxa"/>
+              <w:left w:w="110" w:type="dxa"/>
+              <w:bottom w:w="70" w:type="dxa"/>
+              <w:right w:w="110" w:type="dxa"/>
+            </w:tcMar>
+          </w:tcPr>
+          <w:p>
+            <w:pPr>
+              <w:spacing w:after="30"/>
+            </w:pPr>
+            <w:r>
+              <w:rPr>
+                <w:sz w:val="19"/>
+                <w:szCs w:val="19"/>
+              </w:rPr>
+              <w:t>Layar siswa: “NISN-mu dipakai masuk di perangkat lain”; Sesi Kegiatan → catatan merah NISN dipakai di perangkat lain N×</w:t>
+            </w:r>
+          </w:p>
+        </w:tc>
+        <w:tc>
+          <w:tcPr>
+            <w:tcW w:w="3760" w:type="dxa"/>
+            <w:tcBorders>
+              <w:top w:val="single" w:sz="4" w:space="0" w:color="C9D3DE"/>
+              <w:left w:val="single" w:sz="4" w:space="0" w:color="C9D3DE"/>
+              <w:bottom w:val="single" w:sz="4" w:space="0" w:color="C9D3DE"/>
+              <w:right w:val="single" w:sz="4" w:space="0" w:color="C9D3DE"/>
+            </w:tcBorders>
+            <w:tcMar>
+              <w:top w:w="70" w:type="dxa"/>
+              <w:left w:w="110" w:type="dxa"/>
+              <w:bottom w:w="70" w:type="dxa"/>
+              <w:right w:w="110" w:type="dxa"/>
+            </w:tcMar>
+          </w:tcPr>
+          <w:p>
+            <w:pPr>
+              <w:spacing w:after="30"/>
+            </w:pPr>
+            <w:r>
+              <w:rPr>
+                <w:sz w:val="19"/>
+                <w:szCs w:val="19"/>
+              </w:rPr>
+              <w:t>Pastikan setiap siswa mengetik NISN-nya sendiri dan hanya membuka satu tab. Siswa masuk lagi dan melanjutkan dari nomor terakhir.</w:t>
+            </w:r>
+          </w:p>
+        </w:tc>
+      </w:tr>
+      <w:tr>
+        <w:trPr>
+          <w:cantSplit/>
+        </w:trPr>
+        <w:tc>
+          <w:tcPr>
+            <w:tcW w:w="2505" w:type="dxa"/>
+            <w:tcBorders>
+              <w:top w:val="single" w:sz="4" w:space="0" w:color="C9D3DE"/>
+              <w:left w:val="single" w:sz="4" w:space="0" w:color="C9D3DE"/>
+              <w:bottom w:val="single" w:sz="4" w:space="0" w:color="C9D3DE"/>
+              <w:right w:val="single" w:sz="4" w:space="0" w:color="C9D3DE"/>
+            </w:tcBorders>
             <w:shd w:val="clear" w:color="auto" w:fill="F8FAFC"/>
             <w:tcMar>
               <w:top w:w="70" w:type="dxa"/>
@@ -29043,7 +29153,7 @@
         <w:pStyle w:val="Heading2"/>
         <w:pageBreakBefore/>
       </w:pPr>
-      <w:bookmarkStart w:id="34" w:name="_Toc243302240"/>
+      <w:bookmarkStart w:id="34" w:name="_Toc243379252"/>
       <w:r>
         <w:lastRenderedPageBreak/>
         <w:t>5.2 Tanya jawab singkat</w:t>
@@ -30079,10 +30189,159 @@
           </w:p>
         </w:tc>
       </w:tr>
+      <w:tr>
+        <w:trPr>
+          <w:cantSplit/>
+        </w:trPr>
+        <w:tc>
+          <w:tcPr>
+            <w:tcW w:w="3855" w:type="dxa"/>
+            <w:tcBorders>
+              <w:top w:val="single" w:sz="4" w:space="0" w:color="C9D3DE"/>
+              <w:left w:val="single" w:sz="4" w:space="0" w:color="C9D3DE"/>
+              <w:bottom w:val="single" w:sz="4" w:space="0" w:color="C9D3DE"/>
+              <w:right w:val="single" w:sz="4" w:space="0" w:color="C9D3DE"/>
+            </w:tcBorders>
+            <w:shd w:val="clear" w:color="auto" w:fill="F8FAFC"/>
+            <w:tcMar>
+              <w:top w:w="70" w:type="dxa"/>
+              <w:left w:w="110" w:type="dxa"/>
+              <w:bottom w:w="70" w:type="dxa"/>
+              <w:right w:w="110" w:type="dxa"/>
+            </w:tcMar>
+          </w:tcPr>
+          <w:p>
+            <w:pPr>
+              <w:spacing w:after="30"/>
+              <w:rPr>
+                <w:sz w:val="19"/>
+                <w:szCs w:val="19"/>
+              </w:rPr>
+            </w:pPr>
+            <w:r>
+              <w:rPr>
+                <w:sz w:val="19"/>
+                <w:szCs w:val="19"/>
+              </w:rPr>
+              <w:t>Siswa keluar lalu masuk lagi — mulai dari nomor berapa?</w:t>
+            </w:r>
+          </w:p>
+        </w:tc>
+        <w:tc>
+          <w:tcPr>
+            <w:tcW w:w="5783" w:type="dxa"/>
+            <w:tcBorders>
+              <w:top w:val="single" w:sz="4" w:space="0" w:color="C9D3DE"/>
+              <w:left w:val="single" w:sz="4" w:space="0" w:color="C9D3DE"/>
+              <w:bottom w:val="single" w:sz="4" w:space="0" w:color="C9D3DE"/>
+              <w:right w:val="single" w:sz="4" w:space="0" w:color="C9D3DE"/>
+            </w:tcBorders>
+            <w:shd w:val="clear" w:color="auto" w:fill="F8FAFC"/>
+            <w:tcMar>
+              <w:top w:w="70" w:type="dxa"/>
+              <w:left w:w="110" w:type="dxa"/>
+              <w:bottom w:w="70" w:type="dxa"/>
+              <w:right w:w="110" w:type="dxa"/>
+            </w:tcMar>
+          </w:tcPr>
+          <w:p>
+            <w:pPr>
+              <w:spacing w:after="30"/>
+              <w:rPr>
+                <w:sz w:val="19"/>
+                <w:szCs w:val="19"/>
+              </w:rPr>
+            </w:pPr>
+            <w:r>
+              <w:rPr>
+                <w:sz w:val="19"/>
+                <w:szCs w:val="19"/>
+              </w:rPr>
+              <w:t>Dari nomor terakhirnya di level itu, juga sesudah waktu sesi habis atau sesi ditutup guru. Nomor kembali ke 1 hanya bila level diulang karena salah melewati batas, siswa naik level, atau guru memindahkan posisi atau tahapannya.</w:t>
+            </w:r>
+          </w:p>
+        </w:tc>
+      </w:tr>
+      <w:tr>
+        <w:trPr>
+          <w:cantSplit/>
+        </w:trPr>
+        <w:tc>
+          <w:tcPr>
+            <w:tcW w:w="3855" w:type="dxa"/>
+            <w:tcBorders>
+              <w:top w:val="single" w:sz="4" w:space="0" w:color="C9D3DE"/>
+              <w:left w:val="single" w:sz="4" w:space="0" w:color="C9D3DE"/>
+              <w:bottom w:val="single" w:sz="4" w:space="0" w:color="C9D3DE"/>
+              <w:right w:val="single" w:sz="4" w:space="0" w:color="C9D3DE"/>
+            </w:tcBorders>
+            <w:shd w:val="clear" w:color="auto" w:fill="F8FAFC"/>
+            <w:tcMar>
+              <w:top w:w="70" w:type="dxa"/>
+              <w:left w:w="110" w:type="dxa"/>
+              <w:bottom w:w="70" w:type="dxa"/>
+              <w:right w:w="110" w:type="dxa"/>
+            </w:tcMar>
+          </w:tcPr>
+          <w:p>
+            <w:pPr>
+              <w:spacing w:after="30"/>
+              <w:rPr>
+                <w:sz w:val="19"/>
+                <w:szCs w:val="19"/>
+              </w:rPr>
+            </w:pPr>
+            <w:r>
+              <w:rPr>
+                <w:sz w:val="19"/>
+                <w:szCs w:val="19"/>
+              </w:rPr>
+              <w:t>Mengapa siswa keluar sebelum sesi selesai?</w:t>
+            </w:r>
+          </w:p>
+        </w:tc>
+        <w:tc>
+          <w:tcPr>
+            <w:tcW w:w="5783" w:type="dxa"/>
+            <w:tcBorders>
+              <w:top w:val="single" w:sz="4" w:space="0" w:color="C9D3DE"/>
+              <w:left w:val="single" w:sz="4" w:space="0" w:color="C9D3DE"/>
+              <w:bottom w:val="single" w:sz="4" w:space="0" w:color="C9D3DE"/>
+              <w:right w:val="single" w:sz="4" w:space="0" w:color="C9D3DE"/>
+            </w:tcBorders>
+            <w:shd w:val="clear" w:color="auto" w:fill="F8FAFC"/>
+            <w:tcMar>
+              <w:top w:w="70" w:type="dxa"/>
+              <w:left w:w="110" w:type="dxa"/>
+              <w:bottom w:w="70" w:type="dxa"/>
+              <w:right w:w="110" w:type="dxa"/>
+            </w:tcMar>
+          </w:tcPr>
+          <w:p>
+            <w:pPr>
+              <w:spacing w:after="30"/>
+              <w:rPr>
+                <w:sz w:val="19"/>
+                <w:szCs w:val="19"/>
+              </w:rPr>
+            </w:pPr>
+            <w:r>
+              <w:rPr>
+                <w:sz w:val="19"/>
+                <w:szCs w:val="19"/>
+              </w:rPr>
+              <w:t>Lihat tulisan di layar siswa: “Waktu latihan habis” = sesi kelompok berakhir; “Sesi ditutup oleh guru” = Tutup sekarang; “NISN-mu dipakai masuk di perangkat lain” = NISN yang sama dipakai masuk di HP atau tab lain. Sejak 20 Oktober 2026 Lama satu sesi di profil tidak lagi memotong sesi kelompok.</w:t>
+            </w:r>
+          </w:p>
+        </w:tc>
+      </w:tr>
     </w:tbl>
     <w:p>
       <w:pPr>
-        <w:spacing w:after="120"/>
+        <w:spacing w:line="20" w:lineRule="exact"/>
+        <w:rPr>
+          <w:sz w:val="2"/>
+        </w:rPr>
       </w:pPr>
     </w:p>
     <w:sectPr>

</xml_diff>

<commit_message>
Perkembangan Siswa: sub-tab Rekapitulasi (rapor kelompok + grafik, perbandingan), Per Kelompok digabung; panduan diperbarui
Co-Authored-By: Claude Opus 5.5 <noreply@anthropic.com>
</commit_message>
<xml_diff>
--- a/Panduan_Membaca_Data_Matdas.docx
+++ b/Panduan_Membaca_Data_Matdas.docx
@@ -97,7 +97,7 @@
         <w:t>Perkembangan Siswa</w:t>
       </w:r>
       <w:r>
-        <w:t xml:space="preserve"> — kemajuan seluruh kelompok (Per Siswa, Per Kelompok, Peringkat)</w:t>
+        <w:t xml:space="preserve"> — kemajuan seluruh kelompok (Rekapitulasi, Per Siswa, Peringkat)</w:t>
       </w:r>
     </w:p>
     <w:p>
@@ -193,7 +193,7 @@
           <w:r>
             <w:fldChar w:fldCharType="separate"/>
           </w:r>
-          <w:hyperlink w:anchor="_Toc243379218" w:history="1">
+          <w:hyperlink w:anchor="_Toc243489414" w:history="1">
             <w:r>
               <w:rPr>
                 <w:rStyle w:val="Hyperlink"/>
@@ -217,7 +217,7 @@
               <w:rPr>
                 <w:noProof/>
               </w:rPr>
-              <w:instrText xml:space="preserve"> PAGEREF _Toc243379218 \h </w:instrText>
+              <w:instrText xml:space="preserve"> PAGEREF _Toc243489414 \h </w:instrText>
             </w:r>
             <w:r>
               <w:rPr>
@@ -257,7 +257,7 @@
               <w:szCs w:val="22"/>
             </w:rPr>
           </w:pPr>
-          <w:hyperlink w:anchor="_Toc243379219" w:history="1">
+          <w:hyperlink w:anchor="_Toc243489415" w:history="1">
             <w:r>
               <w:rPr>
                 <w:rStyle w:val="Hyperlink"/>
@@ -281,7 +281,7 @@
               <w:rPr>
                 <w:noProof/>
               </w:rPr>
-              <w:instrText xml:space="preserve"> PAGEREF _Toc243379219 \h </w:instrText>
+              <w:instrText xml:space="preserve"> PAGEREF _Toc243489415 \h </w:instrText>
             </w:r>
             <w:r>
               <w:rPr>
@@ -321,7 +321,7 @@
               <w:szCs w:val="22"/>
             </w:rPr>
           </w:pPr>
-          <w:hyperlink w:anchor="_Toc243379220" w:history="1">
+          <w:hyperlink w:anchor="_Toc243489416" w:history="1">
             <w:r>
               <w:rPr>
                 <w:rStyle w:val="Hyperlink"/>
@@ -345,7 +345,7 @@
               <w:rPr>
                 <w:noProof/>
               </w:rPr>
-              <w:instrText xml:space="preserve"> PAGEREF _Toc243379220 \h </w:instrText>
+              <w:instrText xml:space="preserve"> PAGEREF _Toc243489416 \h </w:instrText>
             </w:r>
             <w:r>
               <w:rPr>
@@ -385,7 +385,7 @@
               <w:szCs w:val="22"/>
             </w:rPr>
           </w:pPr>
-          <w:hyperlink w:anchor="_Toc243379221" w:history="1">
+          <w:hyperlink w:anchor="_Toc243489417" w:history="1">
             <w:r>
               <w:rPr>
                 <w:rStyle w:val="Hyperlink"/>
@@ -409,7 +409,7 @@
               <w:rPr>
                 <w:noProof/>
               </w:rPr>
-              <w:instrText xml:space="preserve"> PAGEREF _Toc243379221 \h </w:instrText>
+              <w:instrText xml:space="preserve"> PAGEREF _Toc243489417 \h </w:instrText>
             </w:r>
             <w:r>
               <w:rPr>
@@ -449,7 +449,7 @@
               <w:szCs w:val="22"/>
             </w:rPr>
           </w:pPr>
-          <w:hyperlink w:anchor="_Toc243379222" w:history="1">
+          <w:hyperlink w:anchor="_Toc243489418" w:history="1">
             <w:r>
               <w:rPr>
                 <w:rStyle w:val="Hyperlink"/>
@@ -473,7 +473,7 @@
               <w:rPr>
                 <w:noProof/>
               </w:rPr>
-              <w:instrText xml:space="preserve"> PAGEREF _Toc243379222 \h </w:instrText>
+              <w:instrText xml:space="preserve"> PAGEREF _Toc243489418 \h </w:instrText>
             </w:r>
             <w:r>
               <w:rPr>
@@ -513,7 +513,7 @@
               <w:szCs w:val="22"/>
             </w:rPr>
           </w:pPr>
-          <w:hyperlink w:anchor="_Toc243379223" w:history="1">
+          <w:hyperlink w:anchor="_Toc243489419" w:history="1">
             <w:r>
               <w:rPr>
                 <w:rStyle w:val="Hyperlink"/>
@@ -537,7 +537,7 @@
               <w:rPr>
                 <w:noProof/>
               </w:rPr>
-              <w:instrText xml:space="preserve"> PAGEREF _Toc243379223 \h </w:instrText>
+              <w:instrText xml:space="preserve"> PAGEREF _Toc243489419 \h </w:instrText>
             </w:r>
             <w:r>
               <w:rPr>
@@ -577,7 +577,7 @@
               <w:szCs w:val="22"/>
             </w:rPr>
           </w:pPr>
-          <w:hyperlink w:anchor="_Toc243379224" w:history="1">
+          <w:hyperlink w:anchor="_Toc243489420" w:history="1">
             <w:r>
               <w:rPr>
                 <w:rStyle w:val="Hyperlink"/>
@@ -601,7 +601,7 @@
               <w:rPr>
                 <w:noProof/>
               </w:rPr>
-              <w:instrText xml:space="preserve"> PAGEREF _Toc243379224 \h </w:instrText>
+              <w:instrText xml:space="preserve"> PAGEREF _Toc243489420 \h </w:instrText>
             </w:r>
             <w:r>
               <w:rPr>
@@ -641,7 +641,7 @@
               <w:szCs w:val="22"/>
             </w:rPr>
           </w:pPr>
-          <w:hyperlink w:anchor="_Toc243379225" w:history="1">
+          <w:hyperlink w:anchor="_Toc243489421" w:history="1">
             <w:r>
               <w:rPr>
                 <w:rStyle w:val="Hyperlink"/>
@@ -665,7 +665,7 @@
               <w:rPr>
                 <w:noProof/>
               </w:rPr>
-              <w:instrText xml:space="preserve"> PAGEREF _Toc243379225 \h </w:instrText>
+              <w:instrText xml:space="preserve"> PAGEREF _Toc243489421 \h </w:instrText>
             </w:r>
             <w:r>
               <w:rPr>
@@ -705,7 +705,7 @@
               <w:szCs w:val="22"/>
             </w:rPr>
           </w:pPr>
-          <w:hyperlink w:anchor="_Toc243379226" w:history="1">
+          <w:hyperlink w:anchor="_Toc243489422" w:history="1">
             <w:r>
               <w:rPr>
                 <w:rStyle w:val="Hyperlink"/>
@@ -729,7 +729,7 @@
               <w:rPr>
                 <w:noProof/>
               </w:rPr>
-              <w:instrText xml:space="preserve"> PAGEREF _Toc243379226 \h </w:instrText>
+              <w:instrText xml:space="preserve"> PAGEREF _Toc243489422 \h </w:instrText>
             </w:r>
             <w:r>
               <w:rPr>
@@ -769,7 +769,7 @@
               <w:szCs w:val="22"/>
             </w:rPr>
           </w:pPr>
-          <w:hyperlink w:anchor="_Toc243379227" w:history="1">
+          <w:hyperlink w:anchor="_Toc243489423" w:history="1">
             <w:r>
               <w:rPr>
                 <w:rStyle w:val="Hyperlink"/>
@@ -793,7 +793,7 @@
               <w:rPr>
                 <w:noProof/>
               </w:rPr>
-              <w:instrText xml:space="preserve"> PAGEREF _Toc243379227 \h </w:instrText>
+              <w:instrText xml:space="preserve"> PAGEREF _Toc243489423 \h </w:instrText>
             </w:r>
             <w:r>
               <w:rPr>
@@ -833,7 +833,7 @@
               <w:szCs w:val="22"/>
             </w:rPr>
           </w:pPr>
-          <w:hyperlink w:anchor="_Toc243379228" w:history="1">
+          <w:hyperlink w:anchor="_Toc243489424" w:history="1">
             <w:r>
               <w:rPr>
                 <w:rStyle w:val="Hyperlink"/>
@@ -857,7 +857,7 @@
               <w:rPr>
                 <w:noProof/>
               </w:rPr>
-              <w:instrText xml:space="preserve"> PAGEREF _Toc243379228 \h </w:instrText>
+              <w:instrText xml:space="preserve"> PAGEREF _Toc243489424 \h </w:instrText>
             </w:r>
             <w:r>
               <w:rPr>
@@ -897,7 +897,7 @@
               <w:szCs w:val="22"/>
             </w:rPr>
           </w:pPr>
-          <w:hyperlink w:anchor="_Toc243379229" w:history="1">
+          <w:hyperlink w:anchor="_Toc243489425" w:history="1">
             <w:r>
               <w:rPr>
                 <w:rStyle w:val="Hyperlink"/>
@@ -921,7 +921,7 @@
               <w:rPr>
                 <w:noProof/>
               </w:rPr>
-              <w:instrText xml:space="preserve"> PAGEREF _Toc243379229 \h </w:instrText>
+              <w:instrText xml:space="preserve"> PAGEREF _Toc243489425 \h </w:instrText>
             </w:r>
             <w:r>
               <w:rPr>
@@ -961,7 +961,7 @@
               <w:szCs w:val="22"/>
             </w:rPr>
           </w:pPr>
-          <w:hyperlink w:anchor="_Toc243379230" w:history="1">
+          <w:hyperlink w:anchor="_Toc243489426" w:history="1">
             <w:r>
               <w:rPr>
                 <w:rStyle w:val="Hyperlink"/>
@@ -985,7 +985,7 @@
               <w:rPr>
                 <w:noProof/>
               </w:rPr>
-              <w:instrText xml:space="preserve"> PAGEREF _Toc243379230 \h </w:instrText>
+              <w:instrText xml:space="preserve"> PAGEREF _Toc243489426 \h </w:instrText>
             </w:r>
             <w:r>
               <w:rPr>
@@ -1025,7 +1025,7 @@
               <w:szCs w:val="22"/>
             </w:rPr>
           </w:pPr>
-          <w:hyperlink w:anchor="_Toc243379231" w:history="1">
+          <w:hyperlink w:anchor="_Toc243489427" w:history="1">
             <w:r>
               <w:rPr>
                 <w:rStyle w:val="Hyperlink"/>
@@ -1049,7 +1049,7 @@
               <w:rPr>
                 <w:noProof/>
               </w:rPr>
-              <w:instrText xml:space="preserve"> PAGEREF _Toc243379231 \h </w:instrText>
+              <w:instrText xml:space="preserve"> PAGEREF _Toc243489427 \h </w:instrText>
             </w:r>
             <w:r>
               <w:rPr>
@@ -1089,7 +1089,7 @@
               <w:szCs w:val="22"/>
             </w:rPr>
           </w:pPr>
-          <w:hyperlink w:anchor="_Toc243379232" w:history="1">
+          <w:hyperlink w:anchor="_Toc243489428" w:history="1">
             <w:r>
               <w:rPr>
                 <w:rStyle w:val="Hyperlink"/>
@@ -1113,7 +1113,7 @@
               <w:rPr>
                 <w:noProof/>
               </w:rPr>
-              <w:instrText xml:space="preserve"> PAGEREF _Toc243379232 \h </w:instrText>
+              <w:instrText xml:space="preserve"> PAGEREF _Toc243489428 \h </w:instrText>
             </w:r>
             <w:r>
               <w:rPr>
@@ -1153,7 +1153,7 @@
               <w:szCs w:val="22"/>
             </w:rPr>
           </w:pPr>
-          <w:hyperlink w:anchor="_Toc243379233" w:history="1">
+          <w:hyperlink w:anchor="_Toc243489429" w:history="1">
             <w:r>
               <w:rPr>
                 <w:rStyle w:val="Hyperlink"/>
@@ -1177,7 +1177,7 @@
               <w:rPr>
                 <w:noProof/>
               </w:rPr>
-              <w:instrText xml:space="preserve"> PAGEREF _Toc243379233 \h </w:instrText>
+              <w:instrText xml:space="preserve"> PAGEREF _Toc243489429 \h </w:instrText>
             </w:r>
             <w:r>
               <w:rPr>
@@ -1217,13 +1217,13 @@
               <w:szCs w:val="22"/>
             </w:rPr>
           </w:pPr>
-          <w:hyperlink w:anchor="_Toc243379234" w:history="1">
+          <w:hyperlink w:anchor="_Toc243489430" w:history="1">
             <w:r>
               <w:rPr>
                 <w:rStyle w:val="Hyperlink"/>
                 <w:noProof/>
               </w:rPr>
-              <w:t>3.1 Sub-tab Per Siswa</w:t>
+              <w:t>3.1 Sub-tab Rekapitulasi</w:t>
             </w:r>
             <w:r>
               <w:rPr>
@@ -1241,7 +1241,7 @@
               <w:rPr>
                 <w:noProof/>
               </w:rPr>
-              <w:instrText xml:space="preserve"> PAGEREF _Toc243379234 \h </w:instrText>
+              <w:instrText xml:space="preserve"> PAGEREF _Toc243489430 \h </w:instrText>
             </w:r>
             <w:r>
               <w:rPr>
@@ -1281,13 +1281,13 @@
               <w:szCs w:val="22"/>
             </w:rPr>
           </w:pPr>
-          <w:hyperlink w:anchor="_Toc243379235" w:history="1">
+          <w:hyperlink w:anchor="_Toc243489431" w:history="1">
             <w:r>
               <w:rPr>
                 <w:rStyle w:val="Hyperlink"/>
                 <w:noProof/>
               </w:rPr>
-              <w:t>3.2 Sub-tab Per Kelompok</w:t>
+              <w:t>3.2 Sub-tab Per Siswa</w:t>
             </w:r>
             <w:r>
               <w:rPr>
@@ -1305,7 +1305,7 @@
               <w:rPr>
                 <w:noProof/>
               </w:rPr>
-              <w:instrText xml:space="preserve"> PAGEREF _Toc243379235 \h </w:instrText>
+              <w:instrText xml:space="preserve"> PAGEREF _Toc243489431 \h </w:instrText>
             </w:r>
             <w:r>
               <w:rPr>
@@ -1345,13 +1345,13 @@
               <w:szCs w:val="22"/>
             </w:rPr>
           </w:pPr>
-          <w:hyperlink w:anchor="_Toc243379236" w:history="1">
+          <w:hyperlink w:anchor="_Toc243489432" w:history="1">
             <w:r>
               <w:rPr>
                 <w:rStyle w:val="Hyperlink"/>
                 <w:noProof/>
               </w:rPr>
-              <w:t>3.3 Sub-tab Peringkat</w:t>
+              <w:t>3.3 Ringkasan keseluruhan (bagian bawah Rekapitulasi)</w:t>
             </w:r>
             <w:r>
               <w:rPr>
@@ -1369,7 +1369,71 @@
               <w:rPr>
                 <w:noProof/>
               </w:rPr>
-              <w:instrText xml:space="preserve"> PAGEREF _Toc243379236 \h </w:instrText>
+              <w:instrText xml:space="preserve"> PAGEREF _Toc243489432 \h </w:instrText>
+            </w:r>
+            <w:r>
+              <w:rPr>
+                <w:noProof/>
+              </w:rPr>
+            </w:r>
+            <w:r>
+              <w:rPr>
+                <w:noProof/>
+              </w:rPr>
+              <w:fldChar w:fldCharType="separate"/>
+            </w:r>
+            <w:r>
+              <w:rPr>
+                <w:noProof/>
+              </w:rPr>
+              <w:t>13</w:t>
+            </w:r>
+            <w:r>
+              <w:rPr>
+                <w:noProof/>
+              </w:rPr>
+              <w:fldChar w:fldCharType="end"/>
+            </w:r>
+          </w:hyperlink>
+        </w:p>
+        <w:p>
+          <w:pPr>
+            <w:pStyle w:val="TOC2"/>
+            <w:tabs>
+              <w:tab w:val="right" w:leader="dot" w:pos="9628"/>
+            </w:tabs>
+            <w:rPr>
+              <w:rFonts w:asciiTheme="minorHAnsi" w:eastAsiaTheme="minorEastAsia" w:hAnsiTheme="minorHAnsi" w:cstheme="minorBidi"/>
+              <w:noProof/>
+              <w:sz w:val="22"/>
+              <w:szCs w:val="22"/>
+            </w:rPr>
+          </w:pPr>
+          <w:hyperlink w:anchor="_Toc243489433" w:history="1">
+            <w:r>
+              <w:rPr>
+                <w:rStyle w:val="Hyperlink"/>
+                <w:noProof/>
+              </w:rPr>
+              <w:t>3.4 Sub-tab Peringkat</w:t>
+            </w:r>
+            <w:r>
+              <w:rPr>
+                <w:noProof/>
+              </w:rPr>
+              <w:tab/>
+            </w:r>
+            <w:r>
+              <w:rPr>
+                <w:noProof/>
+              </w:rPr>
+              <w:fldChar w:fldCharType="begin"/>
+            </w:r>
+            <w:r>
+              <w:rPr>
+                <w:noProof/>
+              </w:rPr>
+              <w:instrText xml:space="preserve"> PAGEREF _Toc243489433 \h </w:instrText>
             </w:r>
             <w:r>
               <w:rPr>
@@ -1409,7 +1473,7 @@
               <w:szCs w:val="22"/>
             </w:rPr>
           </w:pPr>
-          <w:hyperlink w:anchor="_Toc243379237" w:history="1">
+          <w:hyperlink w:anchor="_Toc243489434" w:history="1">
             <w:r>
               <w:rPr>
                 <w:rStyle w:val="Hyperlink"/>
@@ -1433,7 +1497,7 @@
               <w:rPr>
                 <w:noProof/>
               </w:rPr>
-              <w:instrText xml:space="preserve"> PAGEREF _Toc243379237 \h </w:instrText>
+              <w:instrText xml:space="preserve"> PAGEREF _Toc243489434 \h </w:instrText>
             </w:r>
             <w:r>
               <w:rPr>
@@ -1473,7 +1537,7 @@
               <w:szCs w:val="22"/>
             </w:rPr>
           </w:pPr>
-          <w:hyperlink w:anchor="_Toc243379238" w:history="1">
+          <w:hyperlink w:anchor="_Toc243489435" w:history="1">
             <w:r>
               <w:rPr>
                 <w:rStyle w:val="Hyperlink"/>
@@ -1497,7 +1561,7 @@
               <w:rPr>
                 <w:noProof/>
               </w:rPr>
-              <w:instrText xml:space="preserve"> PAGEREF _Toc243379238 \h </w:instrText>
+              <w:instrText xml:space="preserve"> PAGEREF _Toc243489435 \h </w:instrText>
             </w:r>
             <w:r>
               <w:rPr>
@@ -1537,7 +1601,7 @@
               <w:szCs w:val="22"/>
             </w:rPr>
           </w:pPr>
-          <w:hyperlink w:anchor="_Toc243379239" w:history="1">
+          <w:hyperlink w:anchor="_Toc243489436" w:history="1">
             <w:r>
               <w:rPr>
                 <w:rStyle w:val="Hyperlink"/>
@@ -1561,7 +1625,7 @@
               <w:rPr>
                 <w:noProof/>
               </w:rPr>
-              <w:instrText xml:space="preserve"> PAGEREF _Toc243379239 \h </w:instrText>
+              <w:instrText xml:space="preserve"> PAGEREF _Toc243489436 \h </w:instrText>
             </w:r>
             <w:r>
               <w:rPr>
@@ -1601,7 +1665,7 @@
               <w:szCs w:val="22"/>
             </w:rPr>
           </w:pPr>
-          <w:hyperlink w:anchor="_Toc243379240" w:history="1">
+          <w:hyperlink w:anchor="_Toc243489437" w:history="1">
             <w:r>
               <w:rPr>
                 <w:rStyle w:val="Hyperlink"/>
@@ -1625,7 +1689,7 @@
               <w:rPr>
                 <w:noProof/>
               </w:rPr>
-              <w:instrText xml:space="preserve"> PAGEREF _Toc243379240 \h </w:instrText>
+              <w:instrText xml:space="preserve"> PAGEREF _Toc243489437 \h </w:instrText>
             </w:r>
             <w:r>
               <w:rPr>
@@ -1665,7 +1729,7 @@
               <w:szCs w:val="22"/>
             </w:rPr>
           </w:pPr>
-          <w:hyperlink w:anchor="_Toc243379241" w:history="1">
+          <w:hyperlink w:anchor="_Toc243489438" w:history="1">
             <w:r>
               <w:rPr>
                 <w:rStyle w:val="Hyperlink"/>
@@ -1689,7 +1753,7 @@
               <w:rPr>
                 <w:noProof/>
               </w:rPr>
-              <w:instrText xml:space="preserve"> PAGEREF _Toc243379241 \h </w:instrText>
+              <w:instrText xml:space="preserve"> PAGEREF _Toc243489438 \h </w:instrText>
             </w:r>
             <w:r>
               <w:rPr>
@@ -1729,7 +1793,7 @@
               <w:szCs w:val="22"/>
             </w:rPr>
           </w:pPr>
-          <w:hyperlink w:anchor="_Toc243379242" w:history="1">
+          <w:hyperlink w:anchor="_Toc243489439" w:history="1">
             <w:r>
               <w:rPr>
                 <w:rStyle w:val="Hyperlink"/>
@@ -1753,7 +1817,7 @@
               <w:rPr>
                 <w:noProof/>
               </w:rPr>
-              <w:instrText xml:space="preserve"> PAGEREF _Toc243379242 \h </w:instrText>
+              <w:instrText xml:space="preserve"> PAGEREF _Toc243489439 \h </w:instrText>
             </w:r>
             <w:r>
               <w:rPr>
@@ -1793,7 +1857,7 @@
               <w:szCs w:val="22"/>
             </w:rPr>
           </w:pPr>
-          <w:hyperlink w:anchor="_Toc243379243" w:history="1">
+          <w:hyperlink w:anchor="_Toc243489440" w:history="1">
             <w:r>
               <w:rPr>
                 <w:rStyle w:val="Hyperlink"/>
@@ -1817,7 +1881,7 @@
               <w:rPr>
                 <w:noProof/>
               </w:rPr>
-              <w:instrText xml:space="preserve"> PAGEREF _Toc243379243 \h </w:instrText>
+              <w:instrText xml:space="preserve"> PAGEREF _Toc243489440 \h </w:instrText>
             </w:r>
             <w:r>
               <w:rPr>
@@ -1857,7 +1921,7 @@
               <w:szCs w:val="22"/>
             </w:rPr>
           </w:pPr>
-          <w:hyperlink w:anchor="_Toc243379244" w:history="1">
+          <w:hyperlink w:anchor="_Toc243489441" w:history="1">
             <w:r>
               <w:rPr>
                 <w:rStyle w:val="Hyperlink"/>
@@ -1881,7 +1945,7 @@
               <w:rPr>
                 <w:noProof/>
               </w:rPr>
-              <w:instrText xml:space="preserve"> PAGEREF _Toc243379244 \h </w:instrText>
+              <w:instrText xml:space="preserve"> PAGEREF _Toc243489441 \h </w:instrText>
             </w:r>
             <w:r>
               <w:rPr>
@@ -1921,7 +1985,7 @@
               <w:szCs w:val="22"/>
             </w:rPr>
           </w:pPr>
-          <w:hyperlink w:anchor="_Toc243379245" w:history="1">
+          <w:hyperlink w:anchor="_Toc243489442" w:history="1">
             <w:r>
               <w:rPr>
                 <w:rStyle w:val="Hyperlink"/>
@@ -1945,7 +2009,7 @@
               <w:rPr>
                 <w:noProof/>
               </w:rPr>
-              <w:instrText xml:space="preserve"> PAGEREF _Toc243379245 \h </w:instrText>
+              <w:instrText xml:space="preserve"> PAGEREF _Toc243489442 \h </w:instrText>
             </w:r>
             <w:r>
               <w:rPr>
@@ -1985,7 +2049,7 @@
               <w:szCs w:val="22"/>
             </w:rPr>
           </w:pPr>
-          <w:hyperlink w:anchor="_Toc243379246" w:history="1">
+          <w:hyperlink w:anchor="_Toc243489443" w:history="1">
             <w:r>
               <w:rPr>
                 <w:rStyle w:val="Hyperlink"/>
@@ -2009,7 +2073,7 @@
               <w:rPr>
                 <w:noProof/>
               </w:rPr>
-              <w:instrText xml:space="preserve"> PAGEREF _Toc243379246 \h </w:instrText>
+              <w:instrText xml:space="preserve"> PAGEREF _Toc243489443 \h </w:instrText>
             </w:r>
             <w:r>
               <w:rPr>
@@ -2049,7 +2113,7 @@
               <w:szCs w:val="22"/>
             </w:rPr>
           </w:pPr>
-          <w:hyperlink w:anchor="_Toc243379247" w:history="1">
+          <w:hyperlink w:anchor="_Toc243489444" w:history="1">
             <w:r>
               <w:rPr>
                 <w:rStyle w:val="Hyperlink"/>
@@ -2073,7 +2137,7 @@
               <w:rPr>
                 <w:noProof/>
               </w:rPr>
-              <w:instrText xml:space="preserve"> PAGEREF _Toc243379247 \h </w:instrText>
+              <w:instrText xml:space="preserve"> PAGEREF _Toc243489444 \h </w:instrText>
             </w:r>
             <w:r>
               <w:rPr>
@@ -2113,7 +2177,7 @@
               <w:szCs w:val="22"/>
             </w:rPr>
           </w:pPr>
-          <w:hyperlink w:anchor="_Toc243379248" w:history="1">
+          <w:hyperlink w:anchor="_Toc243489445" w:history="1">
             <w:r>
               <w:rPr>
                 <w:rStyle w:val="Hyperlink"/>
@@ -2137,7 +2201,7 @@
               <w:rPr>
                 <w:noProof/>
               </w:rPr>
-              <w:instrText xml:space="preserve"> PAGEREF _Toc243379248 \h </w:instrText>
+              <w:instrText xml:space="preserve"> PAGEREF _Toc243489445 \h </w:instrText>
             </w:r>
             <w:r>
               <w:rPr>
@@ -2177,7 +2241,7 @@
               <w:szCs w:val="22"/>
             </w:rPr>
           </w:pPr>
-          <w:hyperlink w:anchor="_Toc243379249" w:history="1">
+          <w:hyperlink w:anchor="_Toc243489446" w:history="1">
             <w:r>
               <w:rPr>
                 <w:rStyle w:val="Hyperlink"/>
@@ -2201,7 +2265,7 @@
               <w:rPr>
                 <w:noProof/>
               </w:rPr>
-              <w:instrText xml:space="preserve"> PAGEREF _Toc243379249 \h </w:instrText>
+              <w:instrText xml:space="preserve"> PAGEREF _Toc243489446 \h </w:instrText>
             </w:r>
             <w:r>
               <w:rPr>
@@ -2241,7 +2305,7 @@
               <w:szCs w:val="22"/>
             </w:rPr>
           </w:pPr>
-          <w:hyperlink w:anchor="_Toc243379250" w:history="1">
+          <w:hyperlink w:anchor="_Toc243489447" w:history="1">
             <w:r>
               <w:rPr>
                 <w:rStyle w:val="Hyperlink"/>
@@ -2265,7 +2329,7 @@
               <w:rPr>
                 <w:noProof/>
               </w:rPr>
-              <w:instrText xml:space="preserve"> PAGEREF _Toc243379250 \h </w:instrText>
+              <w:instrText xml:space="preserve"> PAGEREF _Toc243489447 \h </w:instrText>
             </w:r>
             <w:r>
               <w:rPr>
@@ -2305,7 +2369,7 @@
               <w:szCs w:val="22"/>
             </w:rPr>
           </w:pPr>
-          <w:hyperlink w:anchor="_Toc243379251" w:history="1">
+          <w:hyperlink w:anchor="_Toc243489448" w:history="1">
             <w:r>
               <w:rPr>
                 <w:rStyle w:val="Hyperlink"/>
@@ -2329,7 +2393,7 @@
               <w:rPr>
                 <w:noProof/>
               </w:rPr>
-              <w:instrText xml:space="preserve"> PAGEREF _Toc243379251 \h </w:instrText>
+              <w:instrText xml:space="preserve"> PAGEREF _Toc243489448 \h </w:instrText>
             </w:r>
             <w:r>
               <w:rPr>
@@ -2369,7 +2433,7 @@
               <w:szCs w:val="22"/>
             </w:rPr>
           </w:pPr>
-          <w:hyperlink w:anchor="_Toc243379252" w:history="1">
+          <w:hyperlink w:anchor="_Toc243489449" w:history="1">
             <w:r>
               <w:rPr>
                 <w:rStyle w:val="Hyperlink"/>
@@ -2393,7 +2457,7 @@
               <w:rPr>
                 <w:noProof/>
               </w:rPr>
-              <w:instrText xml:space="preserve"> PAGEREF _Toc243379252 \h </w:instrText>
+              <w:instrText xml:space="preserve"> PAGEREF _Toc243489449 \h </w:instrText>
             </w:r>
             <w:r>
               <w:rPr>
@@ -2432,7 +2496,7 @@
         <w:pStyle w:val="Heading1"/>
         <w:pageBreakBefore/>
       </w:pPr>
-      <w:bookmarkStart w:id="0" w:name="_Toc243379218"/>
+      <w:bookmarkStart w:id="0" w:name="_Toc243489414"/>
       <w:r>
         <w:lastRenderedPageBreak/>
         <w:t>1. Sebelum Mulai: Istilah Dasar</w:t>
@@ -2451,7 +2515,7 @@
       <w:pPr>
         <w:pStyle w:val="Heading2"/>
       </w:pPr>
-      <w:bookmarkStart w:id="1" w:name="_Toc243379219"/>
+      <w:bookmarkStart w:id="1" w:name="_Toc243489415"/>
       <w:r>
         <w:t>1.1 Susunan materi: Modul, Tingkat, dan Level</w:t>
       </w:r>
@@ -2979,7 +3043,7 @@
       <w:pPr>
         <w:pStyle w:val="Heading2"/>
       </w:pPr>
-      <w:bookmarkStart w:id="2" w:name="_Toc243379220"/>
+      <w:bookmarkStart w:id="2" w:name="_Toc243489416"/>
       <w:r>
         <w:t>1.2 Istilah kemajuan</w:t>
       </w:r>
@@ -3611,7 +3675,7 @@
       <w:pPr>
         <w:pStyle w:val="Heading2"/>
       </w:pPr>
-      <w:bookmarkStart w:id="3" w:name="_Toc243379221"/>
+      <w:bookmarkStart w:id="3" w:name="_Toc243489417"/>
       <w:r>
         <w:t>1.3 Sesi kelompok dan latihan mandiri</w:t>
       </w:r>
@@ -4429,7 +4493,7 @@
       <w:pPr>
         <w:pStyle w:val="Heading2"/>
       </w:pPr>
-      <w:bookmarkStart w:id="4" w:name="_Toc243379222"/>
+      <w:bookmarkStart w:id="4" w:name="_Toc243489418"/>
       <w:r>
         <w:t>1.4 Pertemuan terakhir</w:t>
       </w:r>
@@ -4523,7 +4587,7 @@
       <w:pPr>
         <w:pStyle w:val="Heading2"/>
       </w:pPr>
-      <w:bookmarkStart w:id="5" w:name="_Toc243379223"/>
+      <w:bookmarkStart w:id="5" w:name="_Toc243489419"/>
       <w:r>
         <w:t>1.5 Arti warna label</w:t>
       </w:r>
@@ -5229,7 +5293,7 @@
       <w:pPr>
         <w:pStyle w:val="Heading2"/>
       </w:pPr>
-      <w:bookmarkStart w:id="6" w:name="_Toc243379224"/>
+      <w:bookmarkStart w:id="6" w:name="_Toc243489420"/>
       <w:r>
         <w:t>1.6 Profil aturan dan tahapan khusus</w:t>
       </w:r>
@@ -6010,7 +6074,7 @@
         <w:pStyle w:val="Heading1"/>
         <w:pageBreakBefore/>
       </w:pPr>
-      <w:bookmarkStart w:id="7" w:name="_Toc243379225"/>
+      <w:bookmarkStart w:id="7" w:name="_Toc243489421"/>
       <w:r>
         <w:lastRenderedPageBreak/>
         <w:t>2. Tab Sesi Kegiatan</w:t>
@@ -6157,7 +6221,7 @@
       <w:pPr>
         <w:pStyle w:val="Heading2"/>
       </w:pPr>
-      <w:bookmarkStart w:id="8" w:name="_Toc243379226"/>
+      <w:bookmarkStart w:id="8" w:name="_Toc243489422"/>
       <w:r>
         <w:t>2.1 Bilah saringan</w:t>
       </w:r>
@@ -6657,7 +6721,7 @@
       <w:pPr>
         <w:pStyle w:val="Heading2"/>
       </w:pPr>
-      <w:bookmarkStart w:id="9" w:name="_Toc243379227"/>
+      <w:bookmarkStart w:id="9" w:name="_Toc243489423"/>
       <w:r>
         <w:t>2.2 Kartu Sesi latihan</w:t>
       </w:r>
@@ -7474,7 +7538,7 @@
       <w:pPr>
         <w:pStyle w:val="Heading2"/>
       </w:pPr>
-      <w:bookmarkStart w:id="10" w:name="_Toc243379228"/>
+      <w:bookmarkStart w:id="10" w:name="_Toc243489424"/>
       <w:r>
         <w:t>2.3 Kotak Aturan dan tahapan yang berlaku</w:t>
       </w:r>
@@ -7827,7 +7891,7 @@
       <w:pPr>
         <w:pStyle w:val="Heading2"/>
       </w:pPr>
-      <w:bookmarkStart w:id="11" w:name="_Toc243379229"/>
+      <w:bookmarkStart w:id="11" w:name="_Toc243489425"/>
       <w:r>
         <w:t>2.4 Enam kotak ringkasan</w:t>
       </w:r>
@@ -8943,7 +9007,7 @@
       <w:pPr>
         <w:pStyle w:val="Heading2"/>
       </w:pPr>
-      <w:bookmarkStart w:id="12" w:name="_Toc243379230"/>
+      <w:bookmarkStart w:id="12" w:name="_Toc243489426"/>
       <w:r>
         <w:t>2.5 Tabel siswa</w:t>
       </w:r>
@@ -9508,7 +9572,7 @@
       <w:pPr>
         <w:pStyle w:val="Heading2"/>
       </w:pPr>
-      <w:bookmarkStart w:id="13" w:name="_Toc243379231"/>
+      <w:bookmarkStart w:id="13" w:name="_Toc243489427"/>
       <w:r>
         <w:t>2.6 Arti kolom Status</w:t>
       </w:r>
@@ -10531,7 +10595,7 @@
       <w:pPr>
         <w:pStyle w:val="Heading2"/>
       </w:pPr>
-      <w:bookmarkStart w:id="14" w:name="_Toc243379232"/>
+      <w:bookmarkStart w:id="14" w:name="_Toc243489428"/>
       <w:r>
         <w:t>2.7 Bilah aksi untuk siswa terpilih</w:t>
       </w:r>
@@ -10969,7 +11033,7 @@
         <w:pStyle w:val="Heading1"/>
         <w:pageBreakBefore/>
       </w:pPr>
-      <w:bookmarkStart w:id="15" w:name="_Toc243379233"/>
+      <w:bookmarkStart w:id="15" w:name="_Toc243489429"/>
       <w:r>
         <w:lastRenderedPageBreak/>
         <w:t>3. Tab Perkembangan Siswa</w:t>
@@ -11012,27 +11076,33 @@
         <w:spacing w:after="120" w:line="276" w:lineRule="auto"/>
       </w:pPr>
       <w:r>
-        <w:t xml:space="preserve">Di bagian atas ada pilihan kelompok, pilihan urutan, tombol </w:t>
+        <w:t>Di bagian atas</w:t>
+      </w:r>
+      <w:r>
+        <w:t xml:space="preserve"> ada pilihan kelompok, pilihan urutan, tombol Muat ulang, dan Unduh rekap (Excel berkop berisi rekap kemajuan dan sebaran per tingkat). Tab ini punya tiga sub-tab: </w:t>
       </w:r>
       <w:r>
         <w:rPr>
           <w:b/>
           <w:bCs/>
         </w:rPr>
-        <w:t>Muat ulang</w:t>
-      </w:r>
-      <w:r>
-        <w:t xml:space="preserve">, dan </w:t>
+        <w:t>Rekapitulasi</w:t>
+      </w:r>
+      <w:r>
+        <w:t xml:space="preserve"> (terbuka lebih dulu; di bagian bawahnya ada </w:t>
       </w:r>
       <w:r>
         <w:rPr>
           <w:b/>
           <w:bCs/>
         </w:rPr>
-        <w:t>Unduh rekap</w:t>
-      </w:r>
-      <w:r>
-        <w:t xml:space="preserve"> (Excel berkop berisi rekap kemajuan dan sebaran per tingkat). Tab ini punya tiga sub-tab: </w:t>
+        <w:t>Ringkasan keseluruhan</w:t>
+      </w:r>
+      <w:r>
+        <w:t>, yang dulu me</w:t>
+      </w:r>
+      <w:r>
+        <w:t xml:space="preserve">njadi sub-tab Per Kelompok), </w:t>
       </w:r>
       <w:r>
         <w:rPr>
@@ -11042,16 +11112,6 @@
         <w:t>Per Siswa</w:t>
       </w:r>
       <w:r>
-        <w:t xml:space="preserve">, </w:t>
-      </w:r>
-      <w:r>
-        <w:rPr>
-          <w:b/>
-          <w:bCs/>
-        </w:rPr>
-        <w:t>Per Kelompok</w:t>
-      </w:r>
-      <w:r>
         <w:t xml:space="preserve">, dan </w:t>
       </w:r>
       <w:r>
@@ -11069,11 +11129,295 @@
       <w:pPr>
         <w:pStyle w:val="Heading2"/>
       </w:pPr>
-      <w:bookmarkStart w:id="16" w:name="_Toc243379234"/>
-      <w:r>
-        <w:t>3.1 Sub-tab Per Siswa</w:t>
+      <w:bookmarkStart w:id="16" w:name="_Toc243489430"/>
+      <w:r>
+        <w:t>3.1 Sub-tab Rekapitulasi</w:t>
       </w:r>
       <w:bookmarkEnd w:id="16"/>
+    </w:p>
+    <w:p>
+      <w:pPr>
+        <w:spacing w:after="120" w:line="276" w:lineRule="auto"/>
+      </w:pPr>
+      <w:r>
+        <w:t xml:space="preserve">Rapor perkembangan kelompok dalam satu layar, dengan grafik, untuk menjawab pertanyaan guru sehari-hari: siapa yang maju, siapa yang tertinggal, dan materi apa yang perlu dijelaskan ulang. Semua angka memakai </w:t>
+      </w:r>
+      <w:r>
+        <w:rPr>
+          <w:b/>
+          <w:bCs/>
+        </w:rPr>
+        <w:t>kemajuan resmi</w:t>
+      </w:r>
+      <w:r>
+        <w:t xml:space="preserve"> (sesi kelompok); latihan mandiri tidak dihitung.</w:t>
+      </w:r>
+    </w:p>
+    <w:p>
+      <w:pPr>
+        <w:pStyle w:val="Heading3"/>
+      </w:pPr>
+      <w:r>
+        <w:t>3.1.1 Pilihan periode</w:t>
+      </w:r>
+    </w:p>
+    <w:p>
+      <w:pPr>
+        <w:spacing w:after="120" w:line="276" w:lineRule="auto"/>
+      </w:pPr>
+      <w:r>
+        <w:rPr>
+          <w:b/>
+          <w:bCs/>
+        </w:rPr>
+        <w:t>7 hari</w:t>
+      </w:r>
+      <w:r>
+        <w:t xml:space="preserve">, </w:t>
+      </w:r>
+      <w:r>
+        <w:rPr>
+          <w:b/>
+          <w:bCs/>
+        </w:rPr>
+        <w:t>30 hari</w:t>
+      </w:r>
+      <w:r>
+        <w:t xml:space="preserve">, </w:t>
+      </w:r>
+      <w:r>
+        <w:rPr>
+          <w:b/>
+          <w:bCs/>
+        </w:rPr>
+        <w:t>Semester ini</w:t>
+      </w:r>
+      <w:r>
+        <w:t xml:space="preserve">, atau </w:t>
+      </w:r>
+      <w:r>
+        <w:rPr>
+          <w:b/>
+          <w:bCs/>
+        </w:rPr>
+        <w:t>Pilih tanggal…</w:t>
+      </w:r>
+      <w:r>
+        <w:t xml:space="preserve"> (isian Dari dan Sampai, terisi periode yang sedang tampil). Di bawah tombol selalu tertulis periode yang berlaku dan pembandingnya, yaitu rentang sama panjang tepat sebelumnya. Periode tidak pernah keluar dari semester berjalan: tombol cepat dipotong di awal semester (bertanda </w:t>
+      </w:r>
+      <w:r>
+        <w:rPr>
+          <w:b/>
+          <w:bCs/>
+        </w:rPr>
+        <w:t>dipotong di awal semester</w:t>
+      </w:r>
+      <w:r>
+        <w:t xml:space="preserve">), pembanding juga dipotong atau tertulis </w:t>
+      </w:r>
+      <w:r>
+        <w:rPr>
+          <w:b/>
+          <w:bCs/>
+        </w:rPr>
+        <w:t>belum ada pembanding</w:t>
+      </w:r>
+      <w:r>
+        <w:t>, dan tanggal di luar semester ditolak. Semester lalu dibuka di halaman Arsip. Pilihan terakhir diingat di perangkat Anda.</w:t>
+      </w:r>
+    </w:p>
+    <w:p>
+      <w:pPr>
+        <w:pStyle w:val="Heading3"/>
+      </w:pPr>
+      <w:r>
+        <w:t>3.1.2 Rapor satu kelompok</w:t>
+      </w:r>
+    </w:p>
+    <w:p>
+      <w:pPr>
+        <w:spacing w:after="120" w:line="276" w:lineRule="auto"/>
+      </w:pPr>
+      <w:r>
+        <w:t>Muncul bila pilihan kelompok berisi satu kelompok. Urutannya:</w:t>
+      </w:r>
+    </w:p>
+    <w:p>
+      <w:pPr>
+        <w:spacing w:after="120" w:line="276" w:lineRule="auto"/>
+      </w:pPr>
+      <w:r>
+        <w:rPr>
+          <w:b/>
+          <w:bCs/>
+        </w:rPr>
+        <w:t>Kalimat ringkas</w:t>
+      </w:r>
+      <w:r>
+        <w:t xml:space="preserve"> — siswa yang berlatih, level dituntaskan, rata-rata level per siswa, akurasi, dan jumlah siswa yang perlu perhatian.</w:t>
+      </w:r>
+    </w:p>
+    <w:p>
+      <w:pPr>
+        <w:spacing w:after="120" w:line="276" w:lineRule="auto"/>
+      </w:pPr>
+      <w:r>
+        <w:rPr>
+          <w:b/>
+          <w:bCs/>
+        </w:rPr>
+        <w:t>Empat kotak angka</w:t>
+      </w:r>
+      <w:r>
+        <w:t xml:space="preserve"> — siswa berlatih, level dituntaskan, akurasi rata-rata, perlu perhatian; dengan panah naik/turun dibanding periode pembanding (atau keterangan </w:t>
+      </w:r>
+      <w:r>
+        <w:rPr>
+          <w:b/>
+          <w:bCs/>
+        </w:rPr>
+        <w:t>periode lalu tidak ada latihan</w:t>
+      </w:r>
+      <w:r>
+        <w:t>).</w:t>
+      </w:r>
+    </w:p>
+    <w:p>
+      <w:pPr>
+        <w:spacing w:after="120" w:line="276" w:lineRule="auto"/>
+      </w:pPr>
+      <w:r>
+        <w:rPr>
+          <w:b/>
+          <w:bCs/>
+        </w:rPr>
+        <w:t>Peta posisi kelas</w:t>
+      </w:r>
+      <w:r>
+        <w:t xml:space="preserve"> — jalur tingkat digambar sebagai lintasan; satu titik = satu siswa di posisinya. Hijau = naik 2 level atau lebih pada periode ini, emas = naik 1 level, merah = belum naik atau tidak berlatih. Tumpukan tinggi di satu tingkat berarti banyak siswa di sana. Ketuk titik untuk nama, posisi, kenaikan, dan akurasinya.</w:t>
+      </w:r>
+    </w:p>
+    <w:p>
+      <w:pPr>
+        <w:spacing w:after="120" w:line="276" w:lineRule="auto"/>
+      </w:pPr>
+      <w:r>
+        <w:rPr>
+          <w:b/>
+          <w:bCs/>
+        </w:rPr>
+        <w:t>Level dituntaskan per hari latihan</w:t>
+      </w:r>
+      <w:r>
+        <w:t xml:space="preserve"> — kolom per hari (periode panjang diringkas per minggu), dan di bawahnya garis </w:t>
+      </w:r>
+      <w:r>
+        <w:rPr>
+          <w:b/>
+          <w:bCs/>
+        </w:rPr>
+        <w:t>akurasi</w:t>
+      </w:r>
+      <w:r>
+        <w:t xml:space="preserve"> dengan garis target 80%. Terlihat apakah kelas makin cepat atau melambat.</w:t>
+      </w:r>
+    </w:p>
+    <w:p>
+      <w:pPr>
+        <w:spacing w:after="120" w:line="276" w:lineRule="auto"/>
+      </w:pPr>
+      <w:r>
+        <w:rPr>
+          <w:b/>
+          <w:bCs/>
+        </w:rPr>
+        <w:t>Di mana siswa macet</w:t>
+      </w:r>
+      <w:r>
+        <w:t xml:space="preserve"> — level tempat siswa macet (3 kali atau lebih mengulang level yang sama, atau 8 kali salah di level itu; sama dengan label Macet di Per Siswa). Bahan untuk menjelaskan ulang di pertemuan berikutnya.</w:t>
+      </w:r>
+    </w:p>
+    <w:p>
+      <w:pPr>
+        <w:spacing w:after="120" w:line="276" w:lineRule="auto"/>
+      </w:pPr>
+      <w:r>
+        <w:rPr>
+          <w:b/>
+          <w:bCs/>
+        </w:rPr>
+        <w:t>Perlu perhatian</w:t>
+      </w:r>
+      <w:r>
+        <w:t xml:space="preserve"> (tidak berlatih pada periode ini, macet, atau akurasi di bawah 65% dari sedikitnya 10 jawaban, beserta alasannya) dan </w:t>
+      </w:r>
+      <w:r>
+        <w:rPr>
+          <w:b/>
+          <w:bCs/>
+        </w:rPr>
+        <w:t>Bintang periode ini</w:t>
+      </w:r>
+      <w:r>
+        <w:t xml:space="preserve"> (naik level terbanyak). Ketuk nama siswa untuk membuka Analisis Siswa.</w:t>
+      </w:r>
+    </w:p>
+    <w:p>
+      <w:pPr>
+        <w:pStyle w:val="Heading3"/>
+      </w:pPr>
+      <w:r>
+        <w:t>3.1.3 Perbandingan kelompok</w:t>
+      </w:r>
+    </w:p>
+    <w:p>
+      <w:pPr>
+        <w:spacing w:after="120" w:line="276" w:lineRule="auto"/>
+      </w:pPr>
+      <w:r>
+        <w:t xml:space="preserve">Muncul bila dipilih </w:t>
+      </w:r>
+      <w:r>
+        <w:rPr>
+          <w:b/>
+          <w:bCs/>
+        </w:rPr>
+        <w:t>Semua kelompok</w:t>
+      </w:r>
+      <w:r>
+        <w:t xml:space="preserve"> (admin: semua kelompok; guru dengan beberapa kelompok: kelompok yang diampu). Berisi kalimat temuan (kelompok dengan kemajuan terbaik dan yang perlu didorong), grafik </w:t>
+      </w:r>
+      <w:r>
+        <w:rPr>
+          <w:b/>
+          <w:bCs/>
+        </w:rPr>
+        <w:t>level dituntaskan per siswa</w:t>
+      </w:r>
+      <w:r>
+        <w:t xml:space="preserve"> tiap kelompok beserta persentase siswa yang berlatih, dan </w:t>
+      </w:r>
+      <w:r>
+        <w:rPr>
+          <w:b/>
+          <w:bCs/>
+        </w:rPr>
+        <w:t>peta keaktifan per minggu</w:t>
+      </w:r>
+      <w:r>
+        <w:t xml:space="preserve"> (warna makin gelap = makin banyak siswa berlatih minggu itu). Ukurannya per siswa agar kelompok besar dan kecil adil dibandingkan. Ketuk baris kelompok untuk membuka rapornya.</w:t>
+      </w:r>
+    </w:p>
+    <w:p>
+      <w:pPr>
+        <w:pStyle w:val="Heading2"/>
+      </w:pPr>
+      <w:bookmarkStart w:id="17" w:name="_Toc243489431"/>
+      <w:r>
+        <w:lastRenderedPageBreak/>
+        <w:t>3.2 Sub-tab Per Siswa</w:t>
+      </w:r>
+      <w:bookmarkEnd w:id="17"/>
     </w:p>
     <w:p>
       <w:pPr>
@@ -11248,7 +11592,7 @@
                 <w:sz w:val="19"/>
                 <w:szCs w:val="19"/>
               </w:rPr>
-              <w:t>Siswa dengan masalah paling berat (lihat skor pada 3.1.2), lalu yang kemajuannya paling sedikit.</w:t>
+              <w:t>Siswa dengan masalah paling berat (lihat skor pada 3.2.2), lalu yang kemajuannya paling sedikit.</w:t>
             </w:r>
           </w:p>
         </w:tc>
@@ -11463,7 +11807,7 @@
         <w:pStyle w:val="Heading3"/>
       </w:pPr>
       <w:r>
-        <w:t>3.1.1 Kolom tabel Per Siswa</w:t>
+        <w:t>3.2.1 Kolom tabel Per Siswa</w:t>
       </w:r>
     </w:p>
     <w:tbl>
@@ -12524,7 +12868,7 @@
                 <w:sz w:val="19"/>
                 <w:szCs w:val="19"/>
               </w:rPr>
-              <w:t>Label otomatis (lihat 3.1.2).</w:t>
+              <w:t>Label otomatis (lihat 3.2.2).</w:t>
             </w:r>
           </w:p>
         </w:tc>
@@ -12570,8 +12914,7 @@
         <w:pStyle w:val="Heading3"/>
       </w:pPr>
       <w:r>
-        <w:lastRenderedPageBreak/>
-        <w:t>3.1.2 Label di kolom Catatan</w:t>
+        <w:t>3.2.2 Label di kolom Catatan</w:t>
       </w:r>
     </w:p>
     <w:p>
@@ -13058,6 +13401,7 @@
                 <w:szCs w:val="18"/>
                 <w:shd w:val="clear" w:color="auto" w:fill="FDF0D5"/>
               </w:rPr>
+              <w:lastRenderedPageBreak/>
               <w:t xml:space="preserve"> Tidak aktif </w:t>
             </w:r>
           </w:p>
@@ -14341,17 +14685,48 @@
       <w:pPr>
         <w:pStyle w:val="Heading2"/>
       </w:pPr>
-      <w:bookmarkStart w:id="17" w:name="_Toc243379235"/>
-      <w:r>
-        <w:t>3.2 Sub-tab Per Kelompok</w:t>
-      </w:r>
-      <w:bookmarkEnd w:id="17"/>
+      <w:bookmarkStart w:id="18" w:name="_Toc243489432"/>
+      <w:r>
+        <w:t>3.3 Ringkasan keseluruhan (bagian bawah Rekapitulasi)</w:t>
+      </w:r>
+      <w:bookmarkEnd w:id="18"/>
     </w:p>
     <w:p>
       <w:pPr>
         <w:spacing w:after="120" w:line="276" w:lineRule="auto"/>
       </w:pPr>
       <w:r>
+        <w:t xml:space="preserve">Dulu sub-tab Per Kelompok; sejak 22 Oktober 2026 berada di bagian bawah sub-tab </w:t>
+      </w:r>
+      <w:r>
+        <w:rPr>
+          <w:b/>
+          <w:bCs/>
+        </w:rPr>
+        <w:t>Rekapitulasi</w:t>
+      </w:r>
+      <w:r>
+        <w:t xml:space="preserve">, di bawah judul </w:t>
+      </w:r>
+      <w:r>
+        <w:rPr>
+          <w:b/>
+          <w:bCs/>
+        </w:rPr>
+        <w:t>Ringkasan keseluruhan</w:t>
+      </w:r>
+      <w:r>
+        <w:t>. Angka di bagian ini dihitung sejak awal latihan dan tidak mengikuti pilihan periode di atasnya. Mengetuk baris pada tabel pe</w:t>
+      </w:r>
+      <w:r>
+        <w:t>rbandingan kelompok membuka rapor kelompok itu di Rekapitulasi.</w:t>
+      </w:r>
+    </w:p>
+    <w:p>
+      <w:pPr>
+        <w:spacing w:after="120" w:line="276" w:lineRule="auto"/>
+      </w:pPr>
+      <w:r>
         <w:t>Gambaran satu kelompok dalam bentuk ringkasan dan grafik, lalu perbandingan semua kelompok.</w:t>
       </w:r>
     </w:p>
@@ -14360,7 +14735,7 @@
         <w:pStyle w:val="Heading3"/>
       </w:pPr>
       <w:r>
-        <w:t>3.2.1 Kotak ringkasan kelompok terpilih</w:t>
+        <w:t>3.3.1 Kotak ringkasan kelompok terpilih</w:t>
       </w:r>
     </w:p>
     <w:tbl>
@@ -14729,7 +15104,6 @@
                 <w:sz w:val="19"/>
                 <w:szCs w:val="19"/>
               </w:rPr>
-              <w:lastRenderedPageBreak/>
               <w:t>Kotak</w:t>
             </w:r>
           </w:p>
@@ -14997,6 +15371,7 @@
                 <w:sz w:val="19"/>
                 <w:szCs w:val="19"/>
               </w:rPr>
+              <w:lastRenderedPageBreak/>
               <w:t>rata-rata level tuntas (dari N)</w:t>
             </w:r>
           </w:p>
@@ -15191,7 +15566,7 @@
         <w:pStyle w:val="Heading3"/>
       </w:pPr>
       <w:r>
-        <w:t>3.2.2 Grafik Sebaran posisi siswa</w:t>
+        <w:t>3.3.2 Grafik Sebaran posisi siswa</w:t>
       </w:r>
     </w:p>
     <w:p>
@@ -15277,7 +15652,7 @@
         <w:pStyle w:val="Heading3"/>
       </w:pPr>
       <w:r>
-        <w:t>3.2.3 Tabel Perbandingan kelompok</w:t>
+        <w:t>3.3.3 Tabel Perbandingan kelompok</w:t>
       </w:r>
     </w:p>
     <w:p>
@@ -16083,12 +16458,11 @@
       <w:pPr>
         <w:pStyle w:val="Heading2"/>
       </w:pPr>
-      <w:bookmarkStart w:id="18" w:name="_Toc243379236"/>
-      <w:r>
-        <w:lastRenderedPageBreak/>
-        <w:t>3.3 Sub-tab Peringkat</w:t>
-      </w:r>
-      <w:bookmarkEnd w:id="18"/>
+      <w:bookmarkStart w:id="19" w:name="_Toc243489433"/>
+      <w:r>
+        <w:t>3.4 Sub-tab Peringkat</w:t>
+      </w:r>
+      <w:bookmarkEnd w:id="19"/>
     </w:p>
     <w:p>
       <w:pPr>
@@ -16108,7 +16482,11 @@
         <w:t xml:space="preserve"> yang dihitung, kecuali jenis Paling rajin latihan mandiri yang khusus menghitung latihan di luar sesi kelompok.</w:t>
       </w:r>
       <w:r>
-        <w:t xml:space="preserve"> Nilai yang sama mendapat peringkat yang sama (mis. 1, 2, 2, 4). Peringkat 1–3 ditandai warna emas, perak, perunggu, dan kolom yang menjadi dasar peringkat disorot.</w:t>
+        <w:t xml:space="preserve"> Nilai yang sama mendapat peringkat yang sama </w:t>
+      </w:r>
+      <w:r>
+        <w:lastRenderedPageBreak/>
+        <w:t>(mis. 1, 2, 2, 4). Peringkat 1–3 ditandai warna emas, perak, perunggu, dan kolom yang menjadi dasar peringkat disorot.</w:t>
       </w:r>
     </w:p>
     <w:p>
@@ -16116,7 +16494,7 @@
         <w:pStyle w:val="Heading3"/>
       </w:pPr>
       <w:r>
-        <w:t>3.3.1 Pilihan di atas tabel</w:t>
+        <w:t>3.4.1 Pilihan di atas tabel</w:t>
       </w:r>
     </w:p>
     <w:tbl>
@@ -16431,7 +16809,7 @@
                 <w:sz w:val="19"/>
                 <w:szCs w:val="19"/>
               </w:rPr>
-              <w:t>Tujuh jenis; lihat 3.3.2.</w:t>
+              <w:t>Tujuh jenis; lihat 3.4.2.</w:t>
             </w:r>
           </w:p>
         </w:tc>
@@ -16579,7 +16957,7 @@
         <w:pStyle w:val="Heading3"/>
       </w:pPr>
       <w:r>
-        <w:t xml:space="preserve">3.3.2 </w:t>
+        <w:t xml:space="preserve">3.4.2 </w:t>
       </w:r>
       <w:r>
         <w:t>Tujuh jenis peringkat</w:t>
@@ -18027,8 +18405,7 @@
         <w:pStyle w:val="Heading3"/>
       </w:pPr>
       <w:r>
-        <w:lastRenderedPageBreak/>
-        <w:t>3.3.3 Kotak ringkasan Peringkat</w:t>
+        <w:t>3.4.3 Kotak ringkasan Peringkat</w:t>
       </w:r>
     </w:p>
     <w:tbl>
@@ -18285,6 +18662,7 @@
                 <w:sz w:val="19"/>
                 <w:szCs w:val="19"/>
               </w:rPr>
+              <w:lastRenderedPageBreak/>
               <w:t>rata-rata level tuntas</w:t>
             </w:r>
           </w:p>
@@ -18542,7 +18920,7 @@
         <w:pStyle w:val="Heading3"/>
       </w:pPr>
       <w:r>
-        <w:t>3.3.4 Kolom tabel Peringkat</w:t>
+        <w:t>3.4.4 Kolom tabel Peringkat</w:t>
       </w:r>
     </w:p>
     <w:tbl>
@@ -19391,7 +19769,7 @@
         <w:pStyle w:val="Heading3"/>
       </w:pPr>
       <w:r>
-        <w:t>3.3.5 Tabel Perbandingan</w:t>
+        <w:t>3.4.5 Tabel Perbandingan</w:t>
       </w:r>
     </w:p>
     <w:p>
@@ -19785,7 +20163,6 @@
                 <w:sz w:val="19"/>
                 <w:szCs w:val="19"/>
               </w:rPr>
-              <w:lastRenderedPageBreak/>
               <w:t>Level tertinggi / Paling cepat naik</w:t>
             </w:r>
           </w:p>
@@ -19831,12 +20208,12 @@
         <w:pStyle w:val="Heading1"/>
         <w:pageBreakBefore/>
       </w:pPr>
-      <w:bookmarkStart w:id="19" w:name="_Toc243379237"/>
+      <w:bookmarkStart w:id="20" w:name="_Toc243489434"/>
       <w:r>
         <w:lastRenderedPageBreak/>
         <w:t>4. Tab Analisis Siswa</w:t>
       </w:r>
-      <w:bookmarkEnd w:id="19"/>
+      <w:bookmarkEnd w:id="20"/>
     </w:p>
     <w:p>
       <w:pPr>
@@ -21110,11 +21487,11 @@
       <w:pPr>
         <w:pStyle w:val="Heading2"/>
       </w:pPr>
-      <w:bookmarkStart w:id="20" w:name="_Toc243379238"/>
+      <w:bookmarkStart w:id="21" w:name="_Toc243489435"/>
       <w:r>
         <w:t>4.1 Kartu identitas</w:t>
       </w:r>
-      <w:bookmarkEnd w:id="20"/>
+      <w:bookmarkEnd w:id="21"/>
     </w:p>
     <w:p>
       <w:pPr>
@@ -21138,11 +21515,11 @@
       <w:pPr>
         <w:pStyle w:val="Heading2"/>
       </w:pPr>
-      <w:bookmarkStart w:id="21" w:name="_Toc243379239"/>
+      <w:bookmarkStart w:id="22" w:name="_Toc243489436"/>
       <w:r>
         <w:t>4.2 Lima kotak ringkasan</w:t>
       </w:r>
-      <w:bookmarkEnd w:id="21"/>
+      <w:bookmarkEnd w:id="22"/>
     </w:p>
     <w:tbl>
       <w:tblPr>
@@ -22022,11 +22399,11 @@
       <w:pPr>
         <w:pStyle w:val="Heading2"/>
       </w:pPr>
-      <w:bookmarkStart w:id="22" w:name="_Toc243379240"/>
+      <w:bookmarkStart w:id="23" w:name="_Toc243489437"/>
       <w:r>
         <w:t>4.3 Aturan dan tahapan yang berlaku</w:t>
       </w:r>
-      <w:bookmarkEnd w:id="22"/>
+      <w:bookmarkEnd w:id="23"/>
     </w:p>
     <w:p>
       <w:pPr>
@@ -22327,11 +22704,11 @@
       <w:pPr>
         <w:pStyle w:val="Heading2"/>
       </w:pPr>
-      <w:bookmarkStart w:id="23" w:name="_Toc243379241"/>
+      <w:bookmarkStart w:id="24" w:name="_Toc243489438"/>
       <w:r>
         <w:t>4.4 Catatan otomatis</w:t>
       </w:r>
-      <w:bookmarkEnd w:id="23"/>
+      <w:bookmarkEnd w:id="24"/>
     </w:p>
     <w:p>
       <w:pPr>
@@ -23079,11 +23456,11 @@
       <w:pPr>
         <w:pStyle w:val="Heading2"/>
       </w:pPr>
-      <w:bookmarkStart w:id="24" w:name="_Toc243379242"/>
+      <w:bookmarkStart w:id="25" w:name="_Toc243489439"/>
       <w:r>
         <w:t>4.5 Kartu Latihan mandiri (di luar sesi)</w:t>
       </w:r>
-      <w:bookmarkEnd w:id="24"/>
+      <w:bookmarkEnd w:id="25"/>
     </w:p>
     <w:p>
       <w:pPr>
@@ -23806,11 +24183,11 @@
       <w:pPr>
         <w:pStyle w:val="Heading2"/>
       </w:pPr>
-      <w:bookmarkStart w:id="25" w:name="_Toc243379243"/>
+      <w:bookmarkStart w:id="26" w:name="_Toc243489440"/>
       <w:r>
         <w:t>4.6 Riwayat semester (arsip)</w:t>
       </w:r>
-      <w:bookmarkEnd w:id="25"/>
+      <w:bookmarkEnd w:id="26"/>
     </w:p>
     <w:p>
       <w:pPr>
@@ -23904,11 +24281,11 @@
       <w:pPr>
         <w:pStyle w:val="Heading2"/>
       </w:pPr>
-      <w:bookmarkStart w:id="26" w:name="_Toc243379244"/>
+      <w:bookmarkStart w:id="27" w:name="_Toc243489441"/>
       <w:r>
         <w:t>4.7 Grafik Kemajuan level tuntas</w:t>
       </w:r>
-      <w:bookmarkEnd w:id="26"/>
+      <w:bookmarkEnd w:id="27"/>
     </w:p>
     <w:p>
       <w:pPr>
@@ -24291,11 +24668,11 @@
       <w:pPr>
         <w:pStyle w:val="Heading2"/>
       </w:pPr>
-      <w:bookmarkStart w:id="27" w:name="_Toc243379245"/>
+      <w:bookmarkStart w:id="28" w:name="_Toc243489442"/>
       <w:r>
         <w:t>4.8 Jenis kesalahan</w:t>
       </w:r>
-      <w:bookmarkEnd w:id="27"/>
+      <w:bookmarkEnd w:id="28"/>
     </w:p>
     <w:p>
       <w:pPr>
@@ -26141,11 +26518,11 @@
       <w:pPr>
         <w:pStyle w:val="Heading2"/>
       </w:pPr>
-      <w:bookmarkStart w:id="28" w:name="_Toc243379246"/>
+      <w:bookmarkStart w:id="29" w:name="_Toc243489443"/>
       <w:r>
         <w:t>4.9 Per tingkat</w:t>
       </w:r>
-      <w:bookmarkEnd w:id="28"/>
+      <w:bookmarkEnd w:id="29"/>
     </w:p>
     <w:tbl>
       <w:tblPr>
@@ -26533,11 +26910,11 @@
       <w:pPr>
         <w:pStyle w:val="Heading2"/>
       </w:pPr>
-      <w:bookmarkStart w:id="29" w:name="_Toc243379247"/>
+      <w:bookmarkStart w:id="30" w:name="_Toc243489444"/>
       <w:r>
         <w:t>4.10 Kesalahan terakhir</w:t>
       </w:r>
-      <w:bookmarkEnd w:id="29"/>
+      <w:bookmarkEnd w:id="30"/>
     </w:p>
     <w:p>
       <w:pPr>
@@ -27139,11 +27516,11 @@
       <w:pPr>
         <w:pStyle w:val="Heading2"/>
       </w:pPr>
-      <w:bookmarkStart w:id="30" w:name="_Toc243379248"/>
+      <w:bookmarkStart w:id="31" w:name="_Toc243489445"/>
       <w:r>
         <w:t>4.11 Riwayat level tuntas</w:t>
       </w:r>
-      <w:bookmarkEnd w:id="30"/>
+      <w:bookmarkEnd w:id="31"/>
     </w:p>
     <w:p>
       <w:pPr>
@@ -27762,11 +28139,11 @@
       <w:pPr>
         <w:pStyle w:val="Heading2"/>
       </w:pPr>
-      <w:bookmarkStart w:id="31" w:name="_Toc243379249"/>
+      <w:bookmarkStart w:id="32" w:name="_Toc243489446"/>
       <w:r>
         <w:t>4.12 Pindahkan posisi dan Hapus data latihan</w:t>
       </w:r>
-      <w:bookmarkEnd w:id="31"/>
+      <w:bookmarkEnd w:id="32"/>
     </w:p>
     <w:p>
       <w:pPr>
@@ -27942,22 +28319,22 @@
         <w:pStyle w:val="Heading1"/>
         <w:pageBreakBefore/>
       </w:pPr>
-      <w:bookmarkStart w:id="32" w:name="_Toc243379250"/>
+      <w:bookmarkStart w:id="33" w:name="_Toc243489447"/>
       <w:r>
         <w:lastRenderedPageBreak/>
         <w:t>5. Dari Data ke Tindakan</w:t>
       </w:r>
-      <w:bookmarkEnd w:id="32"/>
+      <w:bookmarkEnd w:id="33"/>
     </w:p>
     <w:p>
       <w:pPr>
         <w:pStyle w:val="Heading2"/>
       </w:pPr>
-      <w:bookmarkStart w:id="33" w:name="_Toc243379251"/>
+      <w:bookmarkStart w:id="34" w:name="_Toc243489448"/>
       <w:r>
         <w:t>5.1 Situasi umum dan tindakan</w:t>
       </w:r>
-      <w:bookmarkEnd w:id="33"/>
+      <w:bookmarkEnd w:id="34"/>
     </w:p>
     <w:p>
       <w:pPr>
@@ -28796,7 +29173,7 @@
                 <w:sz w:val="19"/>
                 <w:szCs w:val="19"/>
               </w:rPr>
-              <w:t>Per Kelompok → Posisi tertinggi; Peringkat → Paling cepat naik</w:t>
+              <w:t>Rekapitulasi (Ringkasan keseluruhan) → Posisi tertinggi; Peringkat → Paling cepat naik</w:t>
             </w:r>
           </w:p>
         </w:tc>
@@ -29015,7 +29392,7 @@
                 <w:sz w:val="19"/>
                 <w:szCs w:val="19"/>
               </w:rPr>
-              <w:t>Per Kelompok → rata-rata level, akurasi; Peringkat → Naik per siswa</w:t>
+              <w:t>Rekapitulasi (Ringkasan keseluruhan) → rata-rata level, akurasi; Peringkat → Naik per siswa</w:t>
             </w:r>
           </w:p>
         </w:tc>
@@ -29108,7 +29485,7 @@
                 <w:sz w:val="19"/>
                 <w:szCs w:val="19"/>
               </w:rPr>
-              <w:t>Per Kelompok → kolom Pertemuan terakhir</w:t>
+              <w:t>Rekapitulasi (Ringkasan keseluruhan) → kolom Pertemuan terakhir</w:t>
             </w:r>
           </w:p>
         </w:tc>
@@ -29153,12 +29530,12 @@
         <w:pStyle w:val="Heading2"/>
         <w:pageBreakBefore/>
       </w:pPr>
-      <w:bookmarkStart w:id="34" w:name="_Toc243379252"/>
+      <w:bookmarkStart w:id="35" w:name="_Toc243489449"/>
       <w:r>
         <w:lastRenderedPageBreak/>
         <w:t>5.2 Tanya jawab singkat</w:t>
       </w:r>
-      <w:bookmarkEnd w:id="34"/>
+      <w:bookmarkEnd w:id="35"/>
     </w:p>
     <w:tbl>
       <w:tblPr>

</xml_diff>

<commit_message>
Ringkasan keseluruhan: sebaran posisi hanya tingkat yang berisi siswa
Co-Authored-By: Claude Opus 5.5 <noreply@anthropic.com>
</commit_message>
<xml_diff>
--- a/Panduan_Membaca_Data_Matdas.docx
+++ b/Panduan_Membaca_Data_Matdas.docx
@@ -193,7 +193,7 @@
           <w:r>
             <w:fldChar w:fldCharType="separate"/>
           </w:r>
-          <w:hyperlink w:anchor="_Toc243489414" w:history="1">
+          <w:hyperlink w:anchor="_Toc243499890" w:history="1">
             <w:r>
               <w:rPr>
                 <w:rStyle w:val="Hyperlink"/>
@@ -217,7 +217,7 @@
               <w:rPr>
                 <w:noProof/>
               </w:rPr>
-              <w:instrText xml:space="preserve"> PAGEREF _Toc243489414 \h </w:instrText>
+              <w:instrText xml:space="preserve"> PAGEREF _Toc243499890 \h </w:instrText>
             </w:r>
             <w:r>
               <w:rPr>
@@ -257,7 +257,7 @@
               <w:szCs w:val="22"/>
             </w:rPr>
           </w:pPr>
-          <w:hyperlink w:anchor="_Toc243489415" w:history="1">
+          <w:hyperlink w:anchor="_Toc243499891" w:history="1">
             <w:r>
               <w:rPr>
                 <w:rStyle w:val="Hyperlink"/>
@@ -281,7 +281,7 @@
               <w:rPr>
                 <w:noProof/>
               </w:rPr>
-              <w:instrText xml:space="preserve"> PAGEREF _Toc243489415 \h </w:instrText>
+              <w:instrText xml:space="preserve"> PAGEREF _Toc243499891 \h </w:instrText>
             </w:r>
             <w:r>
               <w:rPr>
@@ -321,7 +321,7 @@
               <w:szCs w:val="22"/>
             </w:rPr>
           </w:pPr>
-          <w:hyperlink w:anchor="_Toc243489416" w:history="1">
+          <w:hyperlink w:anchor="_Toc243499892" w:history="1">
             <w:r>
               <w:rPr>
                 <w:rStyle w:val="Hyperlink"/>
@@ -345,7 +345,7 @@
               <w:rPr>
                 <w:noProof/>
               </w:rPr>
-              <w:instrText xml:space="preserve"> PAGEREF _Toc243489416 \h </w:instrText>
+              <w:instrText xml:space="preserve"> PAGEREF _Toc243499892 \h </w:instrText>
             </w:r>
             <w:r>
               <w:rPr>
@@ -385,7 +385,7 @@
               <w:szCs w:val="22"/>
             </w:rPr>
           </w:pPr>
-          <w:hyperlink w:anchor="_Toc243489417" w:history="1">
+          <w:hyperlink w:anchor="_Toc243499893" w:history="1">
             <w:r>
               <w:rPr>
                 <w:rStyle w:val="Hyperlink"/>
@@ -409,7 +409,7 @@
               <w:rPr>
                 <w:noProof/>
               </w:rPr>
-              <w:instrText xml:space="preserve"> PAGEREF _Toc243489417 \h </w:instrText>
+              <w:instrText xml:space="preserve"> PAGEREF _Toc243499893 \h </w:instrText>
             </w:r>
             <w:r>
               <w:rPr>
@@ -449,7 +449,7 @@
               <w:szCs w:val="22"/>
             </w:rPr>
           </w:pPr>
-          <w:hyperlink w:anchor="_Toc243489418" w:history="1">
+          <w:hyperlink w:anchor="_Toc243499894" w:history="1">
             <w:r>
               <w:rPr>
                 <w:rStyle w:val="Hyperlink"/>
@@ -473,7 +473,7 @@
               <w:rPr>
                 <w:noProof/>
               </w:rPr>
-              <w:instrText xml:space="preserve"> PAGEREF _Toc243489418 \h </w:instrText>
+              <w:instrText xml:space="preserve"> PAGEREF _Toc243499894 \h </w:instrText>
             </w:r>
             <w:r>
               <w:rPr>
@@ -513,7 +513,7 @@
               <w:szCs w:val="22"/>
             </w:rPr>
           </w:pPr>
-          <w:hyperlink w:anchor="_Toc243489419" w:history="1">
+          <w:hyperlink w:anchor="_Toc243499895" w:history="1">
             <w:r>
               <w:rPr>
                 <w:rStyle w:val="Hyperlink"/>
@@ -537,7 +537,7 @@
               <w:rPr>
                 <w:noProof/>
               </w:rPr>
-              <w:instrText xml:space="preserve"> PAGEREF _Toc243489419 \h </w:instrText>
+              <w:instrText xml:space="preserve"> PAGEREF _Toc243499895 \h </w:instrText>
             </w:r>
             <w:r>
               <w:rPr>
@@ -577,7 +577,7 @@
               <w:szCs w:val="22"/>
             </w:rPr>
           </w:pPr>
-          <w:hyperlink w:anchor="_Toc243489420" w:history="1">
+          <w:hyperlink w:anchor="_Toc243499896" w:history="1">
             <w:r>
               <w:rPr>
                 <w:rStyle w:val="Hyperlink"/>
@@ -601,7 +601,7 @@
               <w:rPr>
                 <w:noProof/>
               </w:rPr>
-              <w:instrText xml:space="preserve"> PAGEREF _Toc243489420 \h </w:instrText>
+              <w:instrText xml:space="preserve"> PAGEREF _Toc243499896 \h </w:instrText>
             </w:r>
             <w:r>
               <w:rPr>
@@ -641,7 +641,7 @@
               <w:szCs w:val="22"/>
             </w:rPr>
           </w:pPr>
-          <w:hyperlink w:anchor="_Toc243489421" w:history="1">
+          <w:hyperlink w:anchor="_Toc243499897" w:history="1">
             <w:r>
               <w:rPr>
                 <w:rStyle w:val="Hyperlink"/>
@@ -665,7 +665,7 @@
               <w:rPr>
                 <w:noProof/>
               </w:rPr>
-              <w:instrText xml:space="preserve"> PAGEREF _Toc243489421 \h </w:instrText>
+              <w:instrText xml:space="preserve"> PAGEREF _Toc243499897 \h </w:instrText>
             </w:r>
             <w:r>
               <w:rPr>
@@ -705,7 +705,7 @@
               <w:szCs w:val="22"/>
             </w:rPr>
           </w:pPr>
-          <w:hyperlink w:anchor="_Toc243489422" w:history="1">
+          <w:hyperlink w:anchor="_Toc243499898" w:history="1">
             <w:r>
               <w:rPr>
                 <w:rStyle w:val="Hyperlink"/>
@@ -729,7 +729,7 @@
               <w:rPr>
                 <w:noProof/>
               </w:rPr>
-              <w:instrText xml:space="preserve"> PAGEREF _Toc243489422 \h </w:instrText>
+              <w:instrText xml:space="preserve"> PAGEREF _Toc243499898 \h </w:instrText>
             </w:r>
             <w:r>
               <w:rPr>
@@ -769,7 +769,7 @@
               <w:szCs w:val="22"/>
             </w:rPr>
           </w:pPr>
-          <w:hyperlink w:anchor="_Toc243489423" w:history="1">
+          <w:hyperlink w:anchor="_Toc243499899" w:history="1">
             <w:r>
               <w:rPr>
                 <w:rStyle w:val="Hyperlink"/>
@@ -793,7 +793,7 @@
               <w:rPr>
                 <w:noProof/>
               </w:rPr>
-              <w:instrText xml:space="preserve"> PAGEREF _Toc243489423 \h </w:instrText>
+              <w:instrText xml:space="preserve"> PAGEREF _Toc243499899 \h </w:instrText>
             </w:r>
             <w:r>
               <w:rPr>
@@ -833,7 +833,7 @@
               <w:szCs w:val="22"/>
             </w:rPr>
           </w:pPr>
-          <w:hyperlink w:anchor="_Toc243489424" w:history="1">
+          <w:hyperlink w:anchor="_Toc243499900" w:history="1">
             <w:r>
               <w:rPr>
                 <w:rStyle w:val="Hyperlink"/>
@@ -857,7 +857,7 @@
               <w:rPr>
                 <w:noProof/>
               </w:rPr>
-              <w:instrText xml:space="preserve"> PAGEREF _Toc243489424 \h </w:instrText>
+              <w:instrText xml:space="preserve"> PAGEREF _Toc243499900 \h </w:instrText>
             </w:r>
             <w:r>
               <w:rPr>
@@ -897,7 +897,7 @@
               <w:szCs w:val="22"/>
             </w:rPr>
           </w:pPr>
-          <w:hyperlink w:anchor="_Toc243489425" w:history="1">
+          <w:hyperlink w:anchor="_Toc243499901" w:history="1">
             <w:r>
               <w:rPr>
                 <w:rStyle w:val="Hyperlink"/>
@@ -921,7 +921,7 @@
               <w:rPr>
                 <w:noProof/>
               </w:rPr>
-              <w:instrText xml:space="preserve"> PAGEREF _Toc243489425 \h </w:instrText>
+              <w:instrText xml:space="preserve"> PAGEREF _Toc243499901 \h </w:instrText>
             </w:r>
             <w:r>
               <w:rPr>
@@ -961,7 +961,7 @@
               <w:szCs w:val="22"/>
             </w:rPr>
           </w:pPr>
-          <w:hyperlink w:anchor="_Toc243489426" w:history="1">
+          <w:hyperlink w:anchor="_Toc243499902" w:history="1">
             <w:r>
               <w:rPr>
                 <w:rStyle w:val="Hyperlink"/>
@@ -985,7 +985,7 @@
               <w:rPr>
                 <w:noProof/>
               </w:rPr>
-              <w:instrText xml:space="preserve"> PAGEREF _Toc243489426 \h </w:instrText>
+              <w:instrText xml:space="preserve"> PAGEREF _Toc243499902 \h </w:instrText>
             </w:r>
             <w:r>
               <w:rPr>
@@ -1025,7 +1025,7 @@
               <w:szCs w:val="22"/>
             </w:rPr>
           </w:pPr>
-          <w:hyperlink w:anchor="_Toc243489427" w:history="1">
+          <w:hyperlink w:anchor="_Toc243499903" w:history="1">
             <w:r>
               <w:rPr>
                 <w:rStyle w:val="Hyperlink"/>
@@ -1049,7 +1049,7 @@
               <w:rPr>
                 <w:noProof/>
               </w:rPr>
-              <w:instrText xml:space="preserve"> PAGEREF _Toc243489427 \h </w:instrText>
+              <w:instrText xml:space="preserve"> PAGEREF _Toc243499903 \h </w:instrText>
             </w:r>
             <w:r>
               <w:rPr>
@@ -1089,7 +1089,7 @@
               <w:szCs w:val="22"/>
             </w:rPr>
           </w:pPr>
-          <w:hyperlink w:anchor="_Toc243489428" w:history="1">
+          <w:hyperlink w:anchor="_Toc243499904" w:history="1">
             <w:r>
               <w:rPr>
                 <w:rStyle w:val="Hyperlink"/>
@@ -1113,7 +1113,7 @@
               <w:rPr>
                 <w:noProof/>
               </w:rPr>
-              <w:instrText xml:space="preserve"> PAGEREF _Toc243489428 \h </w:instrText>
+              <w:instrText xml:space="preserve"> PAGEREF _Toc243499904 \h </w:instrText>
             </w:r>
             <w:r>
               <w:rPr>
@@ -1153,7 +1153,7 @@
               <w:szCs w:val="22"/>
             </w:rPr>
           </w:pPr>
-          <w:hyperlink w:anchor="_Toc243489429" w:history="1">
+          <w:hyperlink w:anchor="_Toc243499905" w:history="1">
             <w:r>
               <w:rPr>
                 <w:rStyle w:val="Hyperlink"/>
@@ -1177,7 +1177,7 @@
               <w:rPr>
                 <w:noProof/>
               </w:rPr>
-              <w:instrText xml:space="preserve"> PAGEREF _Toc243489429 \h </w:instrText>
+              <w:instrText xml:space="preserve"> PAGEREF _Toc243499905 \h </w:instrText>
             </w:r>
             <w:r>
               <w:rPr>
@@ -1217,7 +1217,7 @@
               <w:szCs w:val="22"/>
             </w:rPr>
           </w:pPr>
-          <w:hyperlink w:anchor="_Toc243489430" w:history="1">
+          <w:hyperlink w:anchor="_Toc243499906" w:history="1">
             <w:r>
               <w:rPr>
                 <w:rStyle w:val="Hyperlink"/>
@@ -1241,7 +1241,7 @@
               <w:rPr>
                 <w:noProof/>
               </w:rPr>
-              <w:instrText xml:space="preserve"> PAGEREF _Toc243489430 \h </w:instrText>
+              <w:instrText xml:space="preserve"> PAGEREF _Toc243499906 \h </w:instrText>
             </w:r>
             <w:r>
               <w:rPr>
@@ -1281,7 +1281,7 @@
               <w:szCs w:val="22"/>
             </w:rPr>
           </w:pPr>
-          <w:hyperlink w:anchor="_Toc243489431" w:history="1">
+          <w:hyperlink w:anchor="_Toc243499907" w:history="1">
             <w:r>
               <w:rPr>
                 <w:rStyle w:val="Hyperlink"/>
@@ -1305,7 +1305,7 @@
               <w:rPr>
                 <w:noProof/>
               </w:rPr>
-              <w:instrText xml:space="preserve"> PAGEREF _Toc243489431 \h </w:instrText>
+              <w:instrText xml:space="preserve"> PAGEREF _Toc243499907 \h </w:instrText>
             </w:r>
             <w:r>
               <w:rPr>
@@ -1345,7 +1345,7 @@
               <w:szCs w:val="22"/>
             </w:rPr>
           </w:pPr>
-          <w:hyperlink w:anchor="_Toc243489432" w:history="1">
+          <w:hyperlink w:anchor="_Toc243499908" w:history="1">
             <w:r>
               <w:rPr>
                 <w:rStyle w:val="Hyperlink"/>
@@ -1369,7 +1369,7 @@
               <w:rPr>
                 <w:noProof/>
               </w:rPr>
-              <w:instrText xml:space="preserve"> PAGEREF _Toc243489432 \h </w:instrText>
+              <w:instrText xml:space="preserve"> PAGEREF _Toc243499908 \h </w:instrText>
             </w:r>
             <w:r>
               <w:rPr>
@@ -1409,7 +1409,7 @@
               <w:szCs w:val="22"/>
             </w:rPr>
           </w:pPr>
-          <w:hyperlink w:anchor="_Toc243489433" w:history="1">
+          <w:hyperlink w:anchor="_Toc243499909" w:history="1">
             <w:r>
               <w:rPr>
                 <w:rStyle w:val="Hyperlink"/>
@@ -1433,7 +1433,7 @@
               <w:rPr>
                 <w:noProof/>
               </w:rPr>
-              <w:instrText xml:space="preserve"> PAGEREF _Toc243489433 \h </w:instrText>
+              <w:instrText xml:space="preserve"> PAGEREF _Toc243499909 \h </w:instrText>
             </w:r>
             <w:r>
               <w:rPr>
@@ -1473,7 +1473,7 @@
               <w:szCs w:val="22"/>
             </w:rPr>
           </w:pPr>
-          <w:hyperlink w:anchor="_Toc243489434" w:history="1">
+          <w:hyperlink w:anchor="_Toc243499910" w:history="1">
             <w:r>
               <w:rPr>
                 <w:rStyle w:val="Hyperlink"/>
@@ -1497,7 +1497,7 @@
               <w:rPr>
                 <w:noProof/>
               </w:rPr>
-              <w:instrText xml:space="preserve"> PAGEREF _Toc243489434 \h </w:instrText>
+              <w:instrText xml:space="preserve"> PAGEREF _Toc243499910 \h </w:instrText>
             </w:r>
             <w:r>
               <w:rPr>
@@ -1537,7 +1537,7 @@
               <w:szCs w:val="22"/>
             </w:rPr>
           </w:pPr>
-          <w:hyperlink w:anchor="_Toc243489435" w:history="1">
+          <w:hyperlink w:anchor="_Toc243499911" w:history="1">
             <w:r>
               <w:rPr>
                 <w:rStyle w:val="Hyperlink"/>
@@ -1561,7 +1561,7 @@
               <w:rPr>
                 <w:noProof/>
               </w:rPr>
-              <w:instrText xml:space="preserve"> PAGEREF _Toc243489435 \h </w:instrText>
+              <w:instrText xml:space="preserve"> PAGEREF _Toc243499911 \h </w:instrText>
             </w:r>
             <w:r>
               <w:rPr>
@@ -1601,7 +1601,7 @@
               <w:szCs w:val="22"/>
             </w:rPr>
           </w:pPr>
-          <w:hyperlink w:anchor="_Toc243489436" w:history="1">
+          <w:hyperlink w:anchor="_Toc243499912" w:history="1">
             <w:r>
               <w:rPr>
                 <w:rStyle w:val="Hyperlink"/>
@@ -1625,7 +1625,7 @@
               <w:rPr>
                 <w:noProof/>
               </w:rPr>
-              <w:instrText xml:space="preserve"> PAGEREF _Toc243489436 \h </w:instrText>
+              <w:instrText xml:space="preserve"> PAGEREF _Toc243499912 \h </w:instrText>
             </w:r>
             <w:r>
               <w:rPr>
@@ -1665,7 +1665,7 @@
               <w:szCs w:val="22"/>
             </w:rPr>
           </w:pPr>
-          <w:hyperlink w:anchor="_Toc243489437" w:history="1">
+          <w:hyperlink w:anchor="_Toc243499913" w:history="1">
             <w:r>
               <w:rPr>
                 <w:rStyle w:val="Hyperlink"/>
@@ -1689,7 +1689,7 @@
               <w:rPr>
                 <w:noProof/>
               </w:rPr>
-              <w:instrText xml:space="preserve"> PAGEREF _Toc243489437 \h </w:instrText>
+              <w:instrText xml:space="preserve"> PAGEREF _Toc243499913 \h </w:instrText>
             </w:r>
             <w:r>
               <w:rPr>
@@ -1729,7 +1729,7 @@
               <w:szCs w:val="22"/>
             </w:rPr>
           </w:pPr>
-          <w:hyperlink w:anchor="_Toc243489438" w:history="1">
+          <w:hyperlink w:anchor="_Toc243499914" w:history="1">
             <w:r>
               <w:rPr>
                 <w:rStyle w:val="Hyperlink"/>
@@ -1753,7 +1753,7 @@
               <w:rPr>
                 <w:noProof/>
               </w:rPr>
-              <w:instrText xml:space="preserve"> PAGEREF _Toc243489438 \h </w:instrText>
+              <w:instrText xml:space="preserve"> PAGEREF _Toc243499914 \h </w:instrText>
             </w:r>
             <w:r>
               <w:rPr>
@@ -1793,7 +1793,7 @@
               <w:szCs w:val="22"/>
             </w:rPr>
           </w:pPr>
-          <w:hyperlink w:anchor="_Toc243489439" w:history="1">
+          <w:hyperlink w:anchor="_Toc243499915" w:history="1">
             <w:r>
               <w:rPr>
                 <w:rStyle w:val="Hyperlink"/>
@@ -1817,7 +1817,7 @@
               <w:rPr>
                 <w:noProof/>
               </w:rPr>
-              <w:instrText xml:space="preserve"> PAGEREF _Toc243489439 \h </w:instrText>
+              <w:instrText xml:space="preserve"> PAGEREF _Toc243499915 \h </w:instrText>
             </w:r>
             <w:r>
               <w:rPr>
@@ -1857,7 +1857,7 @@
               <w:szCs w:val="22"/>
             </w:rPr>
           </w:pPr>
-          <w:hyperlink w:anchor="_Toc243489440" w:history="1">
+          <w:hyperlink w:anchor="_Toc243499916" w:history="1">
             <w:r>
               <w:rPr>
                 <w:rStyle w:val="Hyperlink"/>
@@ -1881,7 +1881,7 @@
               <w:rPr>
                 <w:noProof/>
               </w:rPr>
-              <w:instrText xml:space="preserve"> PAGEREF _Toc243489440 \h </w:instrText>
+              <w:instrText xml:space="preserve"> PAGEREF _Toc243499916 \h </w:instrText>
             </w:r>
             <w:r>
               <w:rPr>
@@ -1921,7 +1921,7 @@
               <w:szCs w:val="22"/>
             </w:rPr>
           </w:pPr>
-          <w:hyperlink w:anchor="_Toc243489441" w:history="1">
+          <w:hyperlink w:anchor="_Toc243499917" w:history="1">
             <w:r>
               <w:rPr>
                 <w:rStyle w:val="Hyperlink"/>
@@ -1945,7 +1945,7 @@
               <w:rPr>
                 <w:noProof/>
               </w:rPr>
-              <w:instrText xml:space="preserve"> PAGEREF _Toc243489441 \h </w:instrText>
+              <w:instrText xml:space="preserve"> PAGEREF _Toc243499917 \h </w:instrText>
             </w:r>
             <w:r>
               <w:rPr>
@@ -1985,7 +1985,7 @@
               <w:szCs w:val="22"/>
             </w:rPr>
           </w:pPr>
-          <w:hyperlink w:anchor="_Toc243489442" w:history="1">
+          <w:hyperlink w:anchor="_Toc243499918" w:history="1">
             <w:r>
               <w:rPr>
                 <w:rStyle w:val="Hyperlink"/>
@@ -2009,7 +2009,7 @@
               <w:rPr>
                 <w:noProof/>
               </w:rPr>
-              <w:instrText xml:space="preserve"> PAGEREF _Toc243489442 \h </w:instrText>
+              <w:instrText xml:space="preserve"> PAGEREF _Toc243499918 \h </w:instrText>
             </w:r>
             <w:r>
               <w:rPr>
@@ -2049,7 +2049,7 @@
               <w:szCs w:val="22"/>
             </w:rPr>
           </w:pPr>
-          <w:hyperlink w:anchor="_Toc243489443" w:history="1">
+          <w:hyperlink w:anchor="_Toc243499919" w:history="1">
             <w:r>
               <w:rPr>
                 <w:rStyle w:val="Hyperlink"/>
@@ -2073,7 +2073,7 @@
               <w:rPr>
                 <w:noProof/>
               </w:rPr>
-              <w:instrText xml:space="preserve"> PAGEREF _Toc243489443 \h </w:instrText>
+              <w:instrText xml:space="preserve"> PAGEREF _Toc243499919 \h </w:instrText>
             </w:r>
             <w:r>
               <w:rPr>
@@ -2113,7 +2113,7 @@
               <w:szCs w:val="22"/>
             </w:rPr>
           </w:pPr>
-          <w:hyperlink w:anchor="_Toc243489444" w:history="1">
+          <w:hyperlink w:anchor="_Toc243499920" w:history="1">
             <w:r>
               <w:rPr>
                 <w:rStyle w:val="Hyperlink"/>
@@ -2137,7 +2137,7 @@
               <w:rPr>
                 <w:noProof/>
               </w:rPr>
-              <w:instrText xml:space="preserve"> PAGEREF _Toc243489444 \h </w:instrText>
+              <w:instrText xml:space="preserve"> PAGEREF _Toc243499920 \h </w:instrText>
             </w:r>
             <w:r>
               <w:rPr>
@@ -2177,7 +2177,7 @@
               <w:szCs w:val="22"/>
             </w:rPr>
           </w:pPr>
-          <w:hyperlink w:anchor="_Toc243489445" w:history="1">
+          <w:hyperlink w:anchor="_Toc243499921" w:history="1">
             <w:r>
               <w:rPr>
                 <w:rStyle w:val="Hyperlink"/>
@@ -2201,7 +2201,7 @@
               <w:rPr>
                 <w:noProof/>
               </w:rPr>
-              <w:instrText xml:space="preserve"> PAGEREF _Toc243489445 \h </w:instrText>
+              <w:instrText xml:space="preserve"> PAGEREF _Toc243499921 \h </w:instrText>
             </w:r>
             <w:r>
               <w:rPr>
@@ -2241,7 +2241,7 @@
               <w:szCs w:val="22"/>
             </w:rPr>
           </w:pPr>
-          <w:hyperlink w:anchor="_Toc243489446" w:history="1">
+          <w:hyperlink w:anchor="_Toc243499922" w:history="1">
             <w:r>
               <w:rPr>
                 <w:rStyle w:val="Hyperlink"/>
@@ -2265,7 +2265,7 @@
               <w:rPr>
                 <w:noProof/>
               </w:rPr>
-              <w:instrText xml:space="preserve"> PAGEREF _Toc243489446 \h </w:instrText>
+              <w:instrText xml:space="preserve"> PAGEREF _Toc243499922 \h </w:instrText>
             </w:r>
             <w:r>
               <w:rPr>
@@ -2305,7 +2305,7 @@
               <w:szCs w:val="22"/>
             </w:rPr>
           </w:pPr>
-          <w:hyperlink w:anchor="_Toc243489447" w:history="1">
+          <w:hyperlink w:anchor="_Toc243499923" w:history="1">
             <w:r>
               <w:rPr>
                 <w:rStyle w:val="Hyperlink"/>
@@ -2329,7 +2329,7 @@
               <w:rPr>
                 <w:noProof/>
               </w:rPr>
-              <w:instrText xml:space="preserve"> PAGEREF _Toc243489447 \h </w:instrText>
+              <w:instrText xml:space="preserve"> PAGEREF _Toc243499923 \h </w:instrText>
             </w:r>
             <w:r>
               <w:rPr>
@@ -2369,7 +2369,7 @@
               <w:szCs w:val="22"/>
             </w:rPr>
           </w:pPr>
-          <w:hyperlink w:anchor="_Toc243489448" w:history="1">
+          <w:hyperlink w:anchor="_Toc243499924" w:history="1">
             <w:r>
               <w:rPr>
                 <w:rStyle w:val="Hyperlink"/>
@@ -2393,7 +2393,7 @@
               <w:rPr>
                 <w:noProof/>
               </w:rPr>
-              <w:instrText xml:space="preserve"> PAGEREF _Toc243489448 \h </w:instrText>
+              <w:instrText xml:space="preserve"> PAGEREF _Toc243499924 \h </w:instrText>
             </w:r>
             <w:r>
               <w:rPr>
@@ -2433,7 +2433,7 @@
               <w:szCs w:val="22"/>
             </w:rPr>
           </w:pPr>
-          <w:hyperlink w:anchor="_Toc243489449" w:history="1">
+          <w:hyperlink w:anchor="_Toc243499925" w:history="1">
             <w:r>
               <w:rPr>
                 <w:rStyle w:val="Hyperlink"/>
@@ -2457,7 +2457,7 @@
               <w:rPr>
                 <w:noProof/>
               </w:rPr>
-              <w:instrText xml:space="preserve"> PAGEREF _Toc243489449 \h </w:instrText>
+              <w:instrText xml:space="preserve"> PAGEREF _Toc243499925 \h </w:instrText>
             </w:r>
             <w:r>
               <w:rPr>
@@ -2496,7 +2496,7 @@
         <w:pStyle w:val="Heading1"/>
         <w:pageBreakBefore/>
       </w:pPr>
-      <w:bookmarkStart w:id="0" w:name="_Toc243489414"/>
+      <w:bookmarkStart w:id="0" w:name="_Toc243499890"/>
       <w:r>
         <w:lastRenderedPageBreak/>
         <w:t>1. Sebelum Mulai: Istilah Dasar</w:t>
@@ -2515,7 +2515,7 @@
       <w:pPr>
         <w:pStyle w:val="Heading2"/>
       </w:pPr>
-      <w:bookmarkStart w:id="1" w:name="_Toc243489415"/>
+      <w:bookmarkStart w:id="1" w:name="_Toc243499891"/>
       <w:r>
         <w:t>1.1 Susunan materi: Modul, Tingkat, dan Level</w:t>
       </w:r>
@@ -3043,7 +3043,7 @@
       <w:pPr>
         <w:pStyle w:val="Heading2"/>
       </w:pPr>
-      <w:bookmarkStart w:id="2" w:name="_Toc243489416"/>
+      <w:bookmarkStart w:id="2" w:name="_Toc243499892"/>
       <w:r>
         <w:t>1.2 Istilah kemajuan</w:t>
       </w:r>
@@ -3675,7 +3675,7 @@
       <w:pPr>
         <w:pStyle w:val="Heading2"/>
       </w:pPr>
-      <w:bookmarkStart w:id="3" w:name="_Toc243489417"/>
+      <w:bookmarkStart w:id="3" w:name="_Toc243499893"/>
       <w:r>
         <w:t>1.3 Sesi kelompok dan latihan mandiri</w:t>
       </w:r>
@@ -4493,7 +4493,7 @@
       <w:pPr>
         <w:pStyle w:val="Heading2"/>
       </w:pPr>
-      <w:bookmarkStart w:id="4" w:name="_Toc243489418"/>
+      <w:bookmarkStart w:id="4" w:name="_Toc243499894"/>
       <w:r>
         <w:t>1.4 Pertemuan terakhir</w:t>
       </w:r>
@@ -4587,7 +4587,7 @@
       <w:pPr>
         <w:pStyle w:val="Heading2"/>
       </w:pPr>
-      <w:bookmarkStart w:id="5" w:name="_Toc243489419"/>
+      <w:bookmarkStart w:id="5" w:name="_Toc243499895"/>
       <w:r>
         <w:t>1.5 Arti warna label</w:t>
       </w:r>
@@ -5293,7 +5293,7 @@
       <w:pPr>
         <w:pStyle w:val="Heading2"/>
       </w:pPr>
-      <w:bookmarkStart w:id="6" w:name="_Toc243489420"/>
+      <w:bookmarkStart w:id="6" w:name="_Toc243499896"/>
       <w:r>
         <w:t>1.6 Profil aturan dan tahapan khusus</w:t>
       </w:r>
@@ -6074,7 +6074,7 @@
         <w:pStyle w:val="Heading1"/>
         <w:pageBreakBefore/>
       </w:pPr>
-      <w:bookmarkStart w:id="7" w:name="_Toc243489421"/>
+      <w:bookmarkStart w:id="7" w:name="_Toc243499897"/>
       <w:r>
         <w:lastRenderedPageBreak/>
         <w:t>2. Tab Sesi Kegiatan</w:t>
@@ -6221,7 +6221,7 @@
       <w:pPr>
         <w:pStyle w:val="Heading2"/>
       </w:pPr>
-      <w:bookmarkStart w:id="8" w:name="_Toc243489422"/>
+      <w:bookmarkStart w:id="8" w:name="_Toc243499898"/>
       <w:r>
         <w:t>2.1 Bilah saringan</w:t>
       </w:r>
@@ -6721,7 +6721,7 @@
       <w:pPr>
         <w:pStyle w:val="Heading2"/>
       </w:pPr>
-      <w:bookmarkStart w:id="9" w:name="_Toc243489423"/>
+      <w:bookmarkStart w:id="9" w:name="_Toc243499899"/>
       <w:r>
         <w:t>2.2 Kartu Sesi latihan</w:t>
       </w:r>
@@ -7538,7 +7538,7 @@
       <w:pPr>
         <w:pStyle w:val="Heading2"/>
       </w:pPr>
-      <w:bookmarkStart w:id="10" w:name="_Toc243489424"/>
+      <w:bookmarkStart w:id="10" w:name="_Toc243499900"/>
       <w:r>
         <w:t>2.3 Kotak Aturan dan tahapan yang berlaku</w:t>
       </w:r>
@@ -7891,7 +7891,7 @@
       <w:pPr>
         <w:pStyle w:val="Heading2"/>
       </w:pPr>
-      <w:bookmarkStart w:id="11" w:name="_Toc243489425"/>
+      <w:bookmarkStart w:id="11" w:name="_Toc243499901"/>
       <w:r>
         <w:t>2.4 Enam kotak ringkasan</w:t>
       </w:r>
@@ -9007,7 +9007,7 @@
       <w:pPr>
         <w:pStyle w:val="Heading2"/>
       </w:pPr>
-      <w:bookmarkStart w:id="12" w:name="_Toc243489426"/>
+      <w:bookmarkStart w:id="12" w:name="_Toc243499902"/>
       <w:r>
         <w:t>2.5 Tabel siswa</w:t>
       </w:r>
@@ -9572,7 +9572,7 @@
       <w:pPr>
         <w:pStyle w:val="Heading2"/>
       </w:pPr>
-      <w:bookmarkStart w:id="13" w:name="_Toc243489427"/>
+      <w:bookmarkStart w:id="13" w:name="_Toc243499903"/>
       <w:r>
         <w:t>2.6 Arti kolom Status</w:t>
       </w:r>
@@ -10595,7 +10595,7 @@
       <w:pPr>
         <w:pStyle w:val="Heading2"/>
       </w:pPr>
-      <w:bookmarkStart w:id="14" w:name="_Toc243489428"/>
+      <w:bookmarkStart w:id="14" w:name="_Toc243499904"/>
       <w:r>
         <w:t>2.7 Bilah aksi untuk siswa terpilih</w:t>
       </w:r>
@@ -11033,7 +11033,7 @@
         <w:pStyle w:val="Heading1"/>
         <w:pageBreakBefore/>
       </w:pPr>
-      <w:bookmarkStart w:id="15" w:name="_Toc243489429"/>
+      <w:bookmarkStart w:id="15" w:name="_Toc243499905"/>
       <w:r>
         <w:lastRenderedPageBreak/>
         <w:t>3. Tab Perkembangan Siswa</w:t>
@@ -11076,10 +11076,7 @@
         <w:spacing w:after="120" w:line="276" w:lineRule="auto"/>
       </w:pPr>
       <w:r>
-        <w:t>Di bagian atas</w:t>
-      </w:r>
-      <w:r>
-        <w:t xml:space="preserve"> ada pilihan kelompok, pilihan urutan, tombol Muat ulang, dan Unduh rekap (Excel berkop berisi rekap kemajuan dan sebaran per tingkat). Tab ini punya tiga sub-tab: </w:t>
+        <w:t xml:space="preserve">Di bagian atas ada pilihan kelompok, pilihan urutan, tombol Muat ulang, dan Unduh rekap (Excel berkop berisi rekap kemajuan dan sebaran per tingkat). Tab ini punya tiga sub-tab: </w:t>
       </w:r>
       <w:r>
         <w:rPr>
@@ -11099,10 +11096,7 @@
         <w:t>Ringkasan keseluruhan</w:t>
       </w:r>
       <w:r>
-        <w:t>, yang dulu me</w:t>
-      </w:r>
-      <w:r>
-        <w:t xml:space="preserve">njadi sub-tab Per Kelompok), </w:t>
+        <w:t xml:space="preserve">, yang dulu menjadi sub-tab Per Kelompok), </w:t>
       </w:r>
       <w:r>
         <w:rPr>
@@ -11129,7 +11123,7 @@
       <w:pPr>
         <w:pStyle w:val="Heading2"/>
       </w:pPr>
-      <w:bookmarkStart w:id="16" w:name="_Toc243489430"/>
+      <w:bookmarkStart w:id="16" w:name="_Toc243499906"/>
       <w:r>
         <w:t>3.1 Sub-tab Rekapitulasi</w:t>
       </w:r>
@@ -11412,7 +11406,7 @@
       <w:pPr>
         <w:pStyle w:val="Heading2"/>
       </w:pPr>
-      <w:bookmarkStart w:id="17" w:name="_Toc243489431"/>
+      <w:bookmarkStart w:id="17" w:name="_Toc243499907"/>
       <w:r>
         <w:lastRenderedPageBreak/>
         <w:t>3.2 Sub-tab Per Siswa</w:t>
@@ -14685,7 +14679,7 @@
       <w:pPr>
         <w:pStyle w:val="Heading2"/>
       </w:pPr>
-      <w:bookmarkStart w:id="18" w:name="_Toc243489432"/>
+      <w:bookmarkStart w:id="18" w:name="_Toc243499908"/>
       <w:r>
         <w:t>3.3 Ringkasan keseluruhan (bagian bawah Rekapitulasi)</w:t>
       </w:r>
@@ -14716,10 +14710,7 @@
         <w:t>Ringkasan keseluruhan</w:t>
       </w:r>
       <w:r>
-        <w:t>. Angka di bagian ini dihitung sejak awal latihan dan tidak mengikuti pilihan periode di atasnya. Mengetuk baris pada tabel pe</w:t>
-      </w:r>
-      <w:r>
-        <w:t>rbandingan kelompok membuka rapor kelompok itu di Rekapitulasi.</w:t>
+        <w:t>. Angka di bagian ini dihitung sejak awal latihan dan tidak mengikuti pilihan periode di atasnya. Mengetuk baris pada tabel perbandingan kelompok membuka rapor kelompok itu di Rekapitulasi.</w:t>
       </w:r>
     </w:p>
     <w:p>
@@ -15584,7 +15575,7 @@
         <w:t>banyak siswa yang sedang berada di tingkat itu</w:t>
       </w:r>
       <w:r>
-        <w:t>. Bila ada, ditambah batang "Tamat semua tingkat". Di bawah grafik tertulis berapa siswa yang belum pernah masuk.</w:t>
+        <w:t>. Bila ada, ditambah batang "Tamat semua tingkat". Di bawah grafik tertulis berapa siswa yang belum pernah masuk. Hanya tingkat yang berisi siswa (ditambah satu tingkat sebelum dan sesudahnya) yang ditampilkan; jumlah tingkat lain yang kosong disebut di catatan bawah grafik.</w:t>
       </w:r>
     </w:p>
     <w:p>
@@ -16458,7 +16449,7 @@
       <w:pPr>
         <w:pStyle w:val="Heading2"/>
       </w:pPr>
-      <w:bookmarkStart w:id="19" w:name="_Toc243489433"/>
+      <w:bookmarkStart w:id="19" w:name="_Toc243499909"/>
       <w:r>
         <w:t>3.4 Sub-tab Peringkat</w:t>
       </w:r>
@@ -20208,7 +20199,7 @@
         <w:pStyle w:val="Heading1"/>
         <w:pageBreakBefore/>
       </w:pPr>
-      <w:bookmarkStart w:id="20" w:name="_Toc243489434"/>
+      <w:bookmarkStart w:id="20" w:name="_Toc243499910"/>
       <w:r>
         <w:lastRenderedPageBreak/>
         <w:t>4. Tab Analisis Siswa</w:t>
@@ -21487,7 +21478,7 @@
       <w:pPr>
         <w:pStyle w:val="Heading2"/>
       </w:pPr>
-      <w:bookmarkStart w:id="21" w:name="_Toc243489435"/>
+      <w:bookmarkStart w:id="21" w:name="_Toc243499911"/>
       <w:r>
         <w:t>4.1 Kartu identitas</w:t>
       </w:r>
@@ -21515,7 +21506,7 @@
       <w:pPr>
         <w:pStyle w:val="Heading2"/>
       </w:pPr>
-      <w:bookmarkStart w:id="22" w:name="_Toc243489436"/>
+      <w:bookmarkStart w:id="22" w:name="_Toc243499912"/>
       <w:r>
         <w:t>4.2 Lima kotak ringkasan</w:t>
       </w:r>
@@ -22399,7 +22390,7 @@
       <w:pPr>
         <w:pStyle w:val="Heading2"/>
       </w:pPr>
-      <w:bookmarkStart w:id="23" w:name="_Toc243489437"/>
+      <w:bookmarkStart w:id="23" w:name="_Toc243499913"/>
       <w:r>
         <w:t>4.3 Aturan dan tahapan yang berlaku</w:t>
       </w:r>
@@ -22704,7 +22695,7 @@
       <w:pPr>
         <w:pStyle w:val="Heading2"/>
       </w:pPr>
-      <w:bookmarkStart w:id="24" w:name="_Toc243489438"/>
+      <w:bookmarkStart w:id="24" w:name="_Toc243499914"/>
       <w:r>
         <w:t>4.4 Catatan otomatis</w:t>
       </w:r>
@@ -23456,7 +23447,7 @@
       <w:pPr>
         <w:pStyle w:val="Heading2"/>
       </w:pPr>
-      <w:bookmarkStart w:id="25" w:name="_Toc243489439"/>
+      <w:bookmarkStart w:id="25" w:name="_Toc243499915"/>
       <w:r>
         <w:t>4.5 Kartu Latihan mandiri (di luar sesi)</w:t>
       </w:r>
@@ -24183,7 +24174,7 @@
       <w:pPr>
         <w:pStyle w:val="Heading2"/>
       </w:pPr>
-      <w:bookmarkStart w:id="26" w:name="_Toc243489440"/>
+      <w:bookmarkStart w:id="26" w:name="_Toc243499916"/>
       <w:r>
         <w:t>4.6 Riwayat semester (arsip)</w:t>
       </w:r>
@@ -24281,7 +24272,7 @@
       <w:pPr>
         <w:pStyle w:val="Heading2"/>
       </w:pPr>
-      <w:bookmarkStart w:id="27" w:name="_Toc243489441"/>
+      <w:bookmarkStart w:id="27" w:name="_Toc243499917"/>
       <w:r>
         <w:t>4.7 Grafik Kemajuan level tuntas</w:t>
       </w:r>
@@ -24668,7 +24659,7 @@
       <w:pPr>
         <w:pStyle w:val="Heading2"/>
       </w:pPr>
-      <w:bookmarkStart w:id="28" w:name="_Toc243489442"/>
+      <w:bookmarkStart w:id="28" w:name="_Toc243499918"/>
       <w:r>
         <w:t>4.8 Jenis kesalahan</w:t>
       </w:r>
@@ -26518,7 +26509,7 @@
       <w:pPr>
         <w:pStyle w:val="Heading2"/>
       </w:pPr>
-      <w:bookmarkStart w:id="29" w:name="_Toc243489443"/>
+      <w:bookmarkStart w:id="29" w:name="_Toc243499919"/>
       <w:r>
         <w:t>4.9 Per tingkat</w:t>
       </w:r>
@@ -26910,7 +26901,7 @@
       <w:pPr>
         <w:pStyle w:val="Heading2"/>
       </w:pPr>
-      <w:bookmarkStart w:id="30" w:name="_Toc243489444"/>
+      <w:bookmarkStart w:id="30" w:name="_Toc243499920"/>
       <w:r>
         <w:t>4.10 Kesalahan terakhir</w:t>
       </w:r>
@@ -27516,7 +27507,7 @@
       <w:pPr>
         <w:pStyle w:val="Heading2"/>
       </w:pPr>
-      <w:bookmarkStart w:id="31" w:name="_Toc243489445"/>
+      <w:bookmarkStart w:id="31" w:name="_Toc243499921"/>
       <w:r>
         <w:t>4.11 Riwayat level tuntas</w:t>
       </w:r>
@@ -28139,7 +28130,7 @@
       <w:pPr>
         <w:pStyle w:val="Heading2"/>
       </w:pPr>
-      <w:bookmarkStart w:id="32" w:name="_Toc243489446"/>
+      <w:bookmarkStart w:id="32" w:name="_Toc243499922"/>
       <w:r>
         <w:t>4.12 Pindahkan posisi dan Hapus data latihan</w:t>
       </w:r>
@@ -28319,7 +28310,7 @@
         <w:pStyle w:val="Heading1"/>
         <w:pageBreakBefore/>
       </w:pPr>
-      <w:bookmarkStart w:id="33" w:name="_Toc243489447"/>
+      <w:bookmarkStart w:id="33" w:name="_Toc243499923"/>
       <w:r>
         <w:lastRenderedPageBreak/>
         <w:t>5. Dari Data ke Tindakan</w:t>
@@ -28330,7 +28321,7 @@
       <w:pPr>
         <w:pStyle w:val="Heading2"/>
       </w:pPr>
-      <w:bookmarkStart w:id="34" w:name="_Toc243489448"/>
+      <w:bookmarkStart w:id="34" w:name="_Toc243499924"/>
       <w:r>
         <w:t>5.1 Situasi umum dan tindakan</w:t>
       </w:r>
@@ -29530,7 +29521,7 @@
         <w:pStyle w:val="Heading2"/>
         <w:pageBreakBefore/>
       </w:pPr>
-      <w:bookmarkStart w:id="35" w:name="_Toc243489449"/>
+      <w:bookmarkStart w:id="35" w:name="_Toc243499925"/>
       <w:r>
         <w:lastRenderedPageBreak/>
         <w:t>5.2 Tanya jawab singkat</w:t>

</xml_diff>